<commit_message>
Surat usulan Tarakan: tata naskah mengikuti surat Kaltara versi akhir
Mengikuti contoh yang dirapikan Kabag (dan yang diterbitkan Srikandi):
Nomor/Sifat/Lampiran "1 (satu) halaman"/Perihal, Yth. dan tujuan tebal,
di-/TARAKAN, paragraf berspasi ganda dengan inden, judul inovasi bertanda
kutip, jabatan "SEKRETARIS DAERAH", "NIP." tidak tebal, tembusan 10 pt,
serta halaman lampiran berisi identitas usulan (Inovasi, Nama Inovator, Lama
Implementasi Inovasi, Kategori, Instansi), tabel tim berkolom nama lebar, dan
kontak ketua tim. Jumlah baris disamakan dengan contoh supaya tetap dua
halaman. Kalimat pembuka dan perihal tetap dari Lampiran 3 Petunjuk Teknis.

Co-Authored-By: Claude Opus 5.5 <noreply@anthropic.com>
Claude-Session: https://claude.ai/code/session_01TchDZWsQsgeuq52sKmozd1
</commit_message>
<xml_diff>
--- a/docs/lomba/tarakan/Surat-Usulan-Sekda-Lomba-Inovasi-Tarakan.docx
+++ b/docs/lomba/tarakan/Surat-Usulan-Sekda-Lomba-Inovasi-Tarakan.docx
@@ -451,9 +451,6 @@
     </w:p>
     <w:p>
       <w:pPr>
-        <w:tabs>
-          <w:tab w:val="left" w:pos="1276"/>
-        </w:tabs>
         <w:spacing w:after="0" w:line="240" w:lineRule="auto"/>
         <w:rPr>
           <w:rFonts w:ascii="Arial" w:eastAsia="Calibri" w:hAnsi="Arial" w:cs="Arial"/>
@@ -471,7 +468,7 @@
           <w:szCs w:val="24"/>
           <w14:ligatures w14:val="none"/>
         </w:rPr>
-        <w:t xml:space="preserve">  No</w:t>
+        <w:t xml:space="preserve">  Nomor</w:t>
       </w:r>
       <w:r>
         <w:rPr>
@@ -529,27 +526,35 @@
     </w:p>
     <w:p>
       <w:pPr>
-        <w:tabs>
-          <w:tab w:val="left" w:pos="1276"/>
-        </w:tabs>
         <w:spacing w:after="0" w:line="240" w:lineRule="auto"/>
-        <w:rPr>
-          <w:rFonts w:ascii="Arial" w:eastAsia="Calibri" w:hAnsi="Arial" w:cs="Arial"/>
-          <w:kern w:val="0"/>
-          <w:sz w:val="24"/>
-          <w:szCs w:val="24"/>
-          <w14:ligatures w14:val="none"/>
-        </w:rPr>
-      </w:pPr>
-      <w:r>
-        <w:rPr>
-          <w:rFonts w:ascii="Arial" w:eastAsia="Calibri" w:hAnsi="Arial" w:cs="Arial"/>
-          <w:kern w:val="0"/>
-          <w:sz w:val="24"/>
-          <w:szCs w:val="24"/>
-          <w14:ligatures w14:val="none"/>
-        </w:rPr>
-        <w:t xml:space="preserve">  Lampiran</w:t>
+        <w:ind w:firstLine="142"/>
+        <w:rPr>
+          <w:rFonts w:ascii="Arial" w:eastAsia="Calibri" w:hAnsi="Arial" w:cs="Arial"/>
+          <w:kern w:val="0"/>
+          <w:sz w:val="24"/>
+          <w:szCs w:val="24"/>
+          <w14:ligatures w14:val="none"/>
+        </w:rPr>
+      </w:pPr>
+      <w:r>
+        <w:rPr>
+          <w:rFonts w:ascii="Arial" w:eastAsia="Calibri" w:hAnsi="Arial" w:cs="Arial"/>
+          <w:kern w:val="0"/>
+          <w:sz w:val="24"/>
+          <w:szCs w:val="24"/>
+          <w14:ligatures w14:val="none"/>
+        </w:rPr>
+        <w:t>Sifat</w:t>
+      </w:r>
+      <w:r>
+        <w:rPr>
+          <w:rFonts w:ascii="Arial" w:eastAsia="Calibri" w:hAnsi="Arial" w:cs="Arial"/>
+          <w:kern w:val="0"/>
+          <w:sz w:val="24"/>
+          <w:szCs w:val="24"/>
+          <w14:ligatures w14:val="none"/>
+        </w:rPr>
+        <w:tab/>
       </w:r>
       <w:r>
         <w:rPr>
@@ -570,14 +575,11 @@
           <w:szCs w:val="24"/>
           <w14:ligatures w14:val="none"/>
         </w:rPr>
-        <w:t xml:space="preserve">-</w:t>
+        <w:t>${sifat}</w:t>
       </w:r>
     </w:p>
     <w:p>
       <w:pPr>
-        <w:tabs>
-          <w:tab w:val="left" w:pos="1276"/>
-        </w:tabs>
         <w:spacing w:after="0" w:line="240" w:lineRule="auto"/>
         <w:rPr>
           <w:rFonts w:ascii="Arial" w:eastAsia="Calibri" w:hAnsi="Arial" w:cs="Arial"/>
@@ -595,7 +597,7 @@
           <w:szCs w:val="24"/>
           <w14:ligatures w14:val="none"/>
         </w:rPr>
-        <w:t xml:space="preserve">  Hal</w:t>
+        <w:t xml:space="preserve">  Lampiran</w:t>
       </w:r>
       <w:r>
         <w:rPr>
@@ -616,6 +618,50 @@
           <w:szCs w:val="24"/>
           <w14:ligatures w14:val="none"/>
         </w:rPr>
+        <w:t xml:space="preserve">1 (satu) halaman</w:t>
+      </w:r>
+    </w:p>
+    <w:p>
+      <w:pPr>
+        <w:spacing w:after="0" w:line="240" w:lineRule="auto"/>
+        <w:rPr>
+          <w:rFonts w:ascii="Arial" w:eastAsia="Calibri" w:hAnsi="Arial" w:cs="Arial"/>
+          <w:kern w:val="0"/>
+          <w:sz w:val="24"/>
+          <w:szCs w:val="24"/>
+          <w14:ligatures w14:val="none"/>
+        </w:rPr>
+      </w:pPr>
+      <w:r>
+        <w:rPr>
+          <w:rFonts w:ascii="Arial" w:eastAsia="Calibri" w:hAnsi="Arial" w:cs="Arial"/>
+          <w:kern w:val="0"/>
+          <w:sz w:val="24"/>
+          <w:szCs w:val="24"/>
+          <w14:ligatures w14:val="none"/>
+        </w:rPr>
+        <w:t xml:space="preserve">  Perihal</w:t>
+      </w:r>
+      <w:r>
+        <w:rPr>
+          <w:rFonts w:ascii="Arial" w:eastAsia="Calibri" w:hAnsi="Arial" w:cs="Arial"/>
+          <w:kern w:val="0"/>
+          <w:sz w:val="24"/>
+          <w:szCs w:val="24"/>
+          <w14:ligatures w14:val="none"/>
+        </w:rPr>
+        <w:tab/>
+        <w:t xml:space="preserve">: </w:t>
+      </w:r>
+      <w:r>
+        <w:rPr>
+          <w:rFonts w:ascii="Arial" w:eastAsia="Calibri" w:hAnsi="Arial" w:cs="Arial"/>
+          <w:kern w:val="0"/>
+          <w:sz w:val="24"/>
+          <w:szCs w:val="24"/>
+          <w:u w:val="single"/>
+          <w14:ligatures w14:val="none"/>
+        </w:rPr>
         <w:t xml:space="preserve">Usulan Staf dan Inovasi</w:t>
       </w:r>
       <w:proofErr w:type="spellStart"/>
@@ -625,6 +671,7 @@
           <w:kern w:val="0"/>
           <w:sz w:val="24"/>
           <w:szCs w:val="24"/>
+          <w:u w:val="single"/>
           <w14:ligatures w14:val="none"/>
         </w:rPr>
         <w:t xml:space="preserve"/>
@@ -662,55 +709,52 @@
           <w:szCs w:val="24"/>
           <w14:ligatures w14:val="none"/>
         </w:rPr>
-        <w:t xml:space="preserve">  Yth. Kepala Bappeda Litbang Kota Tarakan</w:t>
+        <w:t xml:space="preserve">  Yth. </w:t>
       </w:r>
     </w:p>
     <w:p>
       <w:pPr>
-        <w:spacing w:after="0" w:line="240" w:lineRule="auto"/>
+        <w:spacing w:before="240" w:after="0" w:line="240" w:lineRule="auto"/>
         <w:ind w:left="142"/>
         <w:rPr>
           <w:rFonts w:ascii="Arial" w:eastAsia="Calibri" w:hAnsi="Arial" w:cs="Arial"/>
-          <w:kern w:val="0"/>
-          <w:sz w:val="24"/>
-          <w:szCs w:val="24"/>
-          <w14:ligatures w14:val="none"/>
-        </w:rPr>
-      </w:pPr>
-      <w:r>
-        <w:rPr>
-          <w:rFonts w:ascii="Arial" w:eastAsia="Calibri" w:hAnsi="Arial" w:cs="Arial"/>
-          <w:kern w:val="0"/>
-          <w:sz w:val="24"/>
-          <w:szCs w:val="24"/>
-          <w14:ligatures w14:val="none"/>
-        </w:rPr>
-        <w:t xml:space="preserve">di</w:t>
-      </w:r>
-      <w:r>
-        <w:rPr>
-          <w:rFonts w:ascii="Arial" w:eastAsia="Calibri" w:hAnsi="Arial" w:cs="Arial"/>
-          <w:kern w:val="0"/>
-          <w:sz w:val="24"/>
-          <w:szCs w:val="24"/>
-          <w14:ligatures w14:val="none"/>
-        </w:rPr>
-        <w:t xml:space="preserve"/>
-      </w:r>
-      <w:r>
-        <w:rPr>
-          <w:rFonts w:ascii="Arial" w:eastAsia="Calibri" w:hAnsi="Arial" w:cs="Arial"/>
-          <w:kern w:val="0"/>
-          <w:sz w:val="24"/>
-          <w:szCs w:val="24"/>
-          <w14:ligatures w14:val="none"/>
-        </w:rPr>
-        <w:t xml:space="preserve"/>
+          <w:b/>
+          <w:bCs/>
+          <w:kern w:val="0"/>
+          <w:sz w:val="24"/>
+          <w:szCs w:val="24"/>
+          <w14:ligatures w14:val="none"/>
+        </w:rPr>
+      </w:pPr>
+      <w:r>
+        <w:rPr>
+          <w:rFonts w:ascii="Arial" w:eastAsia="Calibri" w:hAnsi="Arial" w:cs="Arial"/>
+          <w:b/>
+          <w:bCs/>
+          <w:kern w:val="0"/>
+          <w:sz w:val="24"/>
+          <w:szCs w:val="24"/>
+          <w14:ligatures w14:val="none"/>
+        </w:rPr>
+        <w:t xml:space="preserve">Kepala Bappeda Litbang</w:t>
+      </w:r>
+      <w:r>
+        <w:rPr>
+          <w:rFonts w:ascii="Arial" w:eastAsia="Calibri" w:hAnsi="Arial" w:cs="Arial"/>
+          <w:b/>
+          <w:bCs/>
+          <w:kern w:val="0"/>
+          <w:sz w:val="24"/>
+          <w:szCs w:val="24"/>
+          <w14:ligatures w14:val="none"/>
+        </w:rPr>
+        <w:br/>
+        <w:t xml:space="preserve">Kota Tarakan</w:t>
       </w:r>
     </w:p>
     <w:p>
       <w:pPr>
-        <w:spacing w:after="0" w:line="240" w:lineRule="auto"/>
+        <w:spacing w:before="240" w:after="0" w:line="240" w:lineRule="auto"/>
         <w:ind w:left="142"/>
         <w:rPr>
           <w:rFonts w:ascii="Arial" w:eastAsia="Calibri" w:hAnsi="Arial" w:cs="Arial"/>
@@ -728,246 +772,406 @@
           <w:szCs w:val="24"/>
           <w14:ligatures w14:val="none"/>
         </w:rPr>
-        <w:t xml:space="preserve">Tarakan</w:t>
-      </w:r>
-      <w:r>
-        <w:rPr>
-          <w:rFonts w:ascii="Arial" w:eastAsia="Calibri" w:hAnsi="Arial" w:cs="Arial"/>
-          <w:kern w:val="0"/>
-          <w:sz w:val="24"/>
-          <w:szCs w:val="24"/>
-          <w14:ligatures w14:val="none"/>
-        </w:rPr>
-        <w:t xml:space="preserve"/>
-      </w:r>
-      <w:r>
-        <w:rPr>
-          <w:rFonts w:ascii="Arial" w:eastAsia="Calibri" w:hAnsi="Arial" w:cs="Arial"/>
-          <w:kern w:val="0"/>
-          <w:sz w:val="24"/>
-          <w:szCs w:val="24"/>
-          <w14:ligatures w14:val="none"/>
-        </w:rPr>
-        <w:t xml:space="preserve"/>
+        <w:t>di</w:t>
+      </w:r>
+      <w:r>
+        <w:rPr>
+          <w:rFonts w:ascii="Arial" w:eastAsia="Calibri" w:hAnsi="Arial" w:cs="Arial"/>
+          <w:kern w:val="0"/>
+          <w:sz w:val="24"/>
+          <w:szCs w:val="24"/>
+          <w14:ligatures w14:val="none"/>
+        </w:rPr>
+        <w:t>-</w:t>
+      </w:r>
+      <w:r>
+        <w:rPr>
+          <w:rFonts w:ascii="Arial" w:eastAsia="Calibri" w:hAnsi="Arial" w:cs="Arial"/>
+          <w:kern w:val="0"/>
+          <w:sz w:val="24"/>
+          <w:szCs w:val="24"/>
+          <w14:ligatures w14:val="none"/>
+        </w:rPr>
+        <w:t xml:space="preserve"> </w:t>
       </w:r>
     </w:p>
     <w:p>
       <w:pPr>
-        <w:spacing w:before="360" w:after="0" w:line="276" w:lineRule="auto"/>
-      </w:pPr>
-      <w:r>
-        <w:rPr>
-          <w:rFonts w:ascii="Arial" w:eastAsia="Calibri" w:hAnsi="Arial" w:cs="Arial"/>
-          <w:sz w:val="24"/>
-          <w:szCs w:val="24"/>
-        </w:rPr>
-        <w:t xml:space="preserve">Dengan hormat,</w:t>
+        <w:spacing w:after="0" w:line="480" w:lineRule="auto"/>
+        <w:rPr>
+          <w:rFonts w:ascii="Arial" w:eastAsia="Calibri" w:hAnsi="Arial" w:cs="Arial"/>
+          <w:b/>
+          <w:bCs/>
+          <w:kern w:val="0"/>
+          <w:sz w:val="24"/>
+          <w:szCs w:val="24"/>
+          <w14:ligatures w14:val="none"/>
+        </w:rPr>
+      </w:pPr>
+      <w:r>
+        <w:rPr>
+          <w:rFonts w:ascii="Arial" w:eastAsia="Calibri" w:hAnsi="Arial" w:cs="Arial"/>
+          <w:kern w:val="0"/>
+          <w:sz w:val="24"/>
+          <w:szCs w:val="24"/>
+          <w14:ligatures w14:val="none"/>
+        </w:rPr>
+        <w:tab/>
+      </w:r>
+      <w:r>
+        <w:rPr>
+          <w:rFonts w:ascii="Arial" w:eastAsia="Calibri" w:hAnsi="Arial" w:cs="Arial"/>
+          <w:b/>
+          <w:bCs/>
+          <w:kern w:val="0"/>
+          <w:sz w:val="24"/>
+          <w:szCs w:val="24"/>
+          <w14:ligatures w14:val="none"/>
+        </w:rPr>
+        <w:t xml:space="preserve">TARAKAN</w:t>
       </w:r>
     </w:p>
     <w:p>
       <w:pPr>
-        <w:spacing w:before="60" w:after="0" w:line="276" w:lineRule="auto"/>
+        <w:spacing w:before="240" w:after="0" w:line="480" w:lineRule="auto"/>
+        <w:ind w:firstLine="709"/>
         <w:jc w:val="both"/>
-      </w:pPr>
-      <w:r>
-        <w:rPr>
-          <w:rFonts w:ascii="Arial" w:eastAsia="Calibri" w:hAnsi="Arial" w:cs="Arial"/>
-          <w:sz w:val="24"/>
-          <w:szCs w:val="24"/>
-        </w:rPr>
-        <w:t xml:space="preserve">Dalam rangka mendukung pelaksanaan </w:t>
-      </w:r>
-      <w:r>
-        <w:rPr>
-          <w:rFonts w:ascii="Arial" w:eastAsia="Calibri" w:hAnsi="Arial" w:cs="Arial"/>
-          <w:b/>
-          <w:bCs/>
-          <w:sz w:val="24"/>
-          <w:szCs w:val="24"/>
-        </w:rPr>
-        <w:t xml:space="preserve">Lomba Inovasi Daerah Kota Tarakan Tahun 2026</w:t>
-      </w:r>
-      <w:r>
-        <w:rPr>
-          <w:rFonts w:ascii="Arial" w:eastAsia="Calibri" w:hAnsi="Arial" w:cs="Arial"/>
-          <w:sz w:val="24"/>
-          <w:szCs w:val="24"/>
-        </w:rPr>
-        <w:t xml:space="preserve"> yang diselenggarakan oleh Bappeda Litbang Kota Tarakan serta sebagai upaya meningkatkan budaya inovasi di lingkungan Pemerintah Daerah, bersama surat ini kami sampaikan usulan nama staf dan inovasi dari Sekretariat Daerah Kota Tarakan untuk dapat dipertimbangkan dan diikutsertakan dalam kompetisi tersebut.</w:t>
+        <w:rPr>
+          <w:rFonts w:ascii="Arial" w:eastAsia="Calibri" w:hAnsi="Arial" w:cs="Arial"/>
+          <w:sz w:val="24"/>
+          <w:szCs w:val="24"/>
+        </w:rPr>
+      </w:pPr>
+      <w:r>
+        <w:rPr>
+          <w:rFonts w:ascii="Arial" w:eastAsia="Calibri" w:hAnsi="Arial" w:cs="Arial"/>
+          <w:sz w:val="24"/>
+          <w:szCs w:val="24"/>
+        </w:rPr>
+        <w:t xml:space="preserve">Dalam rangka mendukung pelaksanaan Lomba Inovasi Daerah Kota Tarakan Tahun 2026 yang diselenggarakan oleh Bappeda Litbang Kota Tarakan serta sebagai upaya meningkatkan budaya inovasi di lingkungan Pemerintah Daerah, bersama surat ini kami sampaikan usulan nama staf dan inovasi dari Sekretariat Daerah Kota Tarakan untuk dapat dipertimbangkan dan diikutsertakan dalam kompetisi tersebut.</w:t>
+      </w:r>
+      <w:proofErr w:type="spellStart"/>
+      <w:r>
+        <w:rPr>
+          <w:rFonts w:ascii="Arial" w:eastAsia="Calibri" w:hAnsi="Arial" w:cs="Arial"/>
+          <w:i/>
+          <w:iCs/>
+          <w:sz w:val="24"/>
+          <w:szCs w:val="24"/>
+        </w:rPr>
+        <w:t xml:space="preserve"/>
+      </w:r>
+      <w:proofErr w:type="spellEnd"/>
+      <w:r>
+        <w:rPr>
+          <w:rFonts w:ascii="Arial" w:eastAsia="Calibri" w:hAnsi="Arial" w:cs="Arial"/>
+          <w:i/>
+          <w:iCs/>
+          <w:sz w:val="24"/>
+          <w:szCs w:val="24"/>
+        </w:rPr>
+        <w:t xml:space="preserve"/>
+      </w:r>
+      <w:proofErr w:type="spellStart"/>
+      <w:r>
+        <w:rPr>
+          <w:rFonts w:ascii="Arial" w:eastAsia="Calibri" w:hAnsi="Arial" w:cs="Arial"/>
+          <w:i/>
+          <w:iCs/>
+          <w:sz w:val="24"/>
+          <w:szCs w:val="24"/>
+        </w:rPr>
+        <w:t xml:space="preserve"/>
+      </w:r>
+      <w:proofErr w:type="spellEnd"/>
+      <w:r>
+        <w:rPr>
+          <w:rFonts w:ascii="Arial" w:eastAsia="Calibri" w:hAnsi="Arial" w:cs="Arial"/>
+          <w:i/>
+          <w:iCs/>
+          <w:sz w:val="24"/>
+          <w:szCs w:val="24"/>
+        </w:rPr>
+        <w:t xml:space="preserve"/>
+      </w:r>
+      <w:proofErr w:type="spellStart"/>
+      <w:r>
+        <w:rPr>
+          <w:rFonts w:ascii="Arial" w:eastAsia="Calibri" w:hAnsi="Arial" w:cs="Arial"/>
+          <w:i/>
+          <w:iCs/>
+          <w:sz w:val="24"/>
+          <w:szCs w:val="24"/>
+        </w:rPr>
+        <w:t xml:space="preserve"/>
+      </w:r>
+      <w:proofErr w:type="spellEnd"/>
+      <w:r>
+        <w:rPr>
+          <w:rFonts w:ascii="Arial" w:eastAsia="Calibri" w:hAnsi="Arial" w:cs="Arial"/>
+          <w:i/>
+          <w:iCs/>
+          <w:sz w:val="24"/>
+          <w:szCs w:val="24"/>
+        </w:rPr>
+        <w:t xml:space="preserve"/>
+      </w:r>
+      <w:r>
+        <w:rPr>
+          <w:rFonts w:ascii="Arial" w:eastAsia="Calibri" w:hAnsi="Arial" w:cs="Arial"/>
+          <w:sz w:val="24"/>
+          <w:szCs w:val="24"/>
+        </w:rPr>
+        <w:t xml:space="preserve"/>
+      </w:r>
+      <w:proofErr w:type="spellStart"/>
+      <w:r>
+        <w:rPr>
+          <w:rFonts w:ascii="Arial" w:eastAsia="Calibri" w:hAnsi="Arial" w:cs="Arial"/>
+          <w:i/>
+          <w:iCs/>
+          <w:sz w:val="24"/>
+          <w:szCs w:val="24"/>
+        </w:rPr>
+        <w:t xml:space="preserve"/>
+      </w:r>
+      <w:proofErr w:type="spellEnd"/>
+      <w:r>
+        <w:rPr>
+          <w:rFonts w:ascii="Arial" w:eastAsia="Calibri" w:hAnsi="Arial" w:cs="Arial"/>
+          <w:i/>
+          <w:iCs/>
+          <w:sz w:val="24"/>
+          <w:szCs w:val="24"/>
+        </w:rPr>
+        <w:t xml:space="preserve"/>
+      </w:r>
+      <w:r>
+        <w:rPr>
+          <w:rFonts w:ascii="Arial" w:eastAsia="Calibri" w:hAnsi="Arial" w:cs="Arial"/>
+          <w:sz w:val="24"/>
+          <w:szCs w:val="24"/>
+        </w:rPr>
+        <w:t xml:space="preserve"/>
+      </w:r>
+      <w:r>
+        <w:rPr>
+          <w:rFonts w:ascii="Arial" w:eastAsia="Calibri" w:hAnsi="Arial" w:cs="Arial"/>
+          <w:sz w:val="24"/>
+          <w:szCs w:val="24"/>
+        </w:rPr>
+        <w:t xml:space="preserve"/>
+      </w:r>
+      <w:r>
+        <w:rPr>
+          <w:rFonts w:ascii="Arial" w:eastAsia="Calibri" w:hAnsi="Arial" w:cs="Arial"/>
+          <w:sz w:val="24"/>
+          <w:szCs w:val="24"/>
+        </w:rPr>
+        <w:t xml:space="preserve"/>
+      </w:r>
+      <w:r>
+        <w:rPr>
+          <w:rFonts w:ascii="Arial" w:eastAsia="Calibri" w:hAnsi="Arial" w:cs="Arial"/>
+          <w:sz w:val="24"/>
+          <w:szCs w:val="24"/>
+        </w:rPr>
+        <w:t xml:space="preserve"/>
+      </w:r>
+      <w:r>
+        <w:rPr>
+          <w:rFonts w:ascii="Arial" w:eastAsia="Calibri" w:hAnsi="Arial" w:cs="Arial"/>
+          <w:sz w:val="24"/>
+          <w:szCs w:val="24"/>
+        </w:rPr>
+        <w:t xml:space="preserve"/>
+      </w:r>
+      <w:proofErr w:type="spellStart"/>
+      <w:r>
+        <w:rPr>
+          <w:rFonts w:ascii="Arial" w:eastAsia="Calibri" w:hAnsi="Arial" w:cs="Arial"/>
+          <w:sz w:val="24"/>
+          <w:szCs w:val="24"/>
+        </w:rPr>
+        <w:t xml:space="preserve"/>
+      </w:r>
+      <w:proofErr w:type="spellEnd"/>
+      <w:r>
+        <w:rPr>
+          <w:rFonts w:ascii="Arial" w:eastAsia="Calibri" w:hAnsi="Arial" w:cs="Arial"/>
+          <w:sz w:val="24"/>
+          <w:szCs w:val="24"/>
+        </w:rPr>
+        <w:t xml:space="preserve"/>
+      </w:r>
+      <w:r>
+        <w:rPr>
+          <w:rFonts w:ascii="Arial" w:eastAsia="Calibri" w:hAnsi="Arial" w:cs="Arial"/>
+          <w:sz w:val="24"/>
+          <w:szCs w:val="24"/>
+        </w:rPr>
+        <w:t xml:space="preserve"/>
       </w:r>
     </w:p>
     <w:p>
       <w:pPr>
-        <w:tabs>
-          <w:tab w:val="left" w:pos="3828"/>
-          <w:tab w:val="left" w:pos="4026"/>
-        </w:tabs>
-        <w:spacing w:before="40" w:after="0" w:line="264" w:lineRule="auto"/>
-        <w:ind w:left="4026" w:hanging="3742"/>
-      </w:pPr>
-      <w:r>
-        <w:rPr>
-          <w:rFonts w:ascii="Arial" w:eastAsia="Calibri" w:hAnsi="Arial" w:cs="Arial"/>
-          <w:b/>
-          <w:bCs/>
-          <w:sz w:val="24"/>
-          <w:szCs w:val="24"/>
-        </w:rPr>
-        <w:t xml:space="preserve">Inovasi</w:t>
-      </w:r>
-      <w:r>
-        <w:rPr>
-          <w:rFonts w:ascii="Arial" w:eastAsia="Calibri" w:hAnsi="Arial" w:cs="Arial"/>
-          <w:b/>
-          <w:bCs/>
-          <w:sz w:val="24"/>
-          <w:szCs w:val="24"/>
-        </w:rPr>
-        <w:tab/>
-        <w:t xml:space="preserve">:</w:t>
-      </w:r>
-      <w:r>
-        <w:rPr>
-          <w:rFonts w:ascii="Arial" w:eastAsia="Calibri" w:hAnsi="Arial" w:cs="Arial"/>
-          <w:sz w:val="24"/>
-          <w:szCs w:val="24"/>
-        </w:rPr>
-        <w:tab/>
-        <w:t xml:space="preserve">Prokopim Hibot: Superapp Pelayanan Keprotokolan dan Komunikasi Pimpinan Pemerintah Kota Tarakan</w:t>
+        <w:spacing w:before="240" w:after="0" w:line="480" w:lineRule="auto"/>
+        <w:ind w:firstLine="709"/>
+        <w:jc w:val="both"/>
+        <w:rPr>
+          <w:rFonts w:ascii="Arial" w:eastAsia="Calibri" w:hAnsi="Arial" w:cs="Arial"/>
+          <w:sz w:val="24"/>
+          <w:szCs w:val="24"/>
+        </w:rPr>
+      </w:pPr>
+      <w:r>
+        <w:rPr>
+          <w:rFonts w:ascii="Arial" w:eastAsia="Calibri" w:hAnsi="Arial" w:cs="Arial"/>
+          <w:sz w:val="24"/>
+          <w:szCs w:val="24"/>
+        </w:rPr>
+        <w:t xml:space="preserve">Adapun inovasi yang diikutsertakan yaitu “Prokopim Hibot: Superapp Pelayanan Keprotokolan dan Komunikasi Pimpinan Pemerintah Kota Tarakan” pada Kategori A. Inovasi Tata Kelola Pemerintahan dengan susunan tim dan identitas usulan terlampir. Proposal dan dokumen pendukungnya diunggah melalui aplikasi RISDA.</w:t>
+      </w:r>
+      <w:r>
+        <w:rPr>
+          <w:rFonts w:ascii="Arial" w:eastAsia="Calibri" w:hAnsi="Arial" w:cs="Arial"/>
+          <w:sz w:val="24"/>
+          <w:szCs w:val="24"/>
+        </w:rPr>
+        <w:t xml:space="preserve"/>
+      </w:r>
+      <w:proofErr w:type="spellStart"/>
+      <w:r>
+        <w:rPr>
+          <w:rFonts w:ascii="Arial" w:eastAsia="Calibri" w:hAnsi="Arial" w:cs="Arial"/>
+          <w:i/>
+          <w:iCs/>
+          <w:sz w:val="24"/>
+          <w:szCs w:val="24"/>
+        </w:rPr>
+        <w:t xml:space="preserve"/>
+      </w:r>
+      <w:proofErr w:type="spellEnd"/>
+      <w:r>
+        <w:rPr>
+          <w:rFonts w:ascii="Arial" w:eastAsia="Calibri" w:hAnsi="Arial" w:cs="Arial"/>
+          <w:sz w:val="24"/>
+          <w:szCs w:val="24"/>
+        </w:rPr>
+        <w:t xml:space="preserve"/>
+      </w:r>
+      <w:r>
+        <w:rPr>
+          <w:rFonts w:ascii="Arial" w:eastAsia="Calibri" w:hAnsi="Arial" w:cs="Arial"/>
+          <w:sz w:val="24"/>
+          <w:szCs w:val="24"/>
+        </w:rPr>
+        <w:t xml:space="preserve"/>
+      </w:r>
+      <w:r>
+        <w:rPr>
+          <w:rFonts w:ascii="Arial" w:eastAsia="Calibri" w:hAnsi="Arial" w:cs="Arial"/>
+          <w:sz w:val="24"/>
+          <w:szCs w:val="24"/>
+        </w:rPr>
+        <w:t xml:space="preserve"/>
+      </w:r>
+      <w:proofErr w:type="spellStart"/>
+      <w:r>
+        <w:rPr>
+          <w:rFonts w:ascii="Arial" w:eastAsia="Calibri" w:hAnsi="Arial" w:cs="Arial"/>
+          <w:i/>
+          <w:iCs/>
+          <w:sz w:val="24"/>
+          <w:szCs w:val="24"/>
+        </w:rPr>
+        <w:t xml:space="preserve"/>
+      </w:r>
+      <w:proofErr w:type="spellEnd"/>
+      <w:r>
+        <w:rPr>
+          <w:rFonts w:ascii="Arial" w:eastAsia="Calibri" w:hAnsi="Arial" w:cs="Arial"/>
+          <w:sz w:val="24"/>
+          <w:szCs w:val="24"/>
+        </w:rPr>
+        <w:t xml:space="preserve"/>
       </w:r>
     </w:p>
     <w:p>
       <w:pPr>
-        <w:tabs>
-          <w:tab w:val="left" w:pos="3828"/>
-          <w:tab w:val="left" w:pos="4026"/>
-        </w:tabs>
-        <w:spacing w:before="40" w:after="0" w:line="264" w:lineRule="auto"/>
-        <w:ind w:left="4026" w:hanging="3742"/>
-      </w:pPr>
-      <w:r>
-        <w:rPr>
-          <w:rFonts w:ascii="Arial" w:eastAsia="Calibri" w:hAnsi="Arial" w:cs="Arial"/>
-          <w:b/>
-          <w:bCs/>
-          <w:sz w:val="24"/>
-          <w:szCs w:val="24"/>
-        </w:rPr>
-        <w:t xml:space="preserve">Nama Inovator</w:t>
-      </w:r>
-      <w:r>
-        <w:rPr>
-          <w:rFonts w:ascii="Arial" w:eastAsia="Calibri" w:hAnsi="Arial" w:cs="Arial"/>
-          <w:b/>
-          <w:bCs/>
-          <w:sz w:val="24"/>
-          <w:szCs w:val="24"/>
-        </w:rPr>
-        <w:tab/>
-        <w:t xml:space="preserve">:</w:t>
-      </w:r>
-      <w:r>
-        <w:rPr>
-          <w:rFonts w:ascii="Arial" w:eastAsia="Calibri" w:hAnsi="Arial" w:cs="Arial"/>
-          <w:sz w:val="24"/>
-          <w:szCs w:val="24"/>
-        </w:rPr>
-        <w:tab/>
-        <w:t xml:space="preserve">Tim Inovasi Prokopim Hibot: Anugrah Yega Pranatha, M.Si. (Ketua), Saifullah, S.H., Juliyanti, S.AP., Pebriadi Banne, S.IP., dan Nuraini Wiliadewi, S.IP.</w:t>
-      </w:r>
-    </w:p>
-    <w:p>
-      <w:pPr>
-        <w:tabs>
-          <w:tab w:val="left" w:pos="3828"/>
-          <w:tab w:val="left" w:pos="4026"/>
-        </w:tabs>
-        <w:spacing w:before="40" w:after="0" w:line="264" w:lineRule="auto"/>
-        <w:ind w:left="4026" w:hanging="3742"/>
-      </w:pPr>
-      <w:r>
-        <w:rPr>
-          <w:rFonts w:ascii="Arial" w:eastAsia="Calibri" w:hAnsi="Arial" w:cs="Arial"/>
-          <w:b/>
-          <w:bCs/>
-          <w:sz w:val="24"/>
-          <w:szCs w:val="24"/>
-        </w:rPr>
-        <w:t xml:space="preserve">Lama Implementasi Inovasi</w:t>
-      </w:r>
-      <w:r>
-        <w:rPr>
-          <w:rFonts w:ascii="Arial" w:eastAsia="Calibri" w:hAnsi="Arial" w:cs="Arial"/>
-          <w:b/>
-          <w:bCs/>
-          <w:sz w:val="24"/>
-          <w:szCs w:val="24"/>
-        </w:rPr>
-        <w:tab/>
-        <w:t xml:space="preserve">:</w:t>
-      </w:r>
-      <w:r>
-        <w:rPr>
-          <w:rFonts w:ascii="Arial" w:eastAsia="Calibri" w:hAnsi="Arial" w:cs="Arial"/>
-          <w:sz w:val="24"/>
-          <w:szCs w:val="24"/>
-        </w:rPr>
-        <w:tab/>
-        <w:t xml:space="preserve">±7 bulan (sejak Maret 2026)</w:t>
-      </w:r>
-    </w:p>
-    <w:p>
-      <w:pPr>
-        <w:tabs>
-          <w:tab w:val="left" w:pos="3828"/>
-          <w:tab w:val="left" w:pos="4026"/>
-        </w:tabs>
-        <w:spacing w:before="40" w:after="0" w:line="264" w:lineRule="auto"/>
-        <w:ind w:left="4026" w:hanging="3742"/>
-      </w:pPr>
-      <w:r>
-        <w:rPr>
-          <w:rFonts w:ascii="Arial" w:eastAsia="Calibri" w:hAnsi="Arial" w:cs="Arial"/>
-          <w:b/>
-          <w:bCs/>
-          <w:sz w:val="24"/>
-          <w:szCs w:val="24"/>
-        </w:rPr>
-        <w:t xml:space="preserve">Kategori</w:t>
-      </w:r>
-      <w:r>
-        <w:rPr>
-          <w:rFonts w:ascii="Arial" w:eastAsia="Calibri" w:hAnsi="Arial" w:cs="Arial"/>
-          <w:b/>
-          <w:bCs/>
-          <w:sz w:val="24"/>
-          <w:szCs w:val="24"/>
-        </w:rPr>
-        <w:tab/>
-        <w:t xml:space="preserve">:</w:t>
-      </w:r>
-      <w:r>
-        <w:rPr>
-          <w:rFonts w:ascii="Arial" w:eastAsia="Calibri" w:hAnsi="Arial" w:cs="Arial"/>
-          <w:sz w:val="24"/>
-          <w:szCs w:val="24"/>
-        </w:rPr>
-        <w:tab/>
-        <w:t xml:space="preserve">A. Inovasi Tata Kelola Pemerintahan</w:t>
-      </w:r>
-    </w:p>
-    <w:p>
-      <w:pPr>
-        <w:spacing w:before="120" w:after="0" w:line="276" w:lineRule="auto"/>
+        <w:spacing w:before="240" w:after="0" w:line="480" w:lineRule="auto"/>
+        <w:ind w:firstLine="709"/>
         <w:jc w:val="both"/>
-      </w:pPr>
-      <w:r>
-        <w:rPr>
-          <w:rFonts w:ascii="Arial" w:eastAsia="Calibri" w:hAnsi="Arial" w:cs="Arial"/>
-          <w:sz w:val="24"/>
-          <w:szCs w:val="24"/>
-        </w:rPr>
-        <w:t xml:space="preserve">Atas perhatian dan perkenan Bapak/Ibu, kami ucapkan terima kasih.</w:t>
+        <w:rPr>
+          <w:rFonts w:ascii="Arial" w:eastAsia="Calibri" w:hAnsi="Arial" w:cs="Arial"/>
+          <w:sz w:val="24"/>
+          <w:szCs w:val="24"/>
+        </w:rPr>
+      </w:pPr>
+      <w:r>
+        <w:rPr>
+          <w:rFonts w:ascii="Arial" w:eastAsia="Calibri" w:hAnsi="Arial" w:cs="Arial"/>
+          <w:sz w:val="24"/>
+          <w:szCs w:val="24"/>
+        </w:rPr>
+        <w:lastRenderedPageBreak/>
+        <w:t xml:space="preserve">Demikian usulan ini disampaikan. Atas perhatian dan perkenan Bapak/Ibu, diucapkan terima kasih.</w:t>
+      </w:r>
+      <w:r>
+        <w:rPr>
+          <w:rFonts w:ascii="Arial" w:eastAsia="Calibri" w:hAnsi="Arial" w:cs="Arial"/>
+          <w:sz w:val="24"/>
+          <w:szCs w:val="24"/>
+        </w:rPr>
+        <w:t xml:space="preserve"/>
+      </w:r>
+      <w:r>
+        <w:rPr>
+          <w:rFonts w:ascii="Arial" w:eastAsia="Calibri" w:hAnsi="Arial" w:cs="Arial"/>
+          <w:sz w:val="24"/>
+          <w:szCs w:val="24"/>
+        </w:rPr>
+        <w:t xml:space="preserve"/>
+      </w:r>
+      <w:r>
+        <w:rPr>
+          <w:rFonts w:ascii="Arial" w:eastAsia="Calibri" w:hAnsi="Arial" w:cs="Arial"/>
+          <w:sz w:val="24"/>
+          <w:szCs w:val="24"/>
+        </w:rPr>
+        <w:t xml:space="preserve"/>
+      </w:r>
+      <w:r>
+        <w:rPr>
+          <w:rFonts w:ascii="Arial" w:eastAsia="Calibri" w:hAnsi="Arial" w:cs="Arial"/>
+          <w:sz w:val="24"/>
+          <w:szCs w:val="24"/>
+        </w:rPr>
+        <w:t xml:space="preserve"/>
+      </w:r>
+      <w:r>
+        <w:rPr>
+          <w:rFonts w:ascii="Arial" w:eastAsia="Calibri" w:hAnsi="Arial" w:cs="Arial"/>
+          <w:sz w:val="24"/>
+          <w:szCs w:val="24"/>
+        </w:rPr>
+        <w:t xml:space="preserve"/>
+      </w:r>
+      <w:r>
+        <w:rPr>
+          <w:rFonts w:ascii="Arial" w:eastAsia="Calibri" w:hAnsi="Arial" w:cs="Arial"/>
+          <w:sz w:val="24"/>
+          <w:szCs w:val="24"/>
+        </w:rPr>
+        <w:t xml:space="preserve"/>
+      </w:r>
+      <w:r>
+        <w:rPr>
+          <w:rFonts w:ascii="Arial" w:eastAsia="Calibri" w:hAnsi="Arial" w:cs="Arial"/>
+          <w:sz w:val="24"/>
+          <w:szCs w:val="24"/>
+        </w:rPr>
+        <w:t xml:space="preserve"/>
       </w:r>
     </w:p>
     <w:p>
@@ -991,7 +1195,7 @@
           <w:sz w:val="24"/>
           <w:szCs w:val="24"/>
         </w:rPr>
-        <w:t>${</w:t>
+        <w:t xml:space="preserve">SEKRETARIS DAERAH</w:t>
       </w:r>
       <w:proofErr w:type="spellStart"/>
       <w:r>
@@ -1002,7 +1206,7 @@
           <w:sz w:val="24"/>
           <w:szCs w:val="24"/>
         </w:rPr>
-        <w:t>jabatan_pengirim</w:t>
+        <w:t xml:space="preserve"/>
       </w:r>
       <w:proofErr w:type="spellEnd"/>
       <w:r>
@@ -1013,7 +1217,7 @@
           <w:sz w:val="24"/>
           <w:szCs w:val="24"/>
         </w:rPr>
-        <w:t>}</w:t>
+        <w:t xml:space="preserve"/>
       </w:r>
     </w:p>
     <w:p>
@@ -1211,8 +1415,1926 @@
       <w:r>
         <w:rPr>
           <w:rFonts w:ascii="Arial" w:eastAsia="Calibri" w:hAnsi="Arial" w:cs="Arial"/>
-          <w:b/>
-          <w:bCs/>
+          <w:sz w:val="24"/>
+          <w:szCs w:val="24"/>
+        </w:rPr>
+        <w:t xml:space="preserve">NIP. </w:t>
+      </w:r>
+      <w:r>
+        <w:rPr>
+          <w:rFonts w:ascii="Arial" w:eastAsia="Calibri" w:hAnsi="Arial" w:cs="Arial"/>
+          <w:b/>
+          <w:bCs/>
+          <w:sz w:val="24"/>
+          <w:szCs w:val="24"/>
+        </w:rPr>
+        <w:t>${</w:t>
+      </w:r>
+      <w:proofErr w:type="spellStart"/>
+      <w:r>
+        <w:rPr>
+          <w:rFonts w:ascii="Arial" w:eastAsia="Calibri" w:hAnsi="Arial" w:cs="Arial"/>
+          <w:b/>
+          <w:bCs/>
+          <w:sz w:val="24"/>
+          <w:szCs w:val="24"/>
+        </w:rPr>
+        <w:t>nip</w:t>
+      </w:r>
+      <w:r>
+        <w:rPr>
+          <w:rFonts w:ascii="Arial" w:eastAsia="Calibri" w:hAnsi="Arial" w:cs="Arial"/>
+          <w:b/>
+          <w:bCs/>
+          <w:sz w:val="24"/>
+          <w:szCs w:val="24"/>
+        </w:rPr>
+        <w:t>_pengirim</w:t>
+      </w:r>
+      <w:proofErr w:type="spellEnd"/>
+      <w:r>
+        <w:rPr>
+          <w:rFonts w:ascii="Arial" w:eastAsia="Calibri" w:hAnsi="Arial" w:cs="Arial"/>
+          <w:b/>
+          <w:bCs/>
+          <w:sz w:val="24"/>
+          <w:szCs w:val="24"/>
+        </w:rPr>
+        <w:t>}</w:t>
+      </w:r>
+    </w:p>
+    <w:p>
+      <w:pPr>
+        <w:spacing w:before="240" w:after="0" w:line="276" w:lineRule="auto"/>
+        <w:jc w:val="both"/>
+        <w:rPr>
+          <w:rFonts w:ascii="Arial" w:eastAsia="Calibri" w:hAnsi="Arial" w:cs="Arial"/>
+          <w:sz w:val="24"/>
+          <w:szCs w:val="24"/>
+        </w:rPr>
+      </w:pPr>
+    </w:p>
+    <w:p>
+      <w:pPr>
+        <w:spacing w:after="0" w:line="240" w:lineRule="auto"/>
+        <w:rPr>
+          <w:rFonts w:ascii="Arial" w:eastAsia="Times New Roman" w:hAnsi="Arial" w:cs="Arial"/>
+          <w:iCs/>
+          <w:kern w:val="0"/>
+          <w:sz w:val="20"/>
+          <w:szCs w:val="20"/>
+          <w:u w:val="single"/>
+          <w14:ligatures w14:val="none"/>
+        </w:rPr>
+      </w:pPr>
+      <w:r>
+        <w:rPr>
+          <w:rFonts w:ascii="Arial" w:eastAsia="Times New Roman" w:hAnsi="Arial" w:cs="Arial"/>
+          <w:iCs/>
+          <w:kern w:val="0"/>
+          <w:sz w:val="20"/>
+          <w:szCs w:val="20"/>
+          <w:u w:val="single"/>
+          <w14:ligatures w14:val="none"/>
+        </w:rPr>
+        <w:t>Tembusan :</w:t>
+      </w:r>
+    </w:p>
+    <w:p>
+      <w:pPr>
+        <w:spacing w:after="0" w:line="240" w:lineRule="auto"/>
+        <w:rPr>
+          <w:rFonts w:ascii="Arial" w:eastAsia="Times New Roman" w:hAnsi="Arial" w:cs="Arial"/>
+          <w:iCs/>
+          <w:kern w:val="0"/>
+          <w:sz w:val="20"/>
+          <w:szCs w:val="20"/>
+          <w:u w:val="single"/>
+          <w14:ligatures w14:val="none"/>
+        </w:rPr>
+      </w:pPr>
+      <w:r>
+        <w:rPr>
+          <w:rFonts w:ascii="Arial" w:eastAsia="Times New Roman" w:hAnsi="Arial" w:cs="Arial"/>
+          <w:iCs/>
+          <w:kern w:val="0"/>
+          <w:sz w:val="20"/>
+          <w:szCs w:val="20"/>
+          <w14:ligatures w14:val="none"/>
+        </w:rPr>
+        <w:t xml:space="preserve">Wali Kota Tarakan.</w:t>
+      </w:r>
+      <w:r>
+        <w:rPr>
+          <w:rFonts w:ascii="Arial" w:eastAsia="Times New Roman" w:hAnsi="Arial" w:cs="Arial"/>
+          <w:iCs/>
+          <w:kern w:val="0"/>
+          <w:sz w:val="20"/>
+          <w:szCs w:val="20"/>
+          <w14:ligatures w14:val="none"/>
+        </w:rPr>
+        <w:t xml:space="preserve"/>
+      </w:r>
+    </w:p>
+    <w:p>
+      <w:pPr>
+        <w:rPr>
+          <w:rFonts w:ascii="Arial" w:eastAsia="Times New Roman" w:hAnsi="Arial" w:cs="Arial"/>
+          <w:iCs/>
+          <w:kern w:val="0"/>
+          <w:sz w:val="24"/>
+          <w:szCs w:val="24"/>
+          <w:u w:val="single"/>
+          <w14:ligatures w14:val="none"/>
+        </w:rPr>
+      </w:pPr>
+      <w:r>
+        <w:rPr>
+          <w:rFonts w:ascii="Arial" w:eastAsia="Times New Roman" w:hAnsi="Arial" w:cs="Arial"/>
+          <w:iCs/>
+          <w:kern w:val="0"/>
+          <w:sz w:val="24"/>
+          <w:szCs w:val="24"/>
+          <w:u w:val="single"/>
+          <w14:ligatures w14:val="none"/>
+        </w:rPr>
+        <w:br w:type="page"/>
+      </w:r>
+    </w:p>
+    <w:p>
+      <w:pPr>
+        <w:pStyle w:val="DaftarParagraf"/>
+        <w:spacing w:after="0" w:line="240" w:lineRule="auto"/>
+        <w:ind w:left="0"/>
+        <w:rPr>
+          <w:rFonts w:ascii="Arial" w:eastAsia="Times New Roman" w:hAnsi="Arial" w:cs="Arial"/>
+          <w:iCs/>
+          <w:kern w:val="0"/>
+          <w:sz w:val="24"/>
+          <w:szCs w:val="24"/>
+          <w14:ligatures w14:val="none"/>
+        </w:rPr>
+      </w:pPr>
+      <w:r>
+        <w:rPr>
+          <w:rFonts w:ascii="Arial" w:eastAsia="Times New Roman" w:hAnsi="Arial" w:cs="Arial"/>
+          <w:iCs/>
+          <w:kern w:val="0"/>
+          <w:sz w:val="24"/>
+          <w:szCs w:val="24"/>
+          <w14:ligatures w14:val="none"/>
+        </w:rPr>
+        <w:lastRenderedPageBreak/>
+        <w:t>Lampiran Surat :</w:t>
+      </w:r>
+    </w:p>
+    <w:p>
+      <w:pPr>
+        <w:pStyle w:val="DaftarParagraf"/>
+        <w:spacing w:after="0" w:line="240" w:lineRule="auto"/>
+        <w:ind w:left="0"/>
+        <w:rPr>
+          <w:rFonts w:ascii="Arial" w:eastAsia="Calibri" w:hAnsi="Arial" w:cs="Arial"/>
+          <w:kern w:val="0"/>
+          <w:sz w:val="24"/>
+          <w:szCs w:val="24"/>
+          <w14:ligatures w14:val="none"/>
+        </w:rPr>
+      </w:pPr>
+      <w:r>
+        <w:rPr>
+          <w:rFonts w:ascii="Arial" w:eastAsia="Times New Roman" w:hAnsi="Arial" w:cs="Arial"/>
+          <w:iCs/>
+          <w:kern w:val="0"/>
+          <w:sz w:val="24"/>
+          <w:szCs w:val="24"/>
+          <w14:ligatures w14:val="none"/>
+        </w:rPr>
+        <w:t>Nomor</w:t>
+      </w:r>
+      <w:r>
+        <w:rPr>
+          <w:rFonts w:ascii="Arial" w:eastAsia="Times New Roman" w:hAnsi="Arial" w:cs="Arial"/>
+          <w:iCs/>
+          <w:kern w:val="0"/>
+          <w:sz w:val="24"/>
+          <w:szCs w:val="24"/>
+          <w14:ligatures w14:val="none"/>
+        </w:rPr>
+        <w:tab/>
+        <w:t xml:space="preserve">: </w:t>
+      </w:r>
+      <w:r>
+        <w:rPr>
+          <w:rFonts w:ascii="Arial" w:eastAsia="Calibri" w:hAnsi="Arial" w:cs="Arial"/>
+          <w:kern w:val="0"/>
+          <w:sz w:val="24"/>
+          <w:szCs w:val="24"/>
+          <w14:ligatures w14:val="none"/>
+        </w:rPr>
+        <w:t>${</w:t>
+      </w:r>
+      <w:proofErr w:type="spellStart"/>
+      <w:r>
+        <w:rPr>
+          <w:rFonts w:ascii="Arial" w:eastAsia="Calibri" w:hAnsi="Arial" w:cs="Arial"/>
+          <w:kern w:val="0"/>
+          <w:sz w:val="24"/>
+          <w:szCs w:val="24"/>
+          <w14:ligatures w14:val="none"/>
+        </w:rPr>
+        <w:t>nomor_naskah</w:t>
+      </w:r>
+      <w:proofErr w:type="spellEnd"/>
+      <w:r>
+        <w:rPr>
+          <w:rFonts w:ascii="Arial" w:eastAsia="Calibri" w:hAnsi="Arial" w:cs="Arial"/>
+          <w:kern w:val="0"/>
+          <w:sz w:val="24"/>
+          <w:szCs w:val="24"/>
+          <w14:ligatures w14:val="none"/>
+        </w:rPr>
+        <w:t>}</w:t>
+      </w:r>
+    </w:p>
+    <w:p>
+      <w:pPr>
+        <w:spacing w:after="0" w:line="240" w:lineRule="auto"/>
+        <w:rPr>
+          <w:rFonts w:ascii="Arial" w:eastAsia="Calibri" w:hAnsi="Arial" w:cs="Arial"/>
+          <w:kern w:val="0"/>
+          <w:sz w:val="24"/>
+          <w:szCs w:val="24"/>
+          <w14:ligatures w14:val="none"/>
+        </w:rPr>
+      </w:pPr>
+      <w:r>
+        <w:rPr>
+          <w:rFonts w:ascii="Arial" w:eastAsia="Calibri" w:hAnsi="Arial" w:cs="Arial"/>
+          <w:kern w:val="0"/>
+          <w:sz w:val="24"/>
+          <w:szCs w:val="24"/>
+          <w14:ligatures w14:val="none"/>
+        </w:rPr>
+        <w:t>Tanggal</w:t>
+      </w:r>
+      <w:r>
+        <w:rPr>
+          <w:rFonts w:ascii="Arial" w:eastAsia="Calibri" w:hAnsi="Arial" w:cs="Arial"/>
+          <w:kern w:val="0"/>
+          <w:sz w:val="24"/>
+          <w:szCs w:val="24"/>
+          <w14:ligatures w14:val="none"/>
+        </w:rPr>
+        <w:tab/>
+        <w:t xml:space="preserve">: </w:t>
+      </w:r>
+      <w:r>
+        <w:rPr>
+          <w:rFonts w:ascii="Arial" w:eastAsia="Calibri" w:hAnsi="Arial" w:cs="Arial"/>
+          <w:kern w:val="0"/>
+          <w:sz w:val="24"/>
+          <w:szCs w:val="24"/>
+          <w14:ligatures w14:val="none"/>
+        </w:rPr>
+        <w:t>${</w:t>
+      </w:r>
+      <w:proofErr w:type="spellStart"/>
+      <w:r>
+        <w:rPr>
+          <w:rFonts w:ascii="Arial" w:eastAsia="Calibri" w:hAnsi="Arial" w:cs="Arial"/>
+          <w:kern w:val="0"/>
+          <w:sz w:val="24"/>
+          <w:szCs w:val="24"/>
+          <w14:ligatures w14:val="none"/>
+        </w:rPr>
+        <w:t>tanggal_naskah</w:t>
+      </w:r>
+      <w:proofErr w:type="spellEnd"/>
+      <w:r>
+        <w:rPr>
+          <w:rFonts w:ascii="Arial" w:eastAsia="Calibri" w:hAnsi="Arial" w:cs="Arial"/>
+          <w:kern w:val="0"/>
+          <w:sz w:val="24"/>
+          <w:szCs w:val="24"/>
+          <w14:ligatures w14:val="none"/>
+        </w:rPr>
+        <w:t>}</w:t>
+      </w:r>
+    </w:p>
+    <w:p>
+      <w:pPr>
+        <w:pStyle w:val="DaftarParagraf"/>
+        <w:spacing w:after="0" w:line="240" w:lineRule="auto"/>
+        <w:ind w:left="0"/>
+        <w:rPr>
+          <w:rFonts w:ascii="Arial" w:eastAsia="Calibri" w:hAnsi="Arial" w:cs="Arial"/>
+          <w:kern w:val="0"/>
+          <w:sz w:val="24"/>
+          <w:szCs w:val="24"/>
+          <w14:ligatures w14:val="none"/>
+        </w:rPr>
+      </w:pPr>
+    </w:p>
+    <w:p>
+      <w:pPr>
+        <w:pStyle w:val="DaftarParagraf"/>
+        <w:spacing w:after="0" w:line="240" w:lineRule="auto"/>
+        <w:ind w:left="360"/>
+        <w:rPr>
+          <w:rFonts w:ascii="Arial" w:eastAsia="Calibri" w:hAnsi="Arial" w:cs="Arial"/>
+          <w:kern w:val="0"/>
+          <w:sz w:val="24"/>
+          <w:szCs w:val="24"/>
+          <w14:ligatures w14:val="none"/>
+        </w:rPr>
+      </w:pPr>
+    </w:p>
+    <w:p>
+      <w:pPr>
+        <w:spacing w:after="0" w:line="240" w:lineRule="auto"/>
+        <w:jc w:val="center"/>
+        <w:rPr>
+          <w:rFonts w:ascii="Arial" w:hAnsi="Arial" w:cs="Arial"/>
+          <w:sz w:val="24"/>
+          <w:szCs w:val="24"/>
+        </w:rPr>
+      </w:pPr>
+      <w:r>
+        <w:rPr>
+          <w:rFonts w:ascii="Arial" w:hAnsi="Arial" w:cs="Arial"/>
+          <w:b/>
+          <w:bCs/>
+          <w:sz w:val="24"/>
+          <w:szCs w:val="24"/>
+        </w:rPr>
+        <w:t xml:space="preserve">SUSUNAN TIM DAN IDENTITAS USULAN INOVASI</w:t>
+      </w:r>
+    </w:p>
+    <w:p>
+      <w:pPr>
+        <w:spacing w:after="0" w:line="240" w:lineRule="auto"/>
+        <w:jc w:val="center"/>
+        <w:rPr>
+          <w:rFonts w:ascii="Arial" w:hAnsi="Arial" w:cs="Arial"/>
+          <w:sz w:val="24"/>
+          <w:szCs w:val="24"/>
+        </w:rPr>
+      </w:pPr>
+      <w:r>
+        <w:rPr>
+          <w:rFonts w:ascii="Arial" w:hAnsi="Arial" w:cs="Arial"/>
+          <w:sz w:val="24"/>
+          <w:szCs w:val="24"/>
+        </w:rPr>
+        <w:t xml:space="preserve">Lomba Inovasi Daerah Kota Tarakan Tahun 2026</w:t>
+      </w:r>
+      <w:proofErr w:type="spellStart"/>
+      <w:r>
+        <w:rPr>
+          <w:rFonts w:ascii="Arial" w:hAnsi="Arial" w:cs="Arial"/>
+          <w:sz w:val="24"/>
+          <w:szCs w:val="24"/>
+        </w:rPr>
+        <w:t xml:space="preserve"/>
+      </w:r>
+      <w:proofErr w:type="spellEnd"/>
+      <w:r>
+        <w:rPr>
+          <w:rFonts w:ascii="Arial" w:hAnsi="Arial" w:cs="Arial"/>
+          <w:sz w:val="24"/>
+          <w:szCs w:val="24"/>
+        </w:rPr>
+        <w:t xml:space="preserve"/>
+      </w:r>
+    </w:p>
+    <w:p>
+      <w:pPr>
+        <w:pStyle w:val="Judul1"/>
+        <w:spacing w:after="0" w:line="240" w:lineRule="auto"/>
+        <w:rPr>
+          <w:rFonts w:ascii="Arial" w:hAnsi="Arial" w:cs="Arial"/>
+          <w:b/>
+          <w:bCs/>
+          <w:color w:val="auto"/>
+          <w:sz w:val="24"/>
+          <w:szCs w:val="24"/>
+          <w:u w:val="single"/>
+        </w:rPr>
+      </w:pPr>
+      <w:r>
+        <w:rPr>
+          <w:rFonts w:ascii="Arial" w:hAnsi="Arial" w:cs="Arial"/>
+          <w:b/>
+          <w:bCs/>
+          <w:color w:val="auto"/>
+          <w:sz w:val="24"/>
+          <w:szCs w:val="24"/>
+          <w:u w:val="single"/>
+        </w:rPr>
+        <w:t xml:space="preserve">IDENTITAS USULAN</w:t>
+      </w:r>
+    </w:p>
+    <w:p>
+      <w:pPr>
+        <w:tabs>
+          <w:tab w:val="left" w:pos="3402"/>
+          <w:tab w:val="left" w:pos="3544"/>
+        </w:tabs>
+        <w:ind w:left="3544" w:hanging="3544"/>
+        <w:spacing w:after="0" w:line="240" w:lineRule="auto"/>
+        <w:rPr>
+          <w:rFonts w:ascii="Arial" w:hAnsi="Arial" w:cs="Arial"/>
+          <w:sz w:val="24"/>
+          <w:szCs w:val="24"/>
+        </w:rPr>
+      </w:pPr>
+      <w:r>
+        <w:rPr>
+          <w:rFonts w:ascii="Arial" w:hAnsi="Arial" w:cs="Arial"/>
+          <w:b/>
+          <w:bCs/>
+          <w:sz w:val="24"/>
+          <w:szCs w:val="24"/>
+        </w:rPr>
+        <w:t xml:space="preserve">Inovasi</w:t>
+      </w:r>
+      <w:r>
+        <w:rPr>
+          <w:rFonts w:ascii="Arial" w:hAnsi="Arial" w:cs="Arial"/>
+          <w:b/>
+          <w:bCs/>
+          <w:sz w:val="24"/>
+          <w:szCs w:val="24"/>
+        </w:rPr>
+        <w:tab/>
+        <w:t xml:space="preserve">:</w:t>
+      </w:r>
+      <w:r>
+        <w:rPr>
+          <w:rFonts w:ascii="Arial" w:hAnsi="Arial" w:cs="Arial"/>
+          <w:sz w:val="24"/>
+          <w:szCs w:val="24"/>
+        </w:rPr>
+        <w:tab/>
+        <w:t xml:space="preserve">Prokopim Hibot: Superapp Pelayanan Keprotokolan dan Komunikasi Pimpinan Pemerintah Kota Tarakan</w:t>
+      </w:r>
+    </w:p>
+    <w:p>
+      <w:pPr>
+        <w:tabs>
+          <w:tab w:val="left" w:pos="3402"/>
+          <w:tab w:val="left" w:pos="3544"/>
+        </w:tabs>
+        <w:ind w:left="3544" w:hanging="3544"/>
+        <w:spacing w:after="0" w:line="240" w:lineRule="auto"/>
+        <w:rPr>
+          <w:rFonts w:ascii="Arial" w:hAnsi="Arial" w:cs="Arial"/>
+          <w:sz w:val="24"/>
+          <w:szCs w:val="24"/>
+        </w:rPr>
+      </w:pPr>
+      <w:r>
+        <w:rPr>
+          <w:rFonts w:ascii="Arial" w:hAnsi="Arial" w:cs="Arial"/>
+          <w:b/>
+          <w:bCs/>
+          <w:sz w:val="24"/>
+          <w:szCs w:val="24"/>
+        </w:rPr>
+        <w:t xml:space="preserve">Nama Inovator</w:t>
+      </w:r>
+      <w:r>
+        <w:rPr>
+          <w:rFonts w:ascii="Arial" w:hAnsi="Arial" w:cs="Arial"/>
+          <w:b/>
+          <w:bCs/>
+          <w:sz w:val="24"/>
+          <w:szCs w:val="24"/>
+        </w:rPr>
+        <w:tab/>
+        <w:t xml:space="preserve">:</w:t>
+      </w:r>
+      <w:r>
+        <w:rPr>
+          <w:rFonts w:ascii="Arial" w:hAnsi="Arial" w:cs="Arial"/>
+          <w:sz w:val="24"/>
+          <w:szCs w:val="24"/>
+        </w:rPr>
+        <w:tab/>
+        <w:t xml:space="preserve">Tim Inovasi Prokopim Hibot (susunan tim di bawah)</w:t>
+      </w:r>
+    </w:p>
+    <w:p>
+      <w:pPr>
+        <w:tabs>
+          <w:tab w:val="left" w:pos="3402"/>
+          <w:tab w:val="left" w:pos="3544"/>
+        </w:tabs>
+        <w:ind w:left="3544" w:hanging="3544"/>
+        <w:spacing w:after="0" w:line="240" w:lineRule="auto"/>
+        <w:rPr>
+          <w:rFonts w:ascii="Arial" w:hAnsi="Arial" w:cs="Arial"/>
+          <w:sz w:val="24"/>
+          <w:szCs w:val="24"/>
+        </w:rPr>
+      </w:pPr>
+      <w:r>
+        <w:rPr>
+          <w:rFonts w:ascii="Arial" w:hAnsi="Arial" w:cs="Arial"/>
+          <w:b/>
+          <w:bCs/>
+          <w:sz w:val="24"/>
+          <w:szCs w:val="24"/>
+        </w:rPr>
+        <w:t xml:space="preserve">Lama Implementasi Inovasi</w:t>
+      </w:r>
+      <w:r>
+        <w:rPr>
+          <w:rFonts w:ascii="Arial" w:hAnsi="Arial" w:cs="Arial"/>
+          <w:b/>
+          <w:bCs/>
+          <w:sz w:val="24"/>
+          <w:szCs w:val="24"/>
+        </w:rPr>
+        <w:tab/>
+        <w:t xml:space="preserve">:</w:t>
+      </w:r>
+      <w:r>
+        <w:rPr>
+          <w:rFonts w:ascii="Arial" w:hAnsi="Arial" w:cs="Arial"/>
+          <w:sz w:val="24"/>
+          <w:szCs w:val="24"/>
+        </w:rPr>
+        <w:tab/>
+        <w:t xml:space="preserve">±7 bulan (sejak Maret 2026)</w:t>
+      </w:r>
+    </w:p>
+    <w:p>
+      <w:pPr>
+        <w:tabs>
+          <w:tab w:val="left" w:pos="3402"/>
+          <w:tab w:val="left" w:pos="3544"/>
+        </w:tabs>
+        <w:ind w:left="3544" w:hanging="3544"/>
+        <w:spacing w:after="0" w:line="240" w:lineRule="auto"/>
+        <w:rPr>
+          <w:rFonts w:ascii="Arial" w:hAnsi="Arial" w:cs="Arial"/>
+          <w:sz w:val="24"/>
+          <w:szCs w:val="24"/>
+        </w:rPr>
+      </w:pPr>
+      <w:r>
+        <w:rPr>
+          <w:rFonts w:ascii="Arial" w:hAnsi="Arial" w:cs="Arial"/>
+          <w:b/>
+          <w:bCs/>
+          <w:sz w:val="24"/>
+          <w:szCs w:val="24"/>
+        </w:rPr>
+        <w:t xml:space="preserve">Kategori</w:t>
+      </w:r>
+      <w:r>
+        <w:rPr>
+          <w:rFonts w:ascii="Arial" w:hAnsi="Arial" w:cs="Arial"/>
+          <w:b/>
+          <w:bCs/>
+          <w:sz w:val="24"/>
+          <w:szCs w:val="24"/>
+        </w:rPr>
+        <w:tab/>
+        <w:t xml:space="preserve">:</w:t>
+      </w:r>
+      <w:r>
+        <w:rPr>
+          <w:rFonts w:ascii="Arial" w:hAnsi="Arial" w:cs="Arial"/>
+          <w:sz w:val="24"/>
+          <w:szCs w:val="24"/>
+        </w:rPr>
+        <w:tab/>
+        <w:t xml:space="preserve">A. Inovasi Tata Kelola Pemerintahan</w:t>
+      </w:r>
+    </w:p>
+    <w:p>
+      <w:pPr>
+        <w:tabs>
+          <w:tab w:val="left" w:pos="3402"/>
+          <w:tab w:val="left" w:pos="3544"/>
+        </w:tabs>
+        <w:ind w:left="3544" w:hanging="3544"/>
+        <w:spacing w:after="0" w:line="240" w:lineRule="auto"/>
+        <w:rPr>
+          <w:rFonts w:ascii="Arial" w:hAnsi="Arial" w:cs="Arial"/>
+          <w:sz w:val="24"/>
+          <w:szCs w:val="24"/>
+        </w:rPr>
+      </w:pPr>
+      <w:r>
+        <w:rPr>
+          <w:rFonts w:ascii="Arial" w:hAnsi="Arial" w:cs="Arial"/>
+          <w:b/>
+          <w:bCs/>
+          <w:sz w:val="24"/>
+          <w:szCs w:val="24"/>
+        </w:rPr>
+        <w:t xml:space="preserve">Instansi</w:t>
+      </w:r>
+      <w:r>
+        <w:rPr>
+          <w:rFonts w:ascii="Arial" w:hAnsi="Arial" w:cs="Arial"/>
+          <w:b/>
+          <w:bCs/>
+          <w:sz w:val="24"/>
+          <w:szCs w:val="24"/>
+        </w:rPr>
+        <w:tab/>
+        <w:t xml:space="preserve">:</w:t>
+      </w:r>
+      <w:r>
+        <w:rPr>
+          <w:rFonts w:ascii="Arial" w:hAnsi="Arial" w:cs="Arial"/>
+          <w:sz w:val="24"/>
+          <w:szCs w:val="24"/>
+        </w:rPr>
+        <w:tab/>
+        <w:t xml:space="preserve">Bagian Protokol dan Komunikasi Pimpinan Sekretariat Daerah Kota Tarakan</w:t>
+      </w:r>
+    </w:p>
+    <w:p>
+      <w:pPr>
+        <w:pStyle w:val="Judul1"/>
+        <w:spacing w:after="0" w:line="240" w:lineRule="auto"/>
+        <w:rPr>
+          <w:rFonts w:ascii="Arial" w:hAnsi="Arial" w:cs="Arial"/>
+          <w:b/>
+          <w:bCs/>
+          <w:color w:val="auto"/>
+          <w:sz w:val="24"/>
+          <w:szCs w:val="24"/>
+          <w:u w:val="single"/>
+        </w:rPr>
+      </w:pPr>
+      <w:r>
+        <w:rPr>
+          <w:rFonts w:ascii="Arial" w:hAnsi="Arial" w:cs="Arial"/>
+          <w:b/>
+          <w:bCs/>
+          <w:color w:val="auto"/>
+          <w:sz w:val="24"/>
+          <w:szCs w:val="24"/>
+          <w:u w:val="single"/>
+        </w:rPr>
+        <w:t xml:space="preserve">SUSUNAN TIM INOVASI</w:t>
+      </w:r>
+    </w:p>
+    <w:p/>
+    <w:tbl>
+      <w:tblPr>
+        <w:tblW w:w="9360" w:type="dxa"/>
+        <w:tblBorders>
+          <w:top w:val="single" w:sz="4" w:space="0" w:color="auto"/>
+          <w:left w:val="single" w:sz="4" w:space="0" w:color="auto"/>
+          <w:bottom w:val="single" w:sz="4" w:space="0" w:color="auto"/>
+          <w:right w:val="single" w:sz="4" w:space="0" w:color="auto"/>
+          <w:insideH w:val="single" w:sz="4" w:space="0" w:color="auto"/>
+          <w:insideV w:val="single" w:sz="4" w:space="0" w:color="auto"/>
+        </w:tblBorders>
+        <w:tblCellMar>
+          <w:left w:w="10" w:type="dxa"/>
+          <w:right w:w="10" w:type="dxa"/>
+        </w:tblCellMar>
+        <w:tblLook w:val="04A0" w:firstRow="1" w:lastRow="0" w:firstColumn="1" w:lastColumn="0" w:noHBand="0" w:noVBand="1"/>
+      </w:tblPr>
+      <w:tblGrid>
+        <w:gridCol w:w="620"/>
+        <w:gridCol w:w="3484"/>
+        <w:gridCol w:w="3748"/>
+        <w:gridCol w:w="1508"/>
+      </w:tblGrid>
+      <w:tr>
+        <w:tblPrEx>
+          <w:tblCellMar>
+            <w:top w:w="0" w:type="dxa"/>
+            <w:bottom w:w="0" w:type="dxa"/>
+          </w:tblCellMar>
+        </w:tblPrEx>
+        <w:tc>
+          <w:tcPr>
+            <w:tcW w:w="620" w:type="dxa"/>
+            <w:tcMar>
+              <w:top w:w="80" w:type="dxa"/>
+              <w:left w:w="100" w:type="dxa"/>
+              <w:bottom w:w="80" w:type="dxa"/>
+              <w:right w:w="100" w:type="dxa"/>
+            </w:tcMar>
+          </w:tcPr>
+          <w:p>
+            <w:pPr>
+              <w:spacing w:after="0" w:line="240" w:lineRule="auto"/>
+              <w:rPr>
+                <w:rFonts w:ascii="Arial" w:hAnsi="Arial" w:cs="Arial"/>
+                <w:sz w:val="24"/>
+                <w:szCs w:val="24"/>
+              </w:rPr>
+            </w:pPr>
+            <w:r>
+              <w:rPr>
+                <w:rFonts w:ascii="Arial" w:hAnsi="Arial" w:cs="Arial"/>
+                <w:b/>
+                <w:bCs/>
+                <w:sz w:val="24"/>
+                <w:szCs w:val="24"/>
+              </w:rPr>
+              <w:t xml:space="preserve">No</w:t>
+            </w:r>
+          </w:p>
+        </w:tc>
+        <w:tc>
+          <w:tcPr>
+            <w:tcW w:w="3484" w:type="dxa"/>
+            <w:tcMar>
+              <w:top w:w="80" w:type="dxa"/>
+              <w:left w:w="100" w:type="dxa"/>
+              <w:bottom w:w="80" w:type="dxa"/>
+              <w:right w:w="100" w:type="dxa"/>
+            </w:tcMar>
+          </w:tcPr>
+          <w:p>
+            <w:pPr>
+              <w:spacing w:after="0" w:line="240" w:lineRule="auto"/>
+              <w:rPr>
+                <w:rFonts w:ascii="Arial" w:hAnsi="Arial" w:cs="Arial"/>
+                <w:sz w:val="24"/>
+                <w:szCs w:val="24"/>
+              </w:rPr>
+            </w:pPr>
+            <w:r>
+              <w:rPr>
+                <w:rFonts w:ascii="Arial" w:hAnsi="Arial" w:cs="Arial"/>
+                <w:b/>
+                <w:bCs/>
+                <w:sz w:val="24"/>
+                <w:szCs w:val="24"/>
+              </w:rPr>
+              <w:t xml:space="preserve">Nama</w:t>
+            </w:r>
+          </w:p>
+        </w:tc>
+        <w:tc>
+          <w:tcPr>
+            <w:tcW w:w="3748" w:type="dxa"/>
+            <w:tcMar>
+              <w:top w:w="80" w:type="dxa"/>
+              <w:left w:w="100" w:type="dxa"/>
+              <w:bottom w:w="80" w:type="dxa"/>
+              <w:right w:w="100" w:type="dxa"/>
+            </w:tcMar>
+          </w:tcPr>
+          <w:p>
+            <w:pPr>
+              <w:spacing w:after="0" w:line="240" w:lineRule="auto"/>
+              <w:rPr>
+                <w:rFonts w:ascii="Arial" w:hAnsi="Arial" w:cs="Arial"/>
+                <w:sz w:val="24"/>
+                <w:szCs w:val="24"/>
+              </w:rPr>
+            </w:pPr>
+            <w:r>
+              <w:rPr>
+                <w:rFonts w:ascii="Arial" w:hAnsi="Arial" w:cs="Arial"/>
+                <w:b/>
+                <w:bCs/>
+                <w:sz w:val="24"/>
+                <w:szCs w:val="24"/>
+              </w:rPr>
+              <w:t xml:space="preserve">Jabatan</w:t>
+            </w:r>
+          </w:p>
+        </w:tc>
+        <w:tc>
+          <w:tcPr>
+            <w:tcW w:w="1508" w:type="dxa"/>
+            <w:tcMar>
+              <w:top w:w="80" w:type="dxa"/>
+              <w:left w:w="100" w:type="dxa"/>
+              <w:bottom w:w="80" w:type="dxa"/>
+              <w:right w:w="100" w:type="dxa"/>
+            </w:tcMar>
+          </w:tcPr>
+          <w:p>
+            <w:pPr>
+              <w:spacing w:after="0" w:line="240" w:lineRule="auto"/>
+              <w:rPr>
+                <w:rFonts w:ascii="Arial" w:hAnsi="Arial" w:cs="Arial"/>
+                <w:sz w:val="24"/>
+                <w:szCs w:val="24"/>
+              </w:rPr>
+            </w:pPr>
+            <w:proofErr w:type="spellStart"/>
+            <w:r>
+              <w:rPr>
+                <w:rFonts w:ascii="Arial" w:hAnsi="Arial" w:cs="Arial"/>
+                <w:b/>
+                <w:bCs/>
+                <w:sz w:val="24"/>
+                <w:szCs w:val="24"/>
+              </w:rPr>
+              <w:t xml:space="preserve">Kedudukan dalam Tim</w:t>
+            </w:r>
+            <w:proofErr w:type="spellEnd"/>
+          </w:p>
+        </w:tc>
+      </w:tr>
+      <w:tr>
+        <w:tblPrEx>
+          <w:tblCellMar>
+            <w:top w:w="0" w:type="dxa"/>
+            <w:bottom w:w="0" w:type="dxa"/>
+          </w:tblCellMar>
+        </w:tblPrEx>
+        <w:tc>
+          <w:tcPr>
+            <w:tcW w:w="620" w:type="dxa"/>
+            <w:tcMar>
+              <w:top w:w="80" w:type="dxa"/>
+              <w:left w:w="100" w:type="dxa"/>
+              <w:bottom w:w="80" w:type="dxa"/>
+              <w:right w:w="100" w:type="dxa"/>
+            </w:tcMar>
+          </w:tcPr>
+          <w:p>
+            <w:pPr>
+              <w:spacing w:after="0" w:line="240" w:lineRule="auto"/>
+              <w:rPr>
+                <w:rFonts w:ascii="Arial" w:hAnsi="Arial" w:cs="Arial"/>
+                <w:sz w:val="24"/>
+                <w:szCs w:val="24"/>
+              </w:rPr>
+            </w:pPr>
+            <w:r>
+              <w:rPr>
+                <w:rFonts w:ascii="Arial" w:hAnsi="Arial" w:cs="Arial"/>
+                <w:sz w:val="24"/>
+                <w:szCs w:val="24"/>
+              </w:rPr>
+              <w:t xml:space="preserve">1</w:t>
+            </w:r>
+          </w:p>
+        </w:tc>
+        <w:tc>
+          <w:tcPr>
+            <w:tcW w:w="3484" w:type="dxa"/>
+            <w:tcMar>
+              <w:top w:w="80" w:type="dxa"/>
+              <w:left w:w="100" w:type="dxa"/>
+              <w:bottom w:w="80" w:type="dxa"/>
+              <w:right w:w="100" w:type="dxa"/>
+            </w:tcMar>
+          </w:tcPr>
+          <w:p>
+            <w:pPr>
+              <w:spacing w:after="0" w:line="240" w:lineRule="auto"/>
+              <w:rPr>
+                <w:rFonts w:ascii="Arial" w:hAnsi="Arial" w:cs="Arial"/>
+                <w:sz w:val="24"/>
+                <w:szCs w:val="24"/>
+              </w:rPr>
+            </w:pPr>
+            <w:r>
+              <w:rPr>
+                <w:rFonts w:ascii="Arial" w:hAnsi="Arial" w:cs="Arial"/>
+                <w:sz w:val="24"/>
+                <w:szCs w:val="24"/>
+              </w:rPr>
+              <w:t xml:space="preserve">Anugrah Yega Pranatha, M.Si.</w:t>
+            </w:r>
+          </w:p>
+        </w:tc>
+        <w:tc>
+          <w:tcPr>
+            <w:tcW w:w="3748" w:type="dxa"/>
+            <w:tcMar>
+              <w:top w:w="80" w:type="dxa"/>
+              <w:left w:w="100" w:type="dxa"/>
+              <w:bottom w:w="80" w:type="dxa"/>
+              <w:right w:w="100" w:type="dxa"/>
+            </w:tcMar>
+          </w:tcPr>
+          <w:p>
+            <w:pPr>
+              <w:spacing w:after="0" w:line="240" w:lineRule="auto"/>
+              <w:rPr>
+                <w:rFonts w:ascii="Arial" w:hAnsi="Arial" w:cs="Arial"/>
+                <w:sz w:val="24"/>
+                <w:szCs w:val="24"/>
+              </w:rPr>
+            </w:pPr>
+            <w:r>
+              <w:rPr>
+                <w:rFonts w:ascii="Arial" w:hAnsi="Arial" w:cs="Arial"/>
+                <w:sz w:val="24"/>
+                <w:szCs w:val="24"/>
+              </w:rPr>
+              <w:t xml:space="preserve">Kepala Bagian Protokol dan Komunikasi Pimpinan</w:t>
+            </w:r>
+          </w:p>
+        </w:tc>
+        <w:tc>
+          <w:tcPr>
+            <w:tcW w:w="1508" w:type="dxa"/>
+            <w:tcMar>
+              <w:top w:w="80" w:type="dxa"/>
+              <w:left w:w="100" w:type="dxa"/>
+              <w:bottom w:w="80" w:type="dxa"/>
+              <w:right w:w="100" w:type="dxa"/>
+            </w:tcMar>
+          </w:tcPr>
+          <w:p>
+            <w:pPr>
+              <w:spacing w:after="0" w:line="240" w:lineRule="auto"/>
+              <w:rPr>
+                <w:rFonts w:ascii="Arial" w:hAnsi="Arial" w:cs="Arial"/>
+                <w:sz w:val="24"/>
+                <w:szCs w:val="24"/>
+              </w:rPr>
+            </w:pPr>
+            <w:proofErr w:type="spellStart"/>
+            <w:r>
+              <w:rPr>
+                <w:rFonts w:ascii="Arial" w:hAnsi="Arial" w:cs="Arial"/>
+                <w:sz w:val="24"/>
+                <w:szCs w:val="24"/>
+              </w:rPr>
+              <w:t xml:space="preserve">Ketua</w:t>
+            </w:r>
+            <w:proofErr w:type="spellEnd"/>
+            <w:r>
+              <w:rPr>
+                <w:rFonts w:ascii="Arial" w:hAnsi="Arial" w:cs="Arial"/>
+                <w:sz w:val="24"/>
+                <w:szCs w:val="24"/>
+              </w:rPr>
+              <w:t xml:space="preserve"/>
+            </w:r>
+          </w:p>
+        </w:tc>
+      </w:tr>
+      <w:tr>
+        <w:tblPrEx>
+          <w:tblCellMar>
+            <w:top w:w="0" w:type="dxa"/>
+            <w:bottom w:w="0" w:type="dxa"/>
+          </w:tblCellMar>
+        </w:tblPrEx>
+        <w:tc>
+          <w:tcPr>
+            <w:tcW w:w="620" w:type="dxa"/>
+            <w:tcMar>
+              <w:top w:w="80" w:type="dxa"/>
+              <w:left w:w="100" w:type="dxa"/>
+              <w:bottom w:w="80" w:type="dxa"/>
+              <w:right w:w="100" w:type="dxa"/>
+            </w:tcMar>
+          </w:tcPr>
+          <w:p>
+            <w:pPr>
+              <w:spacing w:after="0" w:line="240" w:lineRule="auto"/>
+              <w:rPr>
+                <w:rFonts w:ascii="Arial" w:hAnsi="Arial" w:cs="Arial"/>
+                <w:sz w:val="24"/>
+                <w:szCs w:val="24"/>
+              </w:rPr>
+            </w:pPr>
+            <w:proofErr w:type="spellStart"/>
+            <w:r>
+              <w:rPr>
+                <w:rFonts w:ascii="Arial" w:hAnsi="Arial" w:cs="Arial"/>
+                <w:sz w:val="24"/>
+                <w:szCs w:val="24"/>
+              </w:rPr>
+              <w:t xml:space="preserve">2</w:t>
+            </w:r>
+            <w:proofErr w:type="spellEnd"/>
+          </w:p>
+        </w:tc>
+        <w:tc>
+          <w:tcPr>
+            <w:tcW w:w="3484" w:type="dxa"/>
+            <w:tcMar>
+              <w:top w:w="80" w:type="dxa"/>
+              <w:left w:w="100" w:type="dxa"/>
+              <w:bottom w:w="80" w:type="dxa"/>
+              <w:right w:w="100" w:type="dxa"/>
+            </w:tcMar>
+          </w:tcPr>
+          <w:p>
+            <w:pPr>
+              <w:spacing w:after="0" w:line="240" w:lineRule="auto"/>
+              <w:rPr>
+                <w:rFonts w:ascii="Arial" w:hAnsi="Arial" w:cs="Arial"/>
+                <w:sz w:val="24"/>
+                <w:szCs w:val="24"/>
+              </w:rPr>
+            </w:pPr>
+            <w:r>
+              <w:rPr>
+                <w:rFonts w:ascii="Arial" w:hAnsi="Arial" w:cs="Arial"/>
+                <w:sz w:val="24"/>
+                <w:szCs w:val="24"/>
+              </w:rPr>
+              <w:t xml:space="preserve">Saifullah, S.H.</w:t>
+            </w:r>
+          </w:p>
+        </w:tc>
+        <w:tc>
+          <w:tcPr>
+            <w:tcW w:w="3748" w:type="dxa"/>
+            <w:tcMar>
+              <w:top w:w="80" w:type="dxa"/>
+              <w:left w:w="100" w:type="dxa"/>
+              <w:bottom w:w="80" w:type="dxa"/>
+              <w:right w:w="100" w:type="dxa"/>
+            </w:tcMar>
+          </w:tcPr>
+          <w:p>
+            <w:pPr>
+              <w:spacing w:after="0" w:line="240" w:lineRule="auto"/>
+              <w:rPr>
+                <w:rFonts w:ascii="Arial" w:hAnsi="Arial" w:cs="Arial"/>
+                <w:sz w:val="24"/>
+                <w:szCs w:val="24"/>
+              </w:rPr>
+            </w:pPr>
+            <w:r>
+              <w:rPr>
+                <w:rFonts w:ascii="Arial" w:hAnsi="Arial" w:cs="Arial"/>
+                <w:sz w:val="24"/>
+                <w:szCs w:val="24"/>
+              </w:rPr>
+              <w:t xml:space="preserve">Kepala Sub Bagian Protokol</w:t>
+            </w:r>
+          </w:p>
+        </w:tc>
+        <w:tc>
+          <w:tcPr>
+            <w:tcW w:w="1508" w:type="dxa"/>
+            <w:tcMar>
+              <w:top w:w="80" w:type="dxa"/>
+              <w:left w:w="100" w:type="dxa"/>
+              <w:bottom w:w="80" w:type="dxa"/>
+              <w:right w:w="100" w:type="dxa"/>
+            </w:tcMar>
+          </w:tcPr>
+          <w:p>
+            <w:pPr>
+              <w:spacing w:after="0" w:line="240" w:lineRule="auto"/>
+              <w:rPr>
+                <w:rFonts w:ascii="Arial" w:hAnsi="Arial" w:cs="Arial"/>
+                <w:sz w:val="24"/>
+                <w:szCs w:val="24"/>
+              </w:rPr>
+            </w:pPr>
+            <w:r>
+              <w:rPr>
+                <w:rFonts w:ascii="Arial" w:hAnsi="Arial" w:cs="Arial"/>
+                <w:sz w:val="24"/>
+                <w:szCs w:val="24"/>
+              </w:rPr>
+              <w:t xml:space="preserve">Anggota</w:t>
+            </w:r>
+            <w:proofErr w:type="spellStart"/>
+            <w:r>
+              <w:rPr>
+                <w:rFonts w:ascii="Arial" w:hAnsi="Arial" w:cs="Arial"/>
+                <w:sz w:val="24"/>
+                <w:szCs w:val="24"/>
+              </w:rPr>
+              <w:t xml:space="preserve"/>
+            </w:r>
+            <w:proofErr w:type="spellEnd"/>
+            <w:r>
+              <w:rPr>
+                <w:rFonts w:ascii="Arial" w:hAnsi="Arial" w:cs="Arial"/>
+                <w:sz w:val="24"/>
+                <w:szCs w:val="24"/>
+              </w:rPr>
+              <w:t xml:space="preserve"/>
+            </w:r>
+          </w:p>
+        </w:tc>
+      </w:tr>
+      <w:tr>
+        <w:tblPrEx>
+          <w:tblCellMar>
+            <w:top w:w="0" w:type="dxa"/>
+            <w:bottom w:w="0" w:type="dxa"/>
+          </w:tblCellMar>
+        </w:tblPrEx>
+        <w:tc>
+          <w:tcPr>
+            <w:tcW w:w="620" w:type="dxa"/>
+            <w:tcMar>
+              <w:top w:w="80" w:type="dxa"/>
+              <w:left w:w="100" w:type="dxa"/>
+              <w:bottom w:w="80" w:type="dxa"/>
+              <w:right w:w="100" w:type="dxa"/>
+            </w:tcMar>
+          </w:tcPr>
+          <w:p>
+            <w:pPr>
+              <w:spacing w:after="0" w:line="240" w:lineRule="auto"/>
+              <w:rPr>
+                <w:rFonts w:ascii="Arial" w:hAnsi="Arial" w:cs="Arial"/>
+                <w:sz w:val="24"/>
+                <w:szCs w:val="24"/>
+              </w:rPr>
+            </w:pPr>
+            <w:proofErr w:type="spellStart"/>
+            <w:r>
+              <w:rPr>
+                <w:rFonts w:ascii="Arial" w:hAnsi="Arial" w:cs="Arial"/>
+                <w:sz w:val="24"/>
+                <w:szCs w:val="24"/>
+              </w:rPr>
+              <w:t xml:space="preserve">3</w:t>
+            </w:r>
+            <w:proofErr w:type="spellEnd"/>
+            <w:r>
+              <w:rPr>
+                <w:rFonts w:ascii="Arial" w:hAnsi="Arial" w:cs="Arial"/>
+                <w:sz w:val="24"/>
+                <w:szCs w:val="24"/>
+              </w:rPr>
+              <w:t xml:space="preserve"/>
+            </w:r>
+          </w:p>
+        </w:tc>
+        <w:tc>
+          <w:tcPr>
+            <w:tcW w:w="3484" w:type="dxa"/>
+            <w:tcMar>
+              <w:top w:w="80" w:type="dxa"/>
+              <w:left w:w="100" w:type="dxa"/>
+              <w:bottom w:w="80" w:type="dxa"/>
+              <w:right w:w="100" w:type="dxa"/>
+            </w:tcMar>
+          </w:tcPr>
+          <w:p>
+            <w:pPr>
+              <w:spacing w:after="0" w:line="240" w:lineRule="auto"/>
+              <w:rPr>
+                <w:rFonts w:ascii="Arial" w:hAnsi="Arial" w:cs="Arial"/>
+                <w:sz w:val="24"/>
+                <w:szCs w:val="24"/>
+              </w:rPr>
+            </w:pPr>
+            <w:r>
+              <w:rPr>
+                <w:rFonts w:ascii="Arial" w:hAnsi="Arial" w:cs="Arial"/>
+                <w:sz w:val="24"/>
+                <w:szCs w:val="24"/>
+              </w:rPr>
+              <w:t xml:space="preserve">Juliyanti, S.AP.</w:t>
+            </w:r>
+          </w:p>
+        </w:tc>
+        <w:tc>
+          <w:tcPr>
+            <w:tcW w:w="3748" w:type="dxa"/>
+            <w:tcMar>
+              <w:top w:w="80" w:type="dxa"/>
+              <w:left w:w="100" w:type="dxa"/>
+              <w:bottom w:w="80" w:type="dxa"/>
+              <w:right w:w="100" w:type="dxa"/>
+            </w:tcMar>
+          </w:tcPr>
+          <w:p>
+            <w:pPr>
+              <w:spacing w:after="0" w:line="240" w:lineRule="auto"/>
+              <w:rPr>
+                <w:rFonts w:ascii="Arial" w:hAnsi="Arial" w:cs="Arial"/>
+                <w:sz w:val="24"/>
+                <w:szCs w:val="24"/>
+              </w:rPr>
+            </w:pPr>
+            <w:proofErr w:type="spellStart"/>
+            <w:r>
+              <w:rPr>
+                <w:rFonts w:ascii="Arial" w:hAnsi="Arial" w:cs="Arial"/>
+                <w:sz w:val="24"/>
+                <w:szCs w:val="24"/>
+              </w:rPr>
+              <w:t xml:space="preserve">Kepala Sub Bagian Komunikasi dan Dokumentasi Pimpinan</w:t>
+            </w:r>
+            <w:proofErr w:type="spellEnd"/>
+            <w:r>
+              <w:rPr>
+                <w:rFonts w:ascii="Arial" w:hAnsi="Arial" w:cs="Arial"/>
+                <w:sz w:val="24"/>
+                <w:szCs w:val="24"/>
+              </w:rPr>
+              <w:t xml:space="preserve"/>
+            </w:r>
+          </w:p>
+        </w:tc>
+        <w:tc>
+          <w:tcPr>
+            <w:tcW w:w="1508" w:type="dxa"/>
+            <w:tcMar>
+              <w:top w:w="80" w:type="dxa"/>
+              <w:left w:w="100" w:type="dxa"/>
+              <w:bottom w:w="80" w:type="dxa"/>
+              <w:right w:w="100" w:type="dxa"/>
+            </w:tcMar>
+          </w:tcPr>
+          <w:p>
+            <w:pPr>
+              <w:spacing w:after="0" w:line="240" w:lineRule="auto"/>
+              <w:rPr>
+                <w:rFonts w:ascii="Arial" w:hAnsi="Arial" w:cs="Arial"/>
+                <w:sz w:val="24"/>
+                <w:szCs w:val="24"/>
+              </w:rPr>
+            </w:pPr>
+            <w:r>
+              <w:rPr>
+                <w:rFonts w:ascii="Arial" w:hAnsi="Arial" w:cs="Arial"/>
+                <w:sz w:val="24"/>
+                <w:szCs w:val="24"/>
+              </w:rPr>
+              <w:t xml:space="preserve">Anggota</w:t>
+            </w:r>
+            <w:proofErr w:type="spellStart"/>
+            <w:r>
+              <w:rPr>
+                <w:rFonts w:ascii="Arial" w:hAnsi="Arial" w:cs="Arial"/>
+                <w:sz w:val="24"/>
+                <w:szCs w:val="24"/>
+              </w:rPr>
+              <w:t xml:space="preserve"/>
+            </w:r>
+            <w:proofErr w:type="spellEnd"/>
+            <w:r>
+              <w:rPr>
+                <w:rFonts w:ascii="Arial" w:hAnsi="Arial" w:cs="Arial"/>
+                <w:sz w:val="24"/>
+                <w:szCs w:val="24"/>
+              </w:rPr>
+              <w:t xml:space="preserve"/>
+            </w:r>
+          </w:p>
+        </w:tc>
+      </w:tr>
+      <w:tr>
+        <w:tblPrEx>
+          <w:tblCellMar>
+            <w:top w:w="0" w:type="dxa"/>
+            <w:bottom w:w="0" w:type="dxa"/>
+          </w:tblCellMar>
+        </w:tblPrEx>
+        <w:tc>
+          <w:tcPr>
+            <w:tcW w:w="620" w:type="dxa"/>
+            <w:tcMar>
+              <w:top w:w="80" w:type="dxa"/>
+              <w:left w:w="100" w:type="dxa"/>
+              <w:bottom w:w="80" w:type="dxa"/>
+              <w:right w:w="100" w:type="dxa"/>
+            </w:tcMar>
+          </w:tcPr>
+          <w:p>
+            <w:pPr>
+              <w:spacing w:after="0" w:line="240" w:lineRule="auto"/>
+              <w:rPr>
+                <w:rFonts w:ascii="Arial" w:hAnsi="Arial" w:cs="Arial"/>
+                <w:sz w:val="24"/>
+                <w:szCs w:val="24"/>
+              </w:rPr>
+            </w:pPr>
+            <w:r>
+              <w:rPr>
+                <w:rFonts w:ascii="Arial" w:hAnsi="Arial" w:cs="Arial"/>
+                <w:sz w:val="24"/>
+                <w:szCs w:val="24"/>
+              </w:rPr>
+              <w:t xml:space="preserve">4</w:t>
+            </w:r>
+          </w:p>
+        </w:tc>
+        <w:tc>
+          <w:tcPr>
+            <w:tcW w:w="3484" w:type="dxa"/>
+            <w:tcMar>
+              <w:top w:w="80" w:type="dxa"/>
+              <w:left w:w="100" w:type="dxa"/>
+              <w:bottom w:w="80" w:type="dxa"/>
+              <w:right w:w="100" w:type="dxa"/>
+            </w:tcMar>
+          </w:tcPr>
+          <w:p>
+            <w:pPr>
+              <w:spacing w:after="0" w:line="240" w:lineRule="auto"/>
+              <w:rPr>
+                <w:rFonts w:ascii="Arial" w:hAnsi="Arial" w:cs="Arial"/>
+                <w:sz w:val="24"/>
+                <w:szCs w:val="24"/>
+              </w:rPr>
+            </w:pPr>
+            <w:r>
+              <w:rPr>
+                <w:rFonts w:ascii="Arial" w:hAnsi="Arial" w:cs="Arial"/>
+                <w:sz w:val="24"/>
+                <w:szCs w:val="24"/>
+              </w:rPr>
+              <w:t xml:space="preserve">Pebriadi Banne, S.IP.</w:t>
+            </w:r>
+          </w:p>
+        </w:tc>
+        <w:tc>
+          <w:tcPr>
+            <w:tcW w:w="3748" w:type="dxa"/>
+            <w:tcMar>
+              <w:top w:w="80" w:type="dxa"/>
+              <w:left w:w="100" w:type="dxa"/>
+              <w:bottom w:w="80" w:type="dxa"/>
+              <w:right w:w="100" w:type="dxa"/>
+            </w:tcMar>
+          </w:tcPr>
+          <w:p>
+            <w:pPr>
+              <w:spacing w:after="0" w:line="240" w:lineRule="auto"/>
+              <w:rPr>
+                <w:rFonts w:ascii="Arial" w:hAnsi="Arial" w:cs="Arial"/>
+                <w:sz w:val="24"/>
+                <w:szCs w:val="24"/>
+              </w:rPr>
+            </w:pPr>
+            <w:r>
+              <w:rPr>
+                <w:rFonts w:ascii="Arial" w:hAnsi="Arial" w:cs="Arial"/>
+                <w:sz w:val="24"/>
+                <w:szCs w:val="24"/>
+              </w:rPr>
+              <w:t xml:space="preserve">Pengelola Layanan Operasional</w:t>
+            </w:r>
+            <w:proofErr w:type="spellStart"/>
+            <w:r>
+              <w:rPr>
+                <w:rFonts w:ascii="Arial" w:hAnsi="Arial" w:cs="Arial"/>
+                <w:sz w:val="24"/>
+                <w:szCs w:val="24"/>
+              </w:rPr>
+              <w:t xml:space="preserve"/>
+            </w:r>
+            <w:proofErr w:type="spellEnd"/>
+            <w:r>
+              <w:rPr>
+                <w:rFonts w:ascii="Arial" w:hAnsi="Arial" w:cs="Arial"/>
+                <w:sz w:val="24"/>
+                <w:szCs w:val="24"/>
+              </w:rPr>
+              <w:t xml:space="preserve"/>
+            </w:r>
+            <w:proofErr w:type="spellStart"/>
+            <w:r>
+              <w:rPr>
+                <w:rFonts w:ascii="Arial" w:hAnsi="Arial" w:cs="Arial"/>
+                <w:sz w:val="24"/>
+                <w:szCs w:val="24"/>
+              </w:rPr>
+              <w:t xml:space="preserve"/>
+            </w:r>
+            <w:proofErr w:type="spellEnd"/>
+          </w:p>
+        </w:tc>
+        <w:tc>
+          <w:tcPr>
+            <w:tcW w:w="1508" w:type="dxa"/>
+            <w:tcMar>
+              <w:top w:w="80" w:type="dxa"/>
+              <w:left w:w="100" w:type="dxa"/>
+              <w:bottom w:w="80" w:type="dxa"/>
+              <w:right w:w="100" w:type="dxa"/>
+            </w:tcMar>
+          </w:tcPr>
+          <w:p>
+            <w:pPr>
+              <w:spacing w:after="0" w:line="240" w:lineRule="auto"/>
+              <w:rPr>
+                <w:rFonts w:ascii="Arial" w:hAnsi="Arial" w:cs="Arial"/>
+                <w:sz w:val="24"/>
+                <w:szCs w:val="24"/>
+              </w:rPr>
+            </w:pPr>
+            <w:r>
+              <w:rPr>
+                <w:rFonts w:ascii="Arial" w:hAnsi="Arial" w:cs="Arial"/>
+                <w:sz w:val="24"/>
+                <w:szCs w:val="24"/>
+              </w:rPr>
+              <w:t xml:space="preserve">Anggota</w:t>
+            </w:r>
+          </w:p>
+        </w:tc>
+      </w:tr>
+      <w:tr>
+        <w:tblPrEx>
+          <w:tblCellMar>
+            <w:top w:w="0" w:type="dxa"/>
+            <w:bottom w:w="0" w:type="dxa"/>
+          </w:tblCellMar>
+        </w:tblPrEx>
+        <w:tc>
+          <w:tcPr>
+            <w:tcW w:w="620" w:type="dxa"/>
+            <w:tcMar>
+              <w:top w:w="80" w:type="dxa"/>
+              <w:left w:w="100" w:type="dxa"/>
+              <w:bottom w:w="80" w:type="dxa"/>
+              <w:right w:w="100" w:type="dxa"/>
+            </w:tcMar>
+          </w:tcPr>
+          <w:p>
+            <w:pPr>
+              <w:spacing w:after="0" w:line="240" w:lineRule="auto"/>
+              <w:rPr>
+                <w:rFonts w:ascii="Arial" w:hAnsi="Arial" w:cs="Arial"/>
+                <w:sz w:val="24"/>
+                <w:szCs w:val="24"/>
+              </w:rPr>
+            </w:pPr>
+            <w:r>
+              <w:rPr>
+                <w:rFonts w:ascii="Arial" w:hAnsi="Arial" w:cs="Arial"/>
+                <w:sz w:val="24"/>
+                <w:szCs w:val="24"/>
+              </w:rPr>
+              <w:t xml:space="preserve">5</w:t>
+            </w:r>
+          </w:p>
+        </w:tc>
+        <w:tc>
+          <w:tcPr>
+            <w:tcW w:w="3484" w:type="dxa"/>
+            <w:tcMar>
+              <w:top w:w="80" w:type="dxa"/>
+              <w:left w:w="100" w:type="dxa"/>
+              <w:bottom w:w="80" w:type="dxa"/>
+              <w:right w:w="100" w:type="dxa"/>
+            </w:tcMar>
+          </w:tcPr>
+          <w:p>
+            <w:pPr>
+              <w:spacing w:after="0" w:line="240" w:lineRule="auto"/>
+              <w:rPr>
+                <w:rFonts w:ascii="Arial" w:hAnsi="Arial" w:cs="Arial"/>
+                <w:sz w:val="24"/>
+                <w:szCs w:val="24"/>
+              </w:rPr>
+            </w:pPr>
+            <w:r>
+              <w:rPr>
+                <w:rFonts w:ascii="Arial" w:hAnsi="Arial" w:cs="Arial"/>
+                <w:sz w:val="24"/>
+                <w:szCs w:val="24"/>
+              </w:rPr>
+              <w:t xml:space="preserve">Nuraini Wiliadewi, S.IP.</w:t>
+            </w:r>
+          </w:p>
+        </w:tc>
+        <w:tc>
+          <w:tcPr>
+            <w:tcW w:w="3748" w:type="dxa"/>
+            <w:tcMar>
+              <w:top w:w="80" w:type="dxa"/>
+              <w:left w:w="100" w:type="dxa"/>
+              <w:bottom w:w="80" w:type="dxa"/>
+              <w:right w:w="100" w:type="dxa"/>
+            </w:tcMar>
+          </w:tcPr>
+          <w:p>
+            <w:pPr>
+              <w:spacing w:after="0" w:line="240" w:lineRule="auto"/>
+              <w:rPr>
+                <w:rFonts w:ascii="Arial" w:hAnsi="Arial" w:cs="Arial"/>
+                <w:sz w:val="24"/>
+                <w:szCs w:val="24"/>
+              </w:rPr>
+            </w:pPr>
+            <w:r>
+              <w:rPr>
+                <w:rFonts w:ascii="Arial" w:hAnsi="Arial" w:cs="Arial"/>
+                <w:sz w:val="24"/>
+                <w:szCs w:val="24"/>
+              </w:rPr>
+              <w:t xml:space="preserve">Penelaah Teknis Kebijakan</w:t>
+            </w:r>
+            <w:proofErr w:type="spellStart"/>
+            <w:r>
+              <w:rPr>
+                <w:rFonts w:ascii="Arial" w:hAnsi="Arial" w:cs="Arial"/>
+                <w:sz w:val="24"/>
+                <w:szCs w:val="24"/>
+              </w:rPr>
+              <w:t xml:space="preserve"/>
+            </w:r>
+            <w:proofErr w:type="spellEnd"/>
+          </w:p>
+        </w:tc>
+        <w:tc>
+          <w:tcPr>
+            <w:tcW w:w="1508" w:type="dxa"/>
+            <w:tcMar>
+              <w:top w:w="80" w:type="dxa"/>
+              <w:left w:w="100" w:type="dxa"/>
+              <w:bottom w:w="80" w:type="dxa"/>
+              <w:right w:w="100" w:type="dxa"/>
+            </w:tcMar>
+          </w:tcPr>
+          <w:p>
+            <w:pPr>
+              <w:spacing w:after="0" w:line="240" w:lineRule="auto"/>
+              <w:rPr>
+                <w:rFonts w:ascii="Arial" w:hAnsi="Arial" w:cs="Arial"/>
+                <w:sz w:val="24"/>
+                <w:szCs w:val="24"/>
+              </w:rPr>
+            </w:pPr>
+            <w:r>
+              <w:rPr>
+                <w:rFonts w:ascii="Arial" w:hAnsi="Arial" w:cs="Arial"/>
+                <w:sz w:val="24"/>
+                <w:szCs w:val="24"/>
+              </w:rPr>
+              <w:t xml:space="preserve">Anggota</w:t>
+            </w:r>
+          </w:p>
+        </w:tc>
+      </w:tr>
+    </w:tbl>
+    <w:p>
+      <w:pPr>
+        <w:spacing w:after="0" w:line="240" w:lineRule="auto"/>
+        <w:rPr>
+          <w:rFonts w:ascii="Arial" w:hAnsi="Arial" w:cs="Arial"/>
+          <w:sz w:val="24"/>
+          <w:szCs w:val="24"/>
+        </w:rPr>
+      </w:pPr>
+    </w:p>
+    <w:p>
+      <w:pPr>
+        <w:pStyle w:val="Judul1"/>
+        <w:spacing w:after="0" w:line="240" w:lineRule="auto"/>
+        <w:rPr>
+          <w:rFonts w:ascii="Arial" w:hAnsi="Arial" w:cs="Arial"/>
+          <w:b/>
+          <w:bCs/>
+          <w:color w:val="auto"/>
+          <w:sz w:val="24"/>
+          <w:szCs w:val="24"/>
+          <w:u w:val="single"/>
+        </w:rPr>
+      </w:pPr>
+      <w:r>
+        <w:rPr>
+          <w:rFonts w:ascii="Arial" w:hAnsi="Arial" w:cs="Arial"/>
+          <w:b/>
+          <w:bCs/>
+          <w:color w:val="auto"/>
+          <w:sz w:val="24"/>
+          <w:szCs w:val="24"/>
+          <w:u w:val="single"/>
+        </w:rPr>
+        <w:t xml:space="preserve">KONTAK KETUA TIM</w:t>
+      </w:r>
+    </w:p>
+    <w:p>
+      <w:pPr>
+        <w:spacing w:after="0" w:line="240" w:lineRule="auto"/>
+        <w:rPr>
+          <w:rFonts w:ascii="Arial" w:hAnsi="Arial" w:cs="Arial"/>
+          <w:sz w:val="24"/>
+          <w:szCs w:val="24"/>
+        </w:rPr>
+      </w:pPr>
+      <w:r>
+        <w:rPr>
+          <w:rFonts w:ascii="Arial" w:hAnsi="Arial" w:cs="Arial"/>
+          <w:sz w:val="24"/>
+          <w:szCs w:val="24"/>
+        </w:rPr>
+        <w:t xml:space="preserve">Nama: Anugrah Yega Pranatha, M.Si.</w:t>
+      </w:r>
+      <w:r>
+        <w:rPr>
+          <w:rFonts w:ascii="Arial" w:hAnsi="Arial" w:cs="Arial"/>
+          <w:sz w:val="24"/>
+          <w:szCs w:val="24"/>
+        </w:rPr>
+        <w:br/>
+        <w:t xml:space="preserve">Jabatan: Kepala Bagian Protokol dan Komunikasi Pimpinan</w:t>
+      </w:r>
+    </w:p>
+    <w:p>
+      <w:pPr>
+        <w:spacing w:after="0" w:line="240" w:lineRule="auto"/>
+        <w:rPr>
+          <w:rFonts w:ascii="Arial" w:hAnsi="Arial" w:cs="Arial"/>
+          <w:sz w:val="24"/>
+          <w:szCs w:val="24"/>
+        </w:rPr>
+      </w:pPr>
+      <w:r>
+        <w:rPr>
+          <w:rFonts w:ascii="Arial" w:hAnsi="Arial" w:cs="Arial"/>
+          <w:sz w:val="24"/>
+          <w:szCs w:val="24"/>
+        </w:rPr>
+        <w:t>Email: yega@tarakankota.go.id/anugrahyegapranatha@gmail.com</w:t>
+      </w:r>
+    </w:p>
+    <w:p>
+      <w:pPr>
+        <w:spacing w:after="0" w:line="240" w:lineRule="auto"/>
+        <w:rPr>
+          <w:rFonts w:ascii="Arial" w:hAnsi="Arial" w:cs="Arial"/>
+          <w:sz w:val="24"/>
+          <w:szCs w:val="24"/>
+        </w:rPr>
+      </w:pPr>
+      <w:proofErr w:type="spellStart"/>
+      <w:r>
+        <w:rPr>
+          <w:rFonts w:ascii="Arial" w:hAnsi="Arial" w:cs="Arial"/>
+          <w:sz w:val="24"/>
+          <w:szCs w:val="24"/>
+        </w:rPr>
+        <w:t xml:space="preserve">WhatsApp</w:t>
+      </w:r>
+      <w:proofErr w:type="spellEnd"/>
+      <w:r>
+        <w:rPr>
+          <w:rFonts w:ascii="Arial" w:hAnsi="Arial" w:cs="Arial"/>
+          <w:sz w:val="24"/>
+          <w:szCs w:val="24"/>
+        </w:rPr>
+        <w:t xml:space="preserve">: 0811-5900-394</w:t>
+      </w:r>
+    </w:p>
+    <w:p>
+      <w:pPr>
+        <w:spacing w:after="0" w:line="240" w:lineRule="auto"/>
+        <w:rPr>
+          <w:rFonts w:ascii="Arial" w:eastAsia="Calibri" w:hAnsi="Arial" w:cs="Arial"/>
+          <w:kern w:val="0"/>
+          <w:sz w:val="24"/>
+          <w:szCs w:val="24"/>
+          <w14:ligatures w14:val="none"/>
+        </w:rPr>
+      </w:pPr>
+    </w:p>
+    <w:p>
+      <w:pPr>
+        <w:spacing w:line="276" w:lineRule="auto"/>
+        <w:ind w:left="5670"/>
+        <w:jc w:val="both"/>
+        <w:rPr>
+          <w:rFonts w:ascii="Arial" w:eastAsia="Calibri" w:hAnsi="Arial" w:cs="Arial"/>
+          <w:b/>
+          <w:bCs/>
+          <w:sz w:val="24"/>
+          <w:szCs w:val="24"/>
+        </w:rPr>
+      </w:pPr>
+      <w:r>
+        <w:rPr>
+          <w:rFonts w:ascii="Arial" w:eastAsia="Calibri" w:hAnsi="Arial" w:cs="Arial"/>
+          <w:b/>
+          <w:bCs/>
+          <w:sz w:val="24"/>
+          <w:szCs w:val="24"/>
+        </w:rPr>
+        <w:t>${</w:t>
+      </w:r>
+      <w:proofErr w:type="spellStart"/>
+      <w:r>
+        <w:rPr>
+          <w:rFonts w:ascii="Arial" w:eastAsia="Calibri" w:hAnsi="Arial" w:cs="Arial"/>
+          <w:b/>
+          <w:bCs/>
+          <w:sz w:val="24"/>
+          <w:szCs w:val="24"/>
+        </w:rPr>
+        <w:t>jabatan_pengirim</w:t>
+      </w:r>
+      <w:proofErr w:type="spellEnd"/>
+      <w:r>
+        <w:rPr>
+          <w:rFonts w:ascii="Arial" w:eastAsia="Calibri" w:hAnsi="Arial" w:cs="Arial"/>
+          <w:b/>
+          <w:bCs/>
+          <w:sz w:val="24"/>
+          <w:szCs w:val="24"/>
+        </w:rPr>
+        <w:t>}</w:t>
+      </w:r>
+    </w:p>
+    <w:p>
+      <w:pPr>
+        <w:spacing w:line="276" w:lineRule="auto"/>
+        <w:ind w:left="5670"/>
+        <w:jc w:val="both"/>
+        <w:rPr>
+          <w:rFonts w:ascii="Arial" w:eastAsia="Calibri" w:hAnsi="Arial" w:cs="Arial"/>
+          <w:b/>
+          <w:bCs/>
+          <w:sz w:val="24"/>
+          <w:szCs w:val="24"/>
+        </w:rPr>
+      </w:pPr>
+    </w:p>
+    <w:p>
+      <w:pPr>
+        <w:spacing w:line="276" w:lineRule="auto"/>
+        <w:ind w:left="5670"/>
+        <w:jc w:val="both"/>
+        <w:rPr>
+          <w:rFonts w:ascii="Arial" w:eastAsia="Calibri" w:hAnsi="Arial" w:cs="Arial"/>
+          <w:b/>
+          <w:bCs/>
+          <w:sz w:val="24"/>
+          <w:szCs w:val="24"/>
+        </w:rPr>
+      </w:pPr>
+      <w:r>
+        <w:rPr>
+          <w:rFonts w:ascii="Arial" w:hAnsi="Arial" w:cs="Arial"/>
+          <w:color w:val="374151"/>
+          <w:spacing w:val="2"/>
+          <w:sz w:val="24"/>
+          <w:szCs w:val="24"/>
+          <w:shd w:val="clear" w:color="auto" w:fill="FFFFFF"/>
+        </w:rPr>
+        <w:t>${</w:t>
+      </w:r>
+      <w:proofErr w:type="spellStart"/>
+      <w:r>
+        <w:rPr>
+          <w:rFonts w:ascii="Arial" w:hAnsi="Arial" w:cs="Arial"/>
+          <w:color w:val="374151"/>
+          <w:spacing w:val="2"/>
+          <w:sz w:val="24"/>
+          <w:szCs w:val="24"/>
+          <w:shd w:val="clear" w:color="auto" w:fill="FFFFFF"/>
+        </w:rPr>
+        <w:t>ttd_pengirim</w:t>
+      </w:r>
+      <w:proofErr w:type="spellEnd"/>
+      <w:r>
+        <w:rPr>
+          <w:rFonts w:ascii="Arial" w:hAnsi="Arial" w:cs="Arial"/>
+          <w:color w:val="374151"/>
+          <w:spacing w:val="2"/>
+          <w:sz w:val="24"/>
+          <w:szCs w:val="24"/>
+          <w:shd w:val="clear" w:color="auto" w:fill="FFFFFF"/>
+        </w:rPr>
+        <w:t>}</w:t>
+      </w:r>
+    </w:p>
+    <w:p>
+      <w:pPr>
+        <w:spacing w:line="276" w:lineRule="auto"/>
+        <w:ind w:left="5670"/>
+        <w:jc w:val="both"/>
+        <w:rPr>
+          <w:rFonts w:ascii="Arial" w:eastAsia="Calibri" w:hAnsi="Arial" w:cs="Arial"/>
+          <w:b/>
+          <w:bCs/>
+          <w:sz w:val="24"/>
+          <w:szCs w:val="24"/>
+        </w:rPr>
+      </w:pPr>
+    </w:p>
+    <w:p>
+      <w:pPr>
+        <w:spacing w:after="0" w:line="240" w:lineRule="auto"/>
+        <w:ind w:left="5670"/>
+        <w:jc w:val="both"/>
+        <w:rPr>
+          <w:rFonts w:ascii="Arial" w:eastAsia="Calibri" w:hAnsi="Arial" w:cs="Arial"/>
+          <w:b/>
+          <w:bCs/>
+          <w:sz w:val="24"/>
+          <w:szCs w:val="24"/>
+        </w:rPr>
+      </w:pPr>
+      <w:r>
+        <w:rPr>
+          <w:rFonts w:ascii="Arial" w:eastAsia="Calibri" w:hAnsi="Arial" w:cs="Arial"/>
+          <w:b/>
+          <w:bCs/>
+          <w:sz w:val="24"/>
+          <w:szCs w:val="24"/>
+        </w:rPr>
+        <w:t>${</w:t>
+      </w:r>
+      <w:proofErr w:type="spellStart"/>
+      <w:r>
+        <w:rPr>
+          <w:rFonts w:ascii="Arial" w:eastAsia="Calibri" w:hAnsi="Arial" w:cs="Arial"/>
+          <w:b/>
+          <w:bCs/>
+          <w:sz w:val="24"/>
+          <w:szCs w:val="24"/>
+        </w:rPr>
+        <w:t>nama_pengirim</w:t>
+      </w:r>
+      <w:proofErr w:type="spellEnd"/>
+      <w:r>
+        <w:rPr>
+          <w:rFonts w:ascii="Arial" w:eastAsia="Calibri" w:hAnsi="Arial" w:cs="Arial"/>
+          <w:b/>
+          <w:bCs/>
+          <w:sz w:val="24"/>
+          <w:szCs w:val="24"/>
+        </w:rPr>
+        <w:t>}</w:t>
+      </w:r>
+    </w:p>
+    <w:p>
+      <w:pPr>
+        <w:spacing w:after="0" w:line="240" w:lineRule="auto"/>
+        <w:ind w:left="5670"/>
+        <w:jc w:val="both"/>
+        <w:rPr>
+          <w:rFonts w:ascii="Arial" w:eastAsia="Calibri" w:hAnsi="Arial" w:cs="Arial"/>
+          <w:b/>
+          <w:bCs/>
+          <w:sz w:val="24"/>
+          <w:szCs w:val="24"/>
+        </w:rPr>
+      </w:pPr>
+      <w:r>
+        <w:rPr>
+          <w:rFonts w:ascii="Arial" w:eastAsia="Calibri" w:hAnsi="Arial" w:cs="Arial"/>
+          <w:b/>
+          <w:bCs/>
+          <w:sz w:val="24"/>
+          <w:szCs w:val="24"/>
+        </w:rPr>
+        <w:t>${</w:t>
+      </w:r>
+      <w:proofErr w:type="spellStart"/>
+      <w:r>
+        <w:rPr>
+          <w:rFonts w:ascii="Arial" w:eastAsia="Calibri" w:hAnsi="Arial" w:cs="Arial"/>
+          <w:b/>
+          <w:bCs/>
+          <w:sz w:val="24"/>
+          <w:szCs w:val="24"/>
+        </w:rPr>
+        <w:t>pangkat</w:t>
+      </w:r>
+      <w:r>
+        <w:rPr>
+          <w:rFonts w:ascii="Arial" w:eastAsia="Calibri" w:hAnsi="Arial" w:cs="Arial"/>
+          <w:b/>
+          <w:bCs/>
+          <w:sz w:val="24"/>
+          <w:szCs w:val="24"/>
+        </w:rPr>
+        <w:t>_pengirim</w:t>
+      </w:r>
+      <w:proofErr w:type="spellEnd"/>
+      <w:r>
+        <w:rPr>
+          <w:rFonts w:ascii="Arial" w:eastAsia="Calibri" w:hAnsi="Arial" w:cs="Arial"/>
+          <w:b/>
+          <w:bCs/>
+          <w:sz w:val="24"/>
+          <w:szCs w:val="24"/>
+        </w:rPr>
+        <w:t>}</w:t>
+      </w:r>
+    </w:p>
+    <w:p>
+      <w:pPr>
+        <w:spacing w:after="0" w:line="240" w:lineRule="auto"/>
+        <w:ind w:left="5670"/>
+        <w:jc w:val="both"/>
+        <w:rPr>
+          <w:rFonts w:ascii="Arial" w:eastAsia="Calibri" w:hAnsi="Arial" w:cs="Arial"/>
+          <w:b/>
+          <w:bCs/>
+          <w:sz w:val="24"/>
+          <w:szCs w:val="24"/>
+        </w:rPr>
+      </w:pPr>
+      <w:r>
+        <w:rPr>
+          <w:rFonts w:ascii="Arial" w:eastAsia="Calibri" w:hAnsi="Arial" w:cs="Arial"/>
           <w:sz w:val="24"/>
           <w:szCs w:val="24"/>
         </w:rPr>

</xml_diff>

<commit_message>
Surat usulan Tarakan: susunan dari templat Kabag, isi satu halaman sesuai pedoman kota
Templat baru docs/lomba/lampiran/Templat-Surat-Usulan-Tarakan.docx adalah
surat yang dirapikan Kabag di Word (kop, letak logo, susunan kepala surat,
tanda tangan, tembusan). Isinya kini satu halaman seperti Lampiran 3
Petunjuk Teknis Kota Tarakan: Lampiran "-", kalimat pembuka pedoman,
Inovasi / Nama Inovator / Lama Implementasi Inovasi / Kategori di badan
surat, dan kalimat penutup pedoman; halaman lampiran dibuang. Spasi isi 1,15
dan jarak antarbagian dirapatkan supaya muat dengan cadangan ruang; ruang QR
TTE tidak diubah.

Co-Authored-By: Claude Opus 5.5 <noreply@anthropic.com>
Claude-Session: https://claude.ai/code/session_01TchDZWsQsgeuq52sKmozd1
</commit_message>
<xml_diff>
--- a/docs/lomba/tarakan/Surat-Usulan-Sekda-Lomba-Inovasi-Tarakan.docx
+++ b/docs/lomba/tarakan/Surat-Usulan-Sekda-Lomba-Inovasi-Tarakan.docx
@@ -1,11 +1,11 @@
 
 <file path=word/document.xml><?xml version="1.0" encoding="utf-8"?>
-<w:document xmlns:wpc="http://schemas.microsoft.com/office/word/2010/wordprocessingCanvas" xmlns:cx="http://schemas.microsoft.com/office/drawing/2014/chartex" xmlns:cx1="http://schemas.microsoft.com/office/drawing/2015/9/8/chartex" xmlns:cx2="http://schemas.microsoft.com/office/drawing/2015/10/21/chartex" xmlns:cx3="http://schemas.microsoft.com/office/drawing/2016/5/9/chartex" xmlns:cx4="http://schemas.microsoft.com/office/drawing/2016/5/10/chartex" xmlns:cx5="http://schemas.microsoft.com/office/drawing/2016/5/11/chartex" xmlns:cx6="http://schemas.microsoft.com/office/drawing/2016/5/12/chartex" xmlns:cx7="http://schemas.microsoft.com/office/drawing/2016/5/13/chartex" xmlns:cx8="http://schemas.microsoft.com/office/drawing/2016/5/14/chartex" xmlns:mc="http://schemas.openxmlformats.org/markup-compatibility/2006" xmlns:aink="http://schemas.microsoft.com/office/drawing/2016/ink" xmlns:am3d="http://schemas.microsoft.com/office/drawing/2017/model3d" xmlns:o="urn:schemas-microsoft-com:office:office" xmlns:oel="http://schemas.microsoft.com/office/2019/extlst" xmlns:r="http://schemas.openxmlformats.org/officeDocument/2006/relationships" xmlns:m="http://schemas.openxmlformats.org/officeDocument/2006/math" xmlns:v="urn:schemas-microsoft-com:vml" xmlns:wp14="http://schemas.microsoft.com/office/word/2010/wordprocessingDrawing" xmlns:wp="http://schemas.openxmlformats.org/drawingml/2006/wordprocessingDrawing" xmlns:w10="urn:schemas-microsoft-com:office:word" xmlns:w="http://schemas.openxmlformats.org/wordprocessingml/2006/main" xmlns:w14="http://schemas.microsoft.com/office/word/2010/wordml" xmlns:w15="http://schemas.microsoft.com/office/word/2012/wordml" xmlns:w16cex="http://schemas.microsoft.com/office/word/2018/wordml/cex" xmlns:w16cid="http://schemas.microsoft.com/office/word/2016/wordml/cid" xmlns:w16="http://schemas.microsoft.com/office/word/2018/wordml" xmlns:w16du="http://schemas.microsoft.com/office/word/2023/wordml/word16du" xmlns:w16sdtdh="http://schemas.microsoft.com/office/word/2020/wordml/sdtdatahash" xmlns:w16sdtfl="http://schemas.microsoft.com/office/word/2024/wordml/sdtformatlock" xmlns:w16se="http://schemas.microsoft.com/office/word/2015/wordml/symex" xmlns:wpg="http://schemas.microsoft.com/office/word/2010/wordprocessingGroup" xmlns:wpi="http://schemas.microsoft.com/office/word/2010/wordprocessingInk" xmlns:wne="http://schemas.microsoft.com/office/word/2006/wordml" xmlns:wps="http://schemas.microsoft.com/office/word/2010/wordprocessingShape" mc:Ignorable="w14 w15 w16se w16cid w16 w16cex w16sdtdh w16sdtfl w16du wp14">
+<w:document xmlns:wpc="http://schemas.microsoft.com/office/word/2010/wordprocessingCanvas" xmlns:cx="http://schemas.microsoft.com/office/drawing/2014/chartex" xmlns:cx1="http://schemas.microsoft.com/office/drawing/2015/9/8/chartex" xmlns:cx2="http://schemas.microsoft.com/office/drawing/2015/10/21/chartex" xmlns:cx3="http://schemas.microsoft.com/office/drawing/2016/5/9/chartex" xmlns:cx4="http://schemas.microsoft.com/office/drawing/2016/5/10/chartex" xmlns:cx5="http://schemas.microsoft.com/office/drawing/2016/5/11/chartex" xmlns:cx6="http://schemas.microsoft.com/office/drawing/2016/5/12/chartex" xmlns:cx7="http://schemas.microsoft.com/office/drawing/2016/5/13/chartex" xmlns:cx8="http://schemas.microsoft.com/office/drawing/2016/5/14/chartex" xmlns:mc="http://schemas.openxmlformats.org/markup-compatibility/2006" xmlns:m="http://schemas.openxmlformats.org/officeDocument/2006/math" xmlns:aink="http://schemas.microsoft.com/office/drawing/2016/ink" xmlns:am3d="http://schemas.microsoft.com/office/drawing/2017/model3d" xmlns:oel="http://schemas.microsoft.com/office/2019/extlst" xmlns:r="http://schemas.openxmlformats.org/officeDocument/2006/relationships" xmlns:wp14="http://schemas.microsoft.com/office/word/2010/wordprocessingDrawing" xmlns:wp="http://schemas.openxmlformats.org/drawingml/2006/wordprocessingDrawing" xmlns:wpg="http://schemas.microsoft.com/office/word/2010/wordprocessingGroup" xmlns:wpi="http://schemas.microsoft.com/office/word/2010/wordprocessingInk" xmlns:wps="http://schemas.microsoft.com/office/word/2010/wordprocessingShape" xmlns:o="urn:schemas-microsoft-com:office:office" xmlns:v="urn:schemas-microsoft-com:vml" xmlns:w10="urn:schemas-microsoft-com:office:word" xmlns:w="http://schemas.openxmlformats.org/wordprocessingml/2006/main" xmlns:w14="http://schemas.microsoft.com/office/word/2010/wordml" xmlns:w15="http://schemas.microsoft.com/office/word/2012/wordml" xmlns:w16cex="http://schemas.microsoft.com/office/word/2018/wordml/cex" xmlns:w16cid="http://schemas.microsoft.com/office/word/2016/wordml/cid" xmlns:w16="http://schemas.microsoft.com/office/word/2018/wordml" xmlns:w16sdtdh="http://schemas.microsoft.com/office/word/2020/wordml/sdtdatahash" xmlns:w16sdtfl="http://schemas.microsoft.com/office/word/2024/wordml/sdtformatlock" xmlns:w16se="http://schemas.microsoft.com/office/word/2015/wordml/symex" xmlns:w16du="http://schemas.microsoft.com/office/word/2023/wordml/word16du" xmlns:wne="http://schemas.microsoft.com/office/word/2006/wordml" mc:Ignorable="w14 w15 w16se w16cid w16 w16cex w16sdtdh w16sdtfl w16du wp14">
   <w:body>
     <w:tbl>
       <w:tblPr>
-        <w:tblW w:w="9640" w:type="dxa"/>
-        <w:tblInd w:w="-142" w:type="dxa"/>
+        <w:tblW w:w="10632" w:type="dxa"/>
+        <w:tblInd w:w="-851" w:type="dxa"/>
         <w:tblBorders>
           <w:bottom w:val="thinThickSmallGap" w:sz="24" w:space="0" w:color="auto"/>
         </w:tblBorders>
@@ -14,7 +14,7 @@
       </w:tblPr>
       <w:tblGrid>
         <w:gridCol w:w="426"/>
-        <w:gridCol w:w="9214"/>
+        <w:gridCol w:w="10206"/>
       </w:tblGrid>
       <w:tr>
         <w:trPr>
@@ -41,7 +41,6 @@
                 <w14:ligatures w14:val="none"/>
               </w:rPr>
             </w:pPr>
-            <w:bookmarkStart w:id="0" w:name="_Hlk204001820"/>
             <w:r>
               <w:rPr>
                 <w:rFonts w:ascii="Arial" w:eastAsia="Times New Roman" w:hAnsi="Arial" w:cs="Arial"/>
@@ -57,11 +56,12 @@
         </w:tc>
         <w:tc>
           <w:tcPr>
-            <w:tcW w:w="9214" w:type="dxa"/>
+            <w:tcW w:w="10206" w:type="dxa"/>
           </w:tcPr>
           <w:p>
             <w:pPr>
               <w:spacing w:before="120" w:after="0" w:line="240" w:lineRule="auto"/>
+              <w:ind w:left="1174"/>
               <w:jc w:val="center"/>
               <w:rPr>
                 <w:rFonts w:ascii="Arial" w:eastAsia="Times New Roman" w:hAnsi="Arial" w:cs="Arial"/>
@@ -90,6 +90,7 @@
             <w:pPr>
               <w:keepNext/>
               <w:spacing w:after="0" w:line="240" w:lineRule="auto"/>
+              <w:ind w:left="1174"/>
               <w:jc w:val="center"/>
               <w:outlineLvl w:val="2"/>
               <w:rPr>
@@ -152,6 +153,7 @@
                 <w:tab w:val="right" w:pos="9026"/>
               </w:tabs>
               <w:spacing w:after="0" w:line="276" w:lineRule="auto"/>
+              <w:ind w:left="1174"/>
               <w:jc w:val="center"/>
               <w:rPr>
                 <w:rFonts w:ascii="Arial" w:eastAsia="Calibri" w:hAnsi="Arial" w:cs="Arial"/>
@@ -181,6 +183,7 @@
                 <w:tab w:val="right" w:pos="9026"/>
               </w:tabs>
               <w:spacing w:after="0" w:line="276" w:lineRule="auto"/>
+              <w:ind w:left="1174"/>
               <w:jc w:val="center"/>
               <w:rPr>
                 <w:rFonts w:ascii="Arial" w:eastAsia="Calibri" w:hAnsi="Arial" w:cs="Arial"/>
@@ -210,6 +213,8 @@
                 <w:tab w:val="right" w:pos="9026"/>
               </w:tabs>
               <w:spacing w:after="0" w:line="276" w:lineRule="auto"/>
+              <w:ind w:left="1174"/>
+              <w:jc w:val="center"/>
               <w:rPr>
                 <w:rFonts w:ascii="Arial" w:eastAsia="Calibri" w:hAnsi="Arial" w:cs="Arial"/>
                 <w:noProof/>
@@ -228,7 +233,7 @@
                 <w:szCs w:val="24"/>
                 <w14:ligatures w14:val="none"/>
               </w:rPr>
-              <w:t xml:space="preserve">                 Laman : </w:t>
+              <w:t xml:space="preserve">Laman : </w:t>
             </w:r>
             <w:hyperlink r:id="rId5" w:history="1">
               <w:r>
@@ -242,7 +247,33 @@
                   <w:u w:val="single"/>
                   <w14:ligatures w14:val="none"/>
                 </w:rPr>
-                <w:t>http://www.tarakankota.go.id</w:t>
+                <w:t>http://w</w:t>
+              </w:r>
+              <w:r>
+                <w:rPr>
+                  <w:rFonts w:ascii="Arial" w:eastAsia="Calibri" w:hAnsi="Arial" w:cs="Arial"/>
+                  <w:noProof/>
+                  <w:color w:val="0563C1"/>
+                  <w:kern w:val="0"/>
+                  <w:sz w:val="24"/>
+                  <w:szCs w:val="24"/>
+                  <w:u w:val="single"/>
+                  <w14:ligatures w14:val="none"/>
+                </w:rPr>
+                <w:t>w</w:t>
+              </w:r>
+              <w:r>
+                <w:rPr>
+                  <w:rFonts w:ascii="Arial" w:eastAsia="Calibri" w:hAnsi="Arial" w:cs="Arial"/>
+                  <w:noProof/>
+                  <w:color w:val="0563C1"/>
+                  <w:kern w:val="0"/>
+                  <w:sz w:val="24"/>
+                  <w:szCs w:val="24"/>
+                  <w:u w:val="single"/>
+                  <w14:ligatures w14:val="none"/>
+                </w:rPr>
+                <w:t>w.tarakankota.go.id</w:t>
               </w:r>
             </w:hyperlink>
             <w:r>
@@ -321,13 +352,13 @@
           <w14:ligatures w14:val="none"/>
         </w:rPr>
         <w:drawing>
-          <wp:anchor distT="0" distB="0" distL="114300" distR="114300" simplePos="0" relativeHeight="251659264" behindDoc="1" locked="0" layoutInCell="1" allowOverlap="1" wp14:anchorId="71E719E0" wp14:editId="49D89651">
+          <wp:anchor distT="0" distB="0" distL="114300" distR="114300" simplePos="0" relativeHeight="251659264" behindDoc="1" locked="0" layoutInCell="1" allowOverlap="1" wp14:anchorId="4F644019" wp14:editId="67AAF311">
             <wp:simplePos x="0" y="0"/>
             <wp:positionH relativeFrom="column">
-              <wp:posOffset>94615</wp:posOffset>
+              <wp:posOffset>-63359</wp:posOffset>
             </wp:positionH>
             <wp:positionV relativeFrom="paragraph">
-              <wp:posOffset>-1431925</wp:posOffset>
+              <wp:posOffset>-1341120</wp:posOffset>
             </wp:positionV>
             <wp:extent cx="1009015" cy="1276350"/>
             <wp:effectExtent l="0" t="0" r="0" b="0"/>
@@ -438,37 +469,100 @@
     </w:p>
     <w:p>
       <w:pPr>
-        <w:spacing w:after="0" w:line="360" w:lineRule="auto"/>
-        <w:ind w:left="6480"/>
-        <w:rPr>
-          <w:rFonts w:ascii="Arial" w:eastAsia="Calibri" w:hAnsi="Arial" w:cs="Arial"/>
-          <w:kern w:val="0"/>
-          <w:sz w:val="24"/>
-          <w:szCs w:val="24"/>
-          <w14:ligatures w14:val="none"/>
-        </w:rPr>
-      </w:pPr>
+        <w:spacing w:after="0" w:line="240" w:lineRule="auto"/>
+        <w:rPr>
+          <w:rFonts w:ascii="Arial" w:eastAsia="Calibri" w:hAnsi="Arial" w:cs="Arial"/>
+          <w:kern w:val="0"/>
+          <w:sz w:val="24"/>
+          <w:szCs w:val="24"/>
+          <w14:ligatures w14:val="none"/>
+        </w:rPr>
+      </w:pPr>
+      <w:r>
+        <w:rPr>
+          <w:rFonts w:ascii="Arial" w:eastAsia="Calibri" w:hAnsi="Arial" w:cs="Arial"/>
+          <w:kern w:val="0"/>
+          <w:sz w:val="24"/>
+          <w:szCs w:val="24"/>
+          <w14:ligatures w14:val="none"/>
+        </w:rPr>
+        <w:t xml:space="preserve">  Nomor</w:t>
+      </w:r>
+      <w:r>
+        <w:rPr>
+          <w:rFonts w:ascii="Arial" w:eastAsia="Calibri" w:hAnsi="Arial" w:cs="Arial"/>
+          <w:kern w:val="0"/>
+          <w:sz w:val="24"/>
+          <w:szCs w:val="24"/>
+          <w14:ligatures w14:val="none"/>
+        </w:rPr>
+        <w:tab/>
+        <w:t>:</w:t>
+      </w:r>
+      <w:r>
+        <w:rPr>
+          <w:rFonts w:ascii="Arial" w:eastAsia="Calibri" w:hAnsi="Arial" w:cs="Arial"/>
+          <w:kern w:val="0"/>
+          <w:sz w:val="24"/>
+          <w:szCs w:val="24"/>
+          <w14:ligatures w14:val="none"/>
+        </w:rPr>
+        <w:t xml:space="preserve"> </w:t>
+      </w:r>
+      <w:r>
+        <w:rPr>
+          <w:rFonts w:ascii="Arial" w:eastAsia="Calibri" w:hAnsi="Arial" w:cs="Arial"/>
+          <w:kern w:val="0"/>
+          <w:sz w:val="24"/>
+          <w:szCs w:val="24"/>
+          <w14:ligatures w14:val="none"/>
+        </w:rPr>
+        <w:t>${</w:t>
+      </w:r>
+      <w:proofErr w:type="spellStart"/>
+      <w:r>
+        <w:rPr>
+          <w:rFonts w:ascii="Arial" w:eastAsia="Calibri" w:hAnsi="Arial" w:cs="Arial"/>
+          <w:kern w:val="0"/>
+          <w:sz w:val="24"/>
+          <w:szCs w:val="24"/>
+          <w14:ligatures w14:val="none"/>
+        </w:rPr>
+        <w:t>nomor_naskah</w:t>
+      </w:r>
+      <w:proofErr w:type="spellEnd"/>
+      <w:r>
+        <w:rPr>
+          <w:rFonts w:ascii="Arial" w:eastAsia="Calibri" w:hAnsi="Arial" w:cs="Arial"/>
+          <w:kern w:val="0"/>
+          <w:sz w:val="24"/>
+          <w:szCs w:val="24"/>
+          <w14:ligatures w14:val="none"/>
+        </w:rPr>
+        <w:t>}</w:t>
+      </w:r>
     </w:p>
     <w:p>
       <w:pPr>
         <w:spacing w:after="0" w:line="240" w:lineRule="auto"/>
-        <w:rPr>
-          <w:rFonts w:ascii="Arial" w:eastAsia="Calibri" w:hAnsi="Arial" w:cs="Arial"/>
-          <w:kern w:val="0"/>
-          <w:sz w:val="24"/>
-          <w:szCs w:val="24"/>
-          <w14:ligatures w14:val="none"/>
-        </w:rPr>
-      </w:pPr>
-      <w:r>
-        <w:rPr>
-          <w:rFonts w:ascii="Arial" w:eastAsia="Calibri" w:hAnsi="Arial" w:cs="Arial"/>
-          <w:kern w:val="0"/>
-          <w:sz w:val="24"/>
-          <w:szCs w:val="24"/>
-          <w14:ligatures w14:val="none"/>
-        </w:rPr>
-        <w:t xml:space="preserve">  Nomor</w:t>
+        <w:ind w:firstLine="142"/>
+        <w:rPr>
+          <w:rFonts w:ascii="Arial" w:eastAsia="Calibri" w:hAnsi="Arial" w:cs="Arial"/>
+          <w:kern w:val="0"/>
+          <w:sz w:val="24"/>
+          <w:szCs w:val="24"/>
+          <w14:ligatures w14:val="none"/>
+        </w:rPr>
+      </w:pPr>
+      <w:r>
+        <w:rPr>
+          <w:rFonts w:ascii="Arial" w:eastAsia="Calibri" w:hAnsi="Arial" w:cs="Arial"/>
+          <w:kern w:val="0"/>
+          <w:sz w:val="24"/>
+          <w:szCs w:val="24"/>
+          <w14:ligatures w14:val="none"/>
+        </w:rPr>
+        <w:t>Sifat</w:t>
       </w:r>
       <w:r>
         <w:rPr>
@@ -479,82 +573,49 @@
           <w14:ligatures w14:val="none"/>
         </w:rPr>
         <w:tab/>
-        <w:t>:</w:t>
-      </w:r>
-      <w:r>
-        <w:rPr>
-          <w:rFonts w:ascii="Arial" w:eastAsia="Calibri" w:hAnsi="Arial" w:cs="Arial"/>
-          <w:kern w:val="0"/>
-          <w:sz w:val="24"/>
-          <w:szCs w:val="24"/>
-          <w14:ligatures w14:val="none"/>
-        </w:rPr>
-        <w:t xml:space="preserve"> </w:t>
-      </w:r>
-      <w:r>
-        <w:rPr>
-          <w:rFonts w:ascii="Arial" w:eastAsia="Calibri" w:hAnsi="Arial" w:cs="Arial"/>
-          <w:kern w:val="0"/>
-          <w:sz w:val="24"/>
-          <w:szCs w:val="24"/>
-          <w14:ligatures w14:val="none"/>
-        </w:rPr>
-        <w:t>${</w:t>
-      </w:r>
-      <w:proofErr w:type="spellStart"/>
-      <w:r>
-        <w:rPr>
-          <w:rFonts w:ascii="Arial" w:eastAsia="Calibri" w:hAnsi="Arial" w:cs="Arial"/>
-          <w:kern w:val="0"/>
-          <w:sz w:val="24"/>
-          <w:szCs w:val="24"/>
-          <w14:ligatures w14:val="none"/>
-        </w:rPr>
-        <w:t>nomor_naskah</w:t>
-      </w:r>
-      <w:proofErr w:type="spellEnd"/>
-      <w:r>
-        <w:rPr>
-          <w:rFonts w:ascii="Arial" w:eastAsia="Calibri" w:hAnsi="Arial" w:cs="Arial"/>
-          <w:kern w:val="0"/>
-          <w:sz w:val="24"/>
-          <w:szCs w:val="24"/>
-          <w14:ligatures w14:val="none"/>
-        </w:rPr>
-        <w:t>}</w:t>
+      </w:r>
+      <w:r>
+        <w:rPr>
+          <w:rFonts w:ascii="Arial" w:eastAsia="Calibri" w:hAnsi="Arial" w:cs="Arial"/>
+          <w:kern w:val="0"/>
+          <w:sz w:val="24"/>
+          <w:szCs w:val="24"/>
+          <w14:ligatures w14:val="none"/>
+        </w:rPr>
+        <w:tab/>
+        <w:t xml:space="preserve">: </w:t>
+      </w:r>
+      <w:r>
+        <w:rPr>
+          <w:rFonts w:ascii="Arial" w:eastAsia="Calibri" w:hAnsi="Arial" w:cs="Arial"/>
+          <w:kern w:val="0"/>
+          <w:sz w:val="24"/>
+          <w:szCs w:val="24"/>
+          <w14:ligatures w14:val="none"/>
+        </w:rPr>
+        <w:t>${sifat}</w:t>
       </w:r>
     </w:p>
     <w:p>
       <w:pPr>
         <w:spacing w:after="0" w:line="240" w:lineRule="auto"/>
-        <w:ind w:firstLine="142"/>
-        <w:rPr>
-          <w:rFonts w:ascii="Arial" w:eastAsia="Calibri" w:hAnsi="Arial" w:cs="Arial"/>
-          <w:kern w:val="0"/>
-          <w:sz w:val="24"/>
-          <w:szCs w:val="24"/>
-          <w14:ligatures w14:val="none"/>
-        </w:rPr>
-      </w:pPr>
-      <w:r>
-        <w:rPr>
-          <w:rFonts w:ascii="Arial" w:eastAsia="Calibri" w:hAnsi="Arial" w:cs="Arial"/>
-          <w:kern w:val="0"/>
-          <w:sz w:val="24"/>
-          <w:szCs w:val="24"/>
-          <w14:ligatures w14:val="none"/>
-        </w:rPr>
-        <w:t>Sifat</w:t>
-      </w:r>
-      <w:r>
-        <w:rPr>
-          <w:rFonts w:ascii="Arial" w:eastAsia="Calibri" w:hAnsi="Arial" w:cs="Arial"/>
-          <w:kern w:val="0"/>
-          <w:sz w:val="24"/>
-          <w:szCs w:val="24"/>
-          <w14:ligatures w14:val="none"/>
-        </w:rPr>
-        <w:tab/>
+        <w:rPr>
+          <w:rFonts w:ascii="Arial" w:eastAsia="Calibri" w:hAnsi="Arial" w:cs="Arial"/>
+          <w:kern w:val="0"/>
+          <w:sz w:val="24"/>
+          <w:szCs w:val="24"/>
+          <w14:ligatures w14:val="none"/>
+        </w:rPr>
+      </w:pPr>
+      <w:r>
+        <w:rPr>
+          <w:rFonts w:ascii="Arial" w:eastAsia="Calibri" w:hAnsi="Arial" w:cs="Arial"/>
+          <w:kern w:val="0"/>
+          <w:sz w:val="24"/>
+          <w:szCs w:val="24"/>
+          <w14:ligatures w14:val="none"/>
+        </w:rPr>
+        <w:t xml:space="preserve">  Lampiran</w:t>
       </w:r>
       <w:r>
         <w:rPr>
@@ -575,7 +636,7 @@
           <w:szCs w:val="24"/>
           <w14:ligatures w14:val="none"/>
         </w:rPr>
-        <w:t>${sifat}</w:t>
+        <w:t xml:space="preserve">-</w:t>
       </w:r>
     </w:p>
     <w:p>
@@ -597,7 +658,7 @@
           <w:szCs w:val="24"/>
           <w14:ligatures w14:val="none"/>
         </w:rPr>
-        <w:t xml:space="preserve">  Lampiran</w:t>
+        <w:t xml:space="preserve">  Perihal</w:t>
       </w:r>
       <w:r>
         <w:rPr>
@@ -616,9 +677,10 @@
           <w:kern w:val="0"/>
           <w:sz w:val="24"/>
           <w:szCs w:val="24"/>
-          <w14:ligatures w14:val="none"/>
-        </w:rPr>
-        <w:t xml:space="preserve">1 (satu) halaman</w:t>
+          <w:u w:val="single"/>
+          <w14:ligatures w14:val="none"/>
+        </w:rPr>
+        <w:t>Usulan Staf dan Inovasi</w:t>
       </w:r>
     </w:p>
     <w:p>
@@ -632,90 +694,115 @@
           <w14:ligatures w14:val="none"/>
         </w:rPr>
       </w:pPr>
-      <w:r>
-        <w:rPr>
-          <w:rFonts w:ascii="Arial" w:eastAsia="Calibri" w:hAnsi="Arial" w:cs="Arial"/>
-          <w:kern w:val="0"/>
-          <w:sz w:val="24"/>
-          <w:szCs w:val="24"/>
-          <w14:ligatures w14:val="none"/>
-        </w:rPr>
-        <w:t xml:space="preserve">  Perihal</w:t>
-      </w:r>
-      <w:r>
-        <w:rPr>
-          <w:rFonts w:ascii="Arial" w:eastAsia="Calibri" w:hAnsi="Arial" w:cs="Arial"/>
-          <w:kern w:val="0"/>
-          <w:sz w:val="24"/>
-          <w:szCs w:val="24"/>
-          <w14:ligatures w14:val="none"/>
-        </w:rPr>
-        <w:tab/>
-        <w:t xml:space="preserve">: </w:t>
-      </w:r>
-      <w:r>
-        <w:rPr>
-          <w:rFonts w:ascii="Arial" w:eastAsia="Calibri" w:hAnsi="Arial" w:cs="Arial"/>
-          <w:kern w:val="0"/>
-          <w:sz w:val="24"/>
-          <w:szCs w:val="24"/>
-          <w:u w:val="single"/>
-          <w14:ligatures w14:val="none"/>
-        </w:rPr>
-        <w:t xml:space="preserve">Usulan Staf dan Inovasi</w:t>
-      </w:r>
-      <w:proofErr w:type="spellStart"/>
-      <w:r>
-        <w:rPr>
-          <w:rFonts w:ascii="Arial" w:eastAsia="Calibri" w:hAnsi="Arial" w:cs="Arial"/>
-          <w:kern w:val="0"/>
-          <w:sz w:val="24"/>
-          <w:szCs w:val="24"/>
-          <w:u w:val="single"/>
-          <w14:ligatures w14:val="none"/>
-        </w:rPr>
-        <w:t xml:space="preserve"/>
-      </w:r>
-      <w:proofErr w:type="spellEnd"/>
     </w:p>
     <w:p>
       <w:pPr>
-        <w:spacing w:after="0" w:line="240" w:lineRule="auto"/>
-        <w:rPr>
-          <w:rFonts w:ascii="Arial" w:eastAsia="Calibri" w:hAnsi="Arial" w:cs="Arial"/>
-          <w:kern w:val="0"/>
-          <w:sz w:val="24"/>
-          <w:szCs w:val="24"/>
-          <w14:ligatures w14:val="none"/>
-        </w:rPr>
-      </w:pPr>
+        <w:spacing w:before="240" w:after="0" w:line="240" w:lineRule="auto"/>
+        <w:rPr>
+          <w:rFonts w:ascii="Arial" w:eastAsia="Calibri" w:hAnsi="Arial" w:cs="Arial"/>
+          <w:kern w:val="0"/>
+          <w:sz w:val="24"/>
+          <w:szCs w:val="24"/>
+          <w14:ligatures w14:val="none"/>
+        </w:rPr>
+      </w:pPr>
+      <w:r>
+        <w:rPr>
+          <w:rFonts w:ascii="Arial" w:eastAsia="Calibri" w:hAnsi="Arial" w:cs="Arial"/>
+          <w:kern w:val="0"/>
+          <w:sz w:val="24"/>
+          <w:szCs w:val="24"/>
+          <w14:ligatures w14:val="none"/>
+        </w:rPr>
+        <w:t xml:space="preserve">  Yth. </w:t>
+      </w:r>
     </w:p>
     <w:p>
       <w:pPr>
-        <w:spacing w:before="240" w:after="0" w:line="240" w:lineRule="auto"/>
-        <w:rPr>
-          <w:rFonts w:ascii="Arial" w:eastAsia="Calibri" w:hAnsi="Arial" w:cs="Arial"/>
-          <w:kern w:val="0"/>
-          <w:sz w:val="24"/>
-          <w:szCs w:val="24"/>
-          <w14:ligatures w14:val="none"/>
-        </w:rPr>
-      </w:pPr>
-      <w:r>
-        <w:rPr>
-          <w:rFonts w:ascii="Arial" w:eastAsia="Calibri" w:hAnsi="Arial" w:cs="Arial"/>
-          <w:kern w:val="0"/>
-          <w:sz w:val="24"/>
-          <w:szCs w:val="24"/>
-          <w14:ligatures w14:val="none"/>
-        </w:rPr>
-        <w:t xml:space="preserve">  Yth. </w:t>
+        <w:spacing w:before="120" w:after="0" w:line="240" w:lineRule="auto"/>
+        <w:ind w:left="142"/>
+        <w:rPr>
+          <w:rFonts w:ascii="Arial" w:eastAsia="Calibri" w:hAnsi="Arial" w:cs="Arial"/>
+          <w:b/>
+          <w:bCs/>
+          <w:kern w:val="0"/>
+          <w:sz w:val="24"/>
+          <w:szCs w:val="24"/>
+          <w14:ligatures w14:val="none"/>
+        </w:rPr>
+      </w:pPr>
+      <w:r>
+        <w:rPr>
+          <w:rFonts w:ascii="Arial" w:eastAsia="Calibri" w:hAnsi="Arial" w:cs="Arial"/>
+          <w:b/>
+          <w:bCs/>
+          <w:kern w:val="0"/>
+          <w:sz w:val="24"/>
+          <w:szCs w:val="24"/>
+          <w14:ligatures w14:val="none"/>
+        </w:rPr>
+        <w:t>Kepala Bappeda Litbang</w:t>
+      </w:r>
+      <w:r>
+        <w:rPr>
+          <w:rFonts w:ascii="Arial" w:eastAsia="Calibri" w:hAnsi="Arial" w:cs="Arial"/>
+          <w:b/>
+          <w:bCs/>
+          <w:kern w:val="0"/>
+          <w:sz w:val="24"/>
+          <w:szCs w:val="24"/>
+          <w14:ligatures w14:val="none"/>
+        </w:rPr>
+        <w:br/>
+        <w:t>Kota Tarakan</w:t>
       </w:r>
     </w:p>
     <w:p>
       <w:pPr>
-        <w:spacing w:before="240" w:after="0" w:line="240" w:lineRule="auto"/>
+        <w:spacing w:before="120" w:after="0" w:line="240" w:lineRule="auto"/>
         <w:ind w:left="142"/>
+        <w:rPr>
+          <w:rFonts w:ascii="Arial" w:eastAsia="Calibri" w:hAnsi="Arial" w:cs="Arial"/>
+          <w:kern w:val="0"/>
+          <w:sz w:val="24"/>
+          <w:szCs w:val="24"/>
+          <w14:ligatures w14:val="none"/>
+        </w:rPr>
+      </w:pPr>
+      <w:r>
+        <w:rPr>
+          <w:rFonts w:ascii="Arial" w:eastAsia="Calibri" w:hAnsi="Arial" w:cs="Arial"/>
+          <w:kern w:val="0"/>
+          <w:sz w:val="24"/>
+          <w:szCs w:val="24"/>
+          <w14:ligatures w14:val="none"/>
+        </w:rPr>
+        <w:t>di</w:t>
+      </w:r>
+      <w:r>
+        <w:rPr>
+          <w:rFonts w:ascii="Arial" w:eastAsia="Calibri" w:hAnsi="Arial" w:cs="Arial"/>
+          <w:kern w:val="0"/>
+          <w:sz w:val="24"/>
+          <w:szCs w:val="24"/>
+          <w14:ligatures w14:val="none"/>
+        </w:rPr>
+        <w:t>-</w:t>
+      </w:r>
+      <w:r>
+        <w:rPr>
+          <w:rFonts w:ascii="Arial" w:eastAsia="Calibri" w:hAnsi="Arial" w:cs="Arial"/>
+          <w:kern w:val="0"/>
+          <w:sz w:val="24"/>
+          <w:szCs w:val="24"/>
+          <w14:ligatures w14:val="none"/>
+        </w:rPr>
+        <w:t xml:space="preserve"> </w:t>
+      </w:r>
+    </w:p>
+    <w:p>
+      <w:pPr>
+        <w:spacing w:after="0" w:line="240" w:lineRule="auto"/>
         <w:rPr>
           <w:rFonts w:ascii="Arial" w:eastAsia="Calibri" w:hAnsi="Arial" w:cs="Arial"/>
           <w:b/>
@@ -729,6 +816,16 @@
       <w:r>
         <w:rPr>
           <w:rFonts w:ascii="Arial" w:eastAsia="Calibri" w:hAnsi="Arial" w:cs="Arial"/>
+          <w:kern w:val="0"/>
+          <w:sz w:val="24"/>
+          <w:szCs w:val="24"/>
+          <w14:ligatures w14:val="none"/>
+        </w:rPr>
+        <w:tab/>
+      </w:r>
+      <w:r>
+        <w:rPr>
+          <w:rFonts w:ascii="Arial" w:eastAsia="Calibri" w:hAnsi="Arial" w:cs="Arial"/>
           <w:b/>
           <w:bCs/>
           <w:kern w:val="0"/>
@@ -736,104 +833,12 @@
           <w:szCs w:val="24"/>
           <w14:ligatures w14:val="none"/>
         </w:rPr>
-        <w:t xml:space="preserve">Kepala Bappeda Litbang</w:t>
-      </w:r>
-      <w:r>
-        <w:rPr>
-          <w:rFonts w:ascii="Arial" w:eastAsia="Calibri" w:hAnsi="Arial" w:cs="Arial"/>
-          <w:b/>
-          <w:bCs/>
-          <w:kern w:val="0"/>
-          <w:sz w:val="24"/>
-          <w:szCs w:val="24"/>
-          <w14:ligatures w14:val="none"/>
-        </w:rPr>
-        <w:br/>
-        <w:t xml:space="preserve">Kota Tarakan</w:t>
+        <w:t>TARAKAN</w:t>
       </w:r>
     </w:p>
     <w:p>
       <w:pPr>
-        <w:spacing w:before="240" w:after="0" w:line="240" w:lineRule="auto"/>
-        <w:ind w:left="142"/>
-        <w:rPr>
-          <w:rFonts w:ascii="Arial" w:eastAsia="Calibri" w:hAnsi="Arial" w:cs="Arial"/>
-          <w:kern w:val="0"/>
-          <w:sz w:val="24"/>
-          <w:szCs w:val="24"/>
-          <w14:ligatures w14:val="none"/>
-        </w:rPr>
-      </w:pPr>
-      <w:r>
-        <w:rPr>
-          <w:rFonts w:ascii="Arial" w:eastAsia="Calibri" w:hAnsi="Arial" w:cs="Arial"/>
-          <w:kern w:val="0"/>
-          <w:sz w:val="24"/>
-          <w:szCs w:val="24"/>
-          <w14:ligatures w14:val="none"/>
-        </w:rPr>
-        <w:t>di</w:t>
-      </w:r>
-      <w:r>
-        <w:rPr>
-          <w:rFonts w:ascii="Arial" w:eastAsia="Calibri" w:hAnsi="Arial" w:cs="Arial"/>
-          <w:kern w:val="0"/>
-          <w:sz w:val="24"/>
-          <w:szCs w:val="24"/>
-          <w14:ligatures w14:val="none"/>
-        </w:rPr>
-        <w:t>-</w:t>
-      </w:r>
-      <w:r>
-        <w:rPr>
-          <w:rFonts w:ascii="Arial" w:eastAsia="Calibri" w:hAnsi="Arial" w:cs="Arial"/>
-          <w:kern w:val="0"/>
-          <w:sz w:val="24"/>
-          <w:szCs w:val="24"/>
-          <w14:ligatures w14:val="none"/>
-        </w:rPr>
-        <w:t xml:space="preserve"> </w:t>
-      </w:r>
-    </w:p>
-    <w:p>
-      <w:pPr>
-        <w:spacing w:after="0" w:line="480" w:lineRule="auto"/>
-        <w:rPr>
-          <w:rFonts w:ascii="Arial" w:eastAsia="Calibri" w:hAnsi="Arial" w:cs="Arial"/>
-          <w:b/>
-          <w:bCs/>
-          <w:kern w:val="0"/>
-          <w:sz w:val="24"/>
-          <w:szCs w:val="24"/>
-          <w14:ligatures w14:val="none"/>
-        </w:rPr>
-      </w:pPr>
-      <w:r>
-        <w:rPr>
-          <w:rFonts w:ascii="Arial" w:eastAsia="Calibri" w:hAnsi="Arial" w:cs="Arial"/>
-          <w:kern w:val="0"/>
-          <w:sz w:val="24"/>
-          <w:szCs w:val="24"/>
-          <w14:ligatures w14:val="none"/>
-        </w:rPr>
-        <w:tab/>
-      </w:r>
-      <w:r>
-        <w:rPr>
-          <w:rFonts w:ascii="Arial" w:eastAsia="Calibri" w:hAnsi="Arial" w:cs="Arial"/>
-          <w:b/>
-          <w:bCs/>
-          <w:kern w:val="0"/>
-          <w:sz w:val="24"/>
-          <w:szCs w:val="24"/>
-          <w14:ligatures w14:val="none"/>
-        </w:rPr>
-        <w:t xml:space="preserve">TARAKAN</w:t>
-      </w:r>
-    </w:p>
-    <w:p>
-      <w:pPr>
-        <w:spacing w:before="240" w:after="0" w:line="480" w:lineRule="auto"/>
+        <w:spacing w:before="160" w:after="0" w:line="276" w:lineRule="auto"/>
         <w:ind w:firstLine="709"/>
         <w:jc w:val="both"/>
         <w:rPr>
@@ -849,990 +854,6 @@
           <w:szCs w:val="24"/>
         </w:rPr>
         <w:t xml:space="preserve">Dalam rangka mendukung pelaksanaan Lomba Inovasi Daerah Kota Tarakan Tahun 2026 yang diselenggarakan oleh Bappeda Litbang Kota Tarakan serta sebagai upaya meningkatkan budaya inovasi di lingkungan Pemerintah Daerah, bersama surat ini kami sampaikan usulan nama staf dan inovasi dari Sekretariat Daerah Kota Tarakan untuk dapat dipertimbangkan dan diikutsertakan dalam kompetisi tersebut.</w:t>
-      </w:r>
-      <w:proofErr w:type="spellStart"/>
-      <w:r>
-        <w:rPr>
-          <w:rFonts w:ascii="Arial" w:eastAsia="Calibri" w:hAnsi="Arial" w:cs="Arial"/>
-          <w:i/>
-          <w:iCs/>
-          <w:sz w:val="24"/>
-          <w:szCs w:val="24"/>
-        </w:rPr>
-        <w:t xml:space="preserve"/>
-      </w:r>
-      <w:proofErr w:type="spellEnd"/>
-      <w:r>
-        <w:rPr>
-          <w:rFonts w:ascii="Arial" w:eastAsia="Calibri" w:hAnsi="Arial" w:cs="Arial"/>
-          <w:i/>
-          <w:iCs/>
-          <w:sz w:val="24"/>
-          <w:szCs w:val="24"/>
-        </w:rPr>
-        <w:t xml:space="preserve"/>
-      </w:r>
-      <w:proofErr w:type="spellStart"/>
-      <w:r>
-        <w:rPr>
-          <w:rFonts w:ascii="Arial" w:eastAsia="Calibri" w:hAnsi="Arial" w:cs="Arial"/>
-          <w:i/>
-          <w:iCs/>
-          <w:sz w:val="24"/>
-          <w:szCs w:val="24"/>
-        </w:rPr>
-        <w:t xml:space="preserve"/>
-      </w:r>
-      <w:proofErr w:type="spellEnd"/>
-      <w:r>
-        <w:rPr>
-          <w:rFonts w:ascii="Arial" w:eastAsia="Calibri" w:hAnsi="Arial" w:cs="Arial"/>
-          <w:i/>
-          <w:iCs/>
-          <w:sz w:val="24"/>
-          <w:szCs w:val="24"/>
-        </w:rPr>
-        <w:t xml:space="preserve"/>
-      </w:r>
-      <w:proofErr w:type="spellStart"/>
-      <w:r>
-        <w:rPr>
-          <w:rFonts w:ascii="Arial" w:eastAsia="Calibri" w:hAnsi="Arial" w:cs="Arial"/>
-          <w:i/>
-          <w:iCs/>
-          <w:sz w:val="24"/>
-          <w:szCs w:val="24"/>
-        </w:rPr>
-        <w:t xml:space="preserve"/>
-      </w:r>
-      <w:proofErr w:type="spellEnd"/>
-      <w:r>
-        <w:rPr>
-          <w:rFonts w:ascii="Arial" w:eastAsia="Calibri" w:hAnsi="Arial" w:cs="Arial"/>
-          <w:i/>
-          <w:iCs/>
-          <w:sz w:val="24"/>
-          <w:szCs w:val="24"/>
-        </w:rPr>
-        <w:t xml:space="preserve"/>
-      </w:r>
-      <w:r>
-        <w:rPr>
-          <w:rFonts w:ascii="Arial" w:eastAsia="Calibri" w:hAnsi="Arial" w:cs="Arial"/>
-          <w:sz w:val="24"/>
-          <w:szCs w:val="24"/>
-        </w:rPr>
-        <w:t xml:space="preserve"/>
-      </w:r>
-      <w:proofErr w:type="spellStart"/>
-      <w:r>
-        <w:rPr>
-          <w:rFonts w:ascii="Arial" w:eastAsia="Calibri" w:hAnsi="Arial" w:cs="Arial"/>
-          <w:i/>
-          <w:iCs/>
-          <w:sz w:val="24"/>
-          <w:szCs w:val="24"/>
-        </w:rPr>
-        <w:t xml:space="preserve"/>
-      </w:r>
-      <w:proofErr w:type="spellEnd"/>
-      <w:r>
-        <w:rPr>
-          <w:rFonts w:ascii="Arial" w:eastAsia="Calibri" w:hAnsi="Arial" w:cs="Arial"/>
-          <w:i/>
-          <w:iCs/>
-          <w:sz w:val="24"/>
-          <w:szCs w:val="24"/>
-        </w:rPr>
-        <w:t xml:space="preserve"/>
-      </w:r>
-      <w:r>
-        <w:rPr>
-          <w:rFonts w:ascii="Arial" w:eastAsia="Calibri" w:hAnsi="Arial" w:cs="Arial"/>
-          <w:sz w:val="24"/>
-          <w:szCs w:val="24"/>
-        </w:rPr>
-        <w:t xml:space="preserve"/>
-      </w:r>
-      <w:r>
-        <w:rPr>
-          <w:rFonts w:ascii="Arial" w:eastAsia="Calibri" w:hAnsi="Arial" w:cs="Arial"/>
-          <w:sz w:val="24"/>
-          <w:szCs w:val="24"/>
-        </w:rPr>
-        <w:t xml:space="preserve"/>
-      </w:r>
-      <w:r>
-        <w:rPr>
-          <w:rFonts w:ascii="Arial" w:eastAsia="Calibri" w:hAnsi="Arial" w:cs="Arial"/>
-          <w:sz w:val="24"/>
-          <w:szCs w:val="24"/>
-        </w:rPr>
-        <w:t xml:space="preserve"/>
-      </w:r>
-      <w:r>
-        <w:rPr>
-          <w:rFonts w:ascii="Arial" w:eastAsia="Calibri" w:hAnsi="Arial" w:cs="Arial"/>
-          <w:sz w:val="24"/>
-          <w:szCs w:val="24"/>
-        </w:rPr>
-        <w:t xml:space="preserve"/>
-      </w:r>
-      <w:r>
-        <w:rPr>
-          <w:rFonts w:ascii="Arial" w:eastAsia="Calibri" w:hAnsi="Arial" w:cs="Arial"/>
-          <w:sz w:val="24"/>
-          <w:szCs w:val="24"/>
-        </w:rPr>
-        <w:t xml:space="preserve"/>
-      </w:r>
-      <w:proofErr w:type="spellStart"/>
-      <w:r>
-        <w:rPr>
-          <w:rFonts w:ascii="Arial" w:eastAsia="Calibri" w:hAnsi="Arial" w:cs="Arial"/>
-          <w:sz w:val="24"/>
-          <w:szCs w:val="24"/>
-        </w:rPr>
-        <w:t xml:space="preserve"/>
-      </w:r>
-      <w:proofErr w:type="spellEnd"/>
-      <w:r>
-        <w:rPr>
-          <w:rFonts w:ascii="Arial" w:eastAsia="Calibri" w:hAnsi="Arial" w:cs="Arial"/>
-          <w:sz w:val="24"/>
-          <w:szCs w:val="24"/>
-        </w:rPr>
-        <w:t xml:space="preserve"/>
-      </w:r>
-      <w:r>
-        <w:rPr>
-          <w:rFonts w:ascii="Arial" w:eastAsia="Calibri" w:hAnsi="Arial" w:cs="Arial"/>
-          <w:sz w:val="24"/>
-          <w:szCs w:val="24"/>
-        </w:rPr>
-        <w:t xml:space="preserve"/>
-      </w:r>
-    </w:p>
-    <w:p>
-      <w:pPr>
-        <w:spacing w:before="240" w:after="0" w:line="480" w:lineRule="auto"/>
-        <w:ind w:firstLine="709"/>
-        <w:jc w:val="both"/>
-        <w:rPr>
-          <w:rFonts w:ascii="Arial" w:eastAsia="Calibri" w:hAnsi="Arial" w:cs="Arial"/>
-          <w:sz w:val="24"/>
-          <w:szCs w:val="24"/>
-        </w:rPr>
-      </w:pPr>
-      <w:r>
-        <w:rPr>
-          <w:rFonts w:ascii="Arial" w:eastAsia="Calibri" w:hAnsi="Arial" w:cs="Arial"/>
-          <w:sz w:val="24"/>
-          <w:szCs w:val="24"/>
-        </w:rPr>
-        <w:t xml:space="preserve">Adapun inovasi yang diikutsertakan yaitu “Prokopim Hibot: Superapp Pelayanan Keprotokolan dan Komunikasi Pimpinan Pemerintah Kota Tarakan” pada Kategori A. Inovasi Tata Kelola Pemerintahan dengan susunan tim dan identitas usulan terlampir. Proposal dan dokumen pendukungnya diunggah melalui aplikasi RISDA.</w:t>
-      </w:r>
-      <w:r>
-        <w:rPr>
-          <w:rFonts w:ascii="Arial" w:eastAsia="Calibri" w:hAnsi="Arial" w:cs="Arial"/>
-          <w:sz w:val="24"/>
-          <w:szCs w:val="24"/>
-        </w:rPr>
-        <w:t xml:space="preserve"/>
-      </w:r>
-      <w:proofErr w:type="spellStart"/>
-      <w:r>
-        <w:rPr>
-          <w:rFonts w:ascii="Arial" w:eastAsia="Calibri" w:hAnsi="Arial" w:cs="Arial"/>
-          <w:i/>
-          <w:iCs/>
-          <w:sz w:val="24"/>
-          <w:szCs w:val="24"/>
-        </w:rPr>
-        <w:t xml:space="preserve"/>
-      </w:r>
-      <w:proofErr w:type="spellEnd"/>
-      <w:r>
-        <w:rPr>
-          <w:rFonts w:ascii="Arial" w:eastAsia="Calibri" w:hAnsi="Arial" w:cs="Arial"/>
-          <w:sz w:val="24"/>
-          <w:szCs w:val="24"/>
-        </w:rPr>
-        <w:t xml:space="preserve"/>
-      </w:r>
-      <w:r>
-        <w:rPr>
-          <w:rFonts w:ascii="Arial" w:eastAsia="Calibri" w:hAnsi="Arial" w:cs="Arial"/>
-          <w:sz w:val="24"/>
-          <w:szCs w:val="24"/>
-        </w:rPr>
-        <w:t xml:space="preserve"/>
-      </w:r>
-      <w:r>
-        <w:rPr>
-          <w:rFonts w:ascii="Arial" w:eastAsia="Calibri" w:hAnsi="Arial" w:cs="Arial"/>
-          <w:sz w:val="24"/>
-          <w:szCs w:val="24"/>
-        </w:rPr>
-        <w:t xml:space="preserve"/>
-      </w:r>
-      <w:proofErr w:type="spellStart"/>
-      <w:r>
-        <w:rPr>
-          <w:rFonts w:ascii="Arial" w:eastAsia="Calibri" w:hAnsi="Arial" w:cs="Arial"/>
-          <w:i/>
-          <w:iCs/>
-          <w:sz w:val="24"/>
-          <w:szCs w:val="24"/>
-        </w:rPr>
-        <w:t xml:space="preserve"/>
-      </w:r>
-      <w:proofErr w:type="spellEnd"/>
-      <w:r>
-        <w:rPr>
-          <w:rFonts w:ascii="Arial" w:eastAsia="Calibri" w:hAnsi="Arial" w:cs="Arial"/>
-          <w:sz w:val="24"/>
-          <w:szCs w:val="24"/>
-        </w:rPr>
-        <w:t xml:space="preserve"/>
-      </w:r>
-    </w:p>
-    <w:p>
-      <w:pPr>
-        <w:spacing w:before="240" w:after="0" w:line="480" w:lineRule="auto"/>
-        <w:ind w:firstLine="709"/>
-        <w:jc w:val="both"/>
-        <w:rPr>
-          <w:rFonts w:ascii="Arial" w:eastAsia="Calibri" w:hAnsi="Arial" w:cs="Arial"/>
-          <w:sz w:val="24"/>
-          <w:szCs w:val="24"/>
-        </w:rPr>
-      </w:pPr>
-      <w:r>
-        <w:rPr>
-          <w:rFonts w:ascii="Arial" w:eastAsia="Calibri" w:hAnsi="Arial" w:cs="Arial"/>
-          <w:sz w:val="24"/>
-          <w:szCs w:val="24"/>
-        </w:rPr>
-        <w:lastRenderedPageBreak/>
-        <w:t xml:space="preserve">Demikian usulan ini disampaikan. Atas perhatian dan perkenan Bapak/Ibu, diucapkan terima kasih.</w:t>
-      </w:r>
-      <w:r>
-        <w:rPr>
-          <w:rFonts w:ascii="Arial" w:eastAsia="Calibri" w:hAnsi="Arial" w:cs="Arial"/>
-          <w:sz w:val="24"/>
-          <w:szCs w:val="24"/>
-        </w:rPr>
-        <w:t xml:space="preserve"/>
-      </w:r>
-      <w:r>
-        <w:rPr>
-          <w:rFonts w:ascii="Arial" w:eastAsia="Calibri" w:hAnsi="Arial" w:cs="Arial"/>
-          <w:sz w:val="24"/>
-          <w:szCs w:val="24"/>
-        </w:rPr>
-        <w:t xml:space="preserve"/>
-      </w:r>
-      <w:r>
-        <w:rPr>
-          <w:rFonts w:ascii="Arial" w:eastAsia="Calibri" w:hAnsi="Arial" w:cs="Arial"/>
-          <w:sz w:val="24"/>
-          <w:szCs w:val="24"/>
-        </w:rPr>
-        <w:t xml:space="preserve"/>
-      </w:r>
-      <w:r>
-        <w:rPr>
-          <w:rFonts w:ascii="Arial" w:eastAsia="Calibri" w:hAnsi="Arial" w:cs="Arial"/>
-          <w:sz w:val="24"/>
-          <w:szCs w:val="24"/>
-        </w:rPr>
-        <w:t xml:space="preserve"/>
-      </w:r>
-      <w:r>
-        <w:rPr>
-          <w:rFonts w:ascii="Arial" w:eastAsia="Calibri" w:hAnsi="Arial" w:cs="Arial"/>
-          <w:sz w:val="24"/>
-          <w:szCs w:val="24"/>
-        </w:rPr>
-        <w:t xml:space="preserve"/>
-      </w:r>
-      <w:r>
-        <w:rPr>
-          <w:rFonts w:ascii="Arial" w:eastAsia="Calibri" w:hAnsi="Arial" w:cs="Arial"/>
-          <w:sz w:val="24"/>
-          <w:szCs w:val="24"/>
-        </w:rPr>
-        <w:t xml:space="preserve"/>
-      </w:r>
-      <w:r>
-        <w:rPr>
-          <w:rFonts w:ascii="Arial" w:eastAsia="Calibri" w:hAnsi="Arial" w:cs="Arial"/>
-          <w:sz w:val="24"/>
-          <w:szCs w:val="24"/>
-        </w:rPr>
-        <w:t xml:space="preserve"/>
-      </w:r>
-    </w:p>
-    <w:p>
-      <w:pPr>
-        <w:spacing w:line="276" w:lineRule="auto"/>
-        <w:ind w:left="5670"/>
-        <w:jc w:val="both"/>
-        <w:rPr>
-          <w:rFonts w:ascii="Arial" w:eastAsia="Calibri" w:hAnsi="Arial" w:cs="Arial"/>
-          <w:b/>
-          <w:bCs/>
-          <w:sz w:val="24"/>
-          <w:szCs w:val="24"/>
-        </w:rPr>
-      </w:pPr>
-      <w:r>
-        <w:rPr>
-          <w:rFonts w:ascii="Arial" w:eastAsia="Calibri" w:hAnsi="Arial" w:cs="Arial"/>
-          <w:b/>
-          <w:bCs/>
-          <w:sz w:val="24"/>
-          <w:szCs w:val="24"/>
-        </w:rPr>
-        <w:t xml:space="preserve">SEKRETARIS DAERAH</w:t>
-      </w:r>
-      <w:proofErr w:type="spellStart"/>
-      <w:r>
-        <w:rPr>
-          <w:rFonts w:ascii="Arial" w:eastAsia="Calibri" w:hAnsi="Arial" w:cs="Arial"/>
-          <w:b/>
-          <w:bCs/>
-          <w:sz w:val="24"/>
-          <w:szCs w:val="24"/>
-        </w:rPr>
-        <w:t xml:space="preserve"/>
-      </w:r>
-      <w:proofErr w:type="spellEnd"/>
-      <w:r>
-        <w:rPr>
-          <w:rFonts w:ascii="Arial" w:eastAsia="Calibri" w:hAnsi="Arial" w:cs="Arial"/>
-          <w:b/>
-          <w:bCs/>
-          <w:sz w:val="24"/>
-          <w:szCs w:val="24"/>
-        </w:rPr>
-        <w:t xml:space="preserve"/>
-      </w:r>
-    </w:p>
-    <w:p>
-      <w:pPr>
-        <w:spacing w:line="276" w:lineRule="auto"/>
-        <w:ind w:left="5670"/>
-        <w:jc w:val="both"/>
-        <w:rPr>
-          <w:rFonts w:ascii="Arial" w:eastAsia="Calibri" w:hAnsi="Arial" w:cs="Arial"/>
-          <w:b/>
-          <w:bCs/>
-          <w:sz w:val="24"/>
-          <w:szCs w:val="24"/>
-        </w:rPr>
-      </w:pPr>
-    </w:p>
-    <w:p>
-      <w:pPr>
-        <w:spacing w:line="276" w:lineRule="auto"/>
-        <w:ind w:left="5670"/>
-        <w:jc w:val="both"/>
-        <w:rPr>
-          <w:rFonts w:ascii="Arial" w:eastAsia="Calibri" w:hAnsi="Arial" w:cs="Arial"/>
-          <w:b/>
-          <w:bCs/>
-          <w:sz w:val="24"/>
-          <w:szCs w:val="24"/>
-        </w:rPr>
-      </w:pPr>
-      <w:r>
-        <w:rPr>
-          <w:rFonts w:ascii="Arial" w:hAnsi="Arial" w:cs="Arial"/>
-          <w:color w:val="374151"/>
-          <w:spacing w:val="2"/>
-          <w:sz w:val="24"/>
-          <w:szCs w:val="24"/>
-          <w:shd w:val="clear" w:color="auto" w:fill="FFFFFF"/>
-        </w:rPr>
-        <w:t>${</w:t>
-      </w:r>
-      <w:proofErr w:type="spellStart"/>
-      <w:r>
-        <w:rPr>
-          <w:rFonts w:ascii="Arial" w:hAnsi="Arial" w:cs="Arial"/>
-          <w:color w:val="374151"/>
-          <w:spacing w:val="2"/>
-          <w:sz w:val="24"/>
-          <w:szCs w:val="24"/>
-          <w:shd w:val="clear" w:color="auto" w:fill="FFFFFF"/>
-        </w:rPr>
-        <w:t>ttd_pengirim</w:t>
-      </w:r>
-      <w:proofErr w:type="spellEnd"/>
-      <w:r>
-        <w:rPr>
-          <w:rFonts w:ascii="Arial" w:hAnsi="Arial" w:cs="Arial"/>
-          <w:color w:val="374151"/>
-          <w:spacing w:val="2"/>
-          <w:sz w:val="24"/>
-          <w:szCs w:val="24"/>
-          <w:shd w:val="clear" w:color="auto" w:fill="FFFFFF"/>
-        </w:rPr>
-        <w:t>}</w:t>
-      </w:r>
-    </w:p>
-    <w:p>
-      <w:pPr>
-        <w:spacing w:line="276" w:lineRule="auto"/>
-        <w:ind w:left="5670"/>
-        <w:jc w:val="both"/>
-        <w:rPr>
-          <w:rFonts w:ascii="Arial" w:eastAsia="Calibri" w:hAnsi="Arial" w:cs="Arial"/>
-          <w:b/>
-          <w:bCs/>
-          <w:sz w:val="24"/>
-          <w:szCs w:val="24"/>
-        </w:rPr>
-      </w:pPr>
-    </w:p>
-    <w:p>
-      <w:pPr>
-        <w:spacing w:after="0" w:line="240" w:lineRule="auto"/>
-        <w:ind w:left="5670"/>
-        <w:jc w:val="both"/>
-        <w:rPr>
-          <w:rFonts w:ascii="Arial" w:eastAsia="Calibri" w:hAnsi="Arial" w:cs="Arial"/>
-          <w:b/>
-          <w:bCs/>
-          <w:sz w:val="24"/>
-          <w:szCs w:val="24"/>
-        </w:rPr>
-      </w:pPr>
-      <w:r>
-        <w:rPr>
-          <w:rFonts w:ascii="Arial" w:eastAsia="Calibri" w:hAnsi="Arial" w:cs="Arial"/>
-          <w:b/>
-          <w:bCs/>
-          <w:sz w:val="24"/>
-          <w:szCs w:val="24"/>
-        </w:rPr>
-        <w:t>${</w:t>
-      </w:r>
-      <w:proofErr w:type="spellStart"/>
-      <w:r>
-        <w:rPr>
-          <w:rFonts w:ascii="Arial" w:eastAsia="Calibri" w:hAnsi="Arial" w:cs="Arial"/>
-          <w:b/>
-          <w:bCs/>
-          <w:sz w:val="24"/>
-          <w:szCs w:val="24"/>
-        </w:rPr>
-        <w:t>nama_pengirim</w:t>
-      </w:r>
-      <w:proofErr w:type="spellEnd"/>
-      <w:r>
-        <w:rPr>
-          <w:rFonts w:ascii="Arial" w:eastAsia="Calibri" w:hAnsi="Arial" w:cs="Arial"/>
-          <w:b/>
-          <w:bCs/>
-          <w:sz w:val="24"/>
-          <w:szCs w:val="24"/>
-        </w:rPr>
-        <w:t>}</w:t>
-      </w:r>
-    </w:p>
-    <w:p>
-      <w:pPr>
-        <w:spacing w:after="0" w:line="240" w:lineRule="auto"/>
-        <w:ind w:left="5670"/>
-        <w:jc w:val="both"/>
-        <w:rPr>
-          <w:rFonts w:ascii="Arial" w:eastAsia="Calibri" w:hAnsi="Arial" w:cs="Arial"/>
-          <w:b/>
-          <w:bCs/>
-          <w:sz w:val="24"/>
-          <w:szCs w:val="24"/>
-        </w:rPr>
-      </w:pPr>
-      <w:r>
-        <w:rPr>
-          <w:rFonts w:ascii="Arial" w:eastAsia="Calibri" w:hAnsi="Arial" w:cs="Arial"/>
-          <w:b/>
-          <w:bCs/>
-          <w:sz w:val="24"/>
-          <w:szCs w:val="24"/>
-        </w:rPr>
-        <w:t>${</w:t>
-      </w:r>
-      <w:proofErr w:type="spellStart"/>
-      <w:r>
-        <w:rPr>
-          <w:rFonts w:ascii="Arial" w:eastAsia="Calibri" w:hAnsi="Arial" w:cs="Arial"/>
-          <w:b/>
-          <w:bCs/>
-          <w:sz w:val="24"/>
-          <w:szCs w:val="24"/>
-        </w:rPr>
-        <w:t>pangkat</w:t>
-      </w:r>
-      <w:r>
-        <w:rPr>
-          <w:rFonts w:ascii="Arial" w:eastAsia="Calibri" w:hAnsi="Arial" w:cs="Arial"/>
-          <w:b/>
-          <w:bCs/>
-          <w:sz w:val="24"/>
-          <w:szCs w:val="24"/>
-        </w:rPr>
-        <w:t>_pengirim</w:t>
-      </w:r>
-      <w:proofErr w:type="spellEnd"/>
-      <w:r>
-        <w:rPr>
-          <w:rFonts w:ascii="Arial" w:eastAsia="Calibri" w:hAnsi="Arial" w:cs="Arial"/>
-          <w:b/>
-          <w:bCs/>
-          <w:sz w:val="24"/>
-          <w:szCs w:val="24"/>
-        </w:rPr>
-        <w:t>}</w:t>
-      </w:r>
-    </w:p>
-    <w:p>
-      <w:pPr>
-        <w:spacing w:after="0" w:line="240" w:lineRule="auto"/>
-        <w:ind w:left="5670"/>
-        <w:jc w:val="both"/>
-        <w:rPr>
-          <w:rFonts w:ascii="Arial" w:eastAsia="Calibri" w:hAnsi="Arial" w:cs="Arial"/>
-          <w:b/>
-          <w:bCs/>
-          <w:sz w:val="24"/>
-          <w:szCs w:val="24"/>
-        </w:rPr>
-      </w:pPr>
-      <w:r>
-        <w:rPr>
-          <w:rFonts w:ascii="Arial" w:eastAsia="Calibri" w:hAnsi="Arial" w:cs="Arial"/>
-          <w:sz w:val="24"/>
-          <w:szCs w:val="24"/>
-        </w:rPr>
-        <w:t xml:space="preserve">NIP. </w:t>
-      </w:r>
-      <w:r>
-        <w:rPr>
-          <w:rFonts w:ascii="Arial" w:eastAsia="Calibri" w:hAnsi="Arial" w:cs="Arial"/>
-          <w:b/>
-          <w:bCs/>
-          <w:sz w:val="24"/>
-          <w:szCs w:val="24"/>
-        </w:rPr>
-        <w:t>${</w:t>
-      </w:r>
-      <w:proofErr w:type="spellStart"/>
-      <w:r>
-        <w:rPr>
-          <w:rFonts w:ascii="Arial" w:eastAsia="Calibri" w:hAnsi="Arial" w:cs="Arial"/>
-          <w:b/>
-          <w:bCs/>
-          <w:sz w:val="24"/>
-          <w:szCs w:val="24"/>
-        </w:rPr>
-        <w:t>nip</w:t>
-      </w:r>
-      <w:r>
-        <w:rPr>
-          <w:rFonts w:ascii="Arial" w:eastAsia="Calibri" w:hAnsi="Arial" w:cs="Arial"/>
-          <w:b/>
-          <w:bCs/>
-          <w:sz w:val="24"/>
-          <w:szCs w:val="24"/>
-        </w:rPr>
-        <w:t>_pengirim</w:t>
-      </w:r>
-      <w:proofErr w:type="spellEnd"/>
-      <w:r>
-        <w:rPr>
-          <w:rFonts w:ascii="Arial" w:eastAsia="Calibri" w:hAnsi="Arial" w:cs="Arial"/>
-          <w:b/>
-          <w:bCs/>
-          <w:sz w:val="24"/>
-          <w:szCs w:val="24"/>
-        </w:rPr>
-        <w:t>}</w:t>
-      </w:r>
-    </w:p>
-    <w:p>
-      <w:pPr>
-        <w:spacing w:before="240" w:after="0" w:line="276" w:lineRule="auto"/>
-        <w:jc w:val="both"/>
-        <w:rPr>
-          <w:rFonts w:ascii="Arial" w:eastAsia="Calibri" w:hAnsi="Arial" w:cs="Arial"/>
-          <w:sz w:val="24"/>
-          <w:szCs w:val="24"/>
-        </w:rPr>
-      </w:pPr>
-    </w:p>
-    <w:p>
-      <w:pPr>
-        <w:spacing w:after="0" w:line="240" w:lineRule="auto"/>
-        <w:rPr>
-          <w:rFonts w:ascii="Arial" w:eastAsia="Times New Roman" w:hAnsi="Arial" w:cs="Arial"/>
-          <w:iCs/>
-          <w:kern w:val="0"/>
-          <w:sz w:val="20"/>
-          <w:szCs w:val="20"/>
-          <w:u w:val="single"/>
-          <w14:ligatures w14:val="none"/>
-        </w:rPr>
-      </w:pPr>
-      <w:r>
-        <w:rPr>
-          <w:rFonts w:ascii="Arial" w:eastAsia="Times New Roman" w:hAnsi="Arial" w:cs="Arial"/>
-          <w:iCs/>
-          <w:kern w:val="0"/>
-          <w:sz w:val="20"/>
-          <w:szCs w:val="20"/>
-          <w:u w:val="single"/>
-          <w14:ligatures w14:val="none"/>
-        </w:rPr>
-        <w:t>Tembusan :</w:t>
-      </w:r>
-    </w:p>
-    <w:p>
-      <w:pPr>
-        <w:spacing w:after="0" w:line="240" w:lineRule="auto"/>
-        <w:rPr>
-          <w:rFonts w:ascii="Arial" w:eastAsia="Times New Roman" w:hAnsi="Arial" w:cs="Arial"/>
-          <w:iCs/>
-          <w:kern w:val="0"/>
-          <w:sz w:val="20"/>
-          <w:szCs w:val="20"/>
-          <w:u w:val="single"/>
-          <w14:ligatures w14:val="none"/>
-        </w:rPr>
-      </w:pPr>
-      <w:r>
-        <w:rPr>
-          <w:rFonts w:ascii="Arial" w:eastAsia="Times New Roman" w:hAnsi="Arial" w:cs="Arial"/>
-          <w:iCs/>
-          <w:kern w:val="0"/>
-          <w:sz w:val="20"/>
-          <w:szCs w:val="20"/>
-          <w14:ligatures w14:val="none"/>
-        </w:rPr>
-        <w:t xml:space="preserve">Wali Kota Tarakan.</w:t>
-      </w:r>
-      <w:r>
-        <w:rPr>
-          <w:rFonts w:ascii="Arial" w:eastAsia="Times New Roman" w:hAnsi="Arial" w:cs="Arial"/>
-          <w:iCs/>
-          <w:kern w:val="0"/>
-          <w:sz w:val="20"/>
-          <w:szCs w:val="20"/>
-          <w14:ligatures w14:val="none"/>
-        </w:rPr>
-        <w:t xml:space="preserve"/>
-      </w:r>
-    </w:p>
-    <w:p>
-      <w:pPr>
-        <w:rPr>
-          <w:rFonts w:ascii="Arial" w:eastAsia="Times New Roman" w:hAnsi="Arial" w:cs="Arial"/>
-          <w:iCs/>
-          <w:kern w:val="0"/>
-          <w:sz w:val="24"/>
-          <w:szCs w:val="24"/>
-          <w:u w:val="single"/>
-          <w14:ligatures w14:val="none"/>
-        </w:rPr>
-      </w:pPr>
-      <w:r>
-        <w:rPr>
-          <w:rFonts w:ascii="Arial" w:eastAsia="Times New Roman" w:hAnsi="Arial" w:cs="Arial"/>
-          <w:iCs/>
-          <w:kern w:val="0"/>
-          <w:sz w:val="24"/>
-          <w:szCs w:val="24"/>
-          <w:u w:val="single"/>
-          <w14:ligatures w14:val="none"/>
-        </w:rPr>
-        <w:br w:type="page"/>
-      </w:r>
-    </w:p>
-    <w:p>
-      <w:pPr>
-        <w:pStyle w:val="DaftarParagraf"/>
-        <w:spacing w:after="0" w:line="240" w:lineRule="auto"/>
-        <w:ind w:left="0"/>
-        <w:rPr>
-          <w:rFonts w:ascii="Arial" w:eastAsia="Times New Roman" w:hAnsi="Arial" w:cs="Arial"/>
-          <w:iCs/>
-          <w:kern w:val="0"/>
-          <w:sz w:val="24"/>
-          <w:szCs w:val="24"/>
-          <w14:ligatures w14:val="none"/>
-        </w:rPr>
-      </w:pPr>
-      <w:r>
-        <w:rPr>
-          <w:rFonts w:ascii="Arial" w:eastAsia="Times New Roman" w:hAnsi="Arial" w:cs="Arial"/>
-          <w:iCs/>
-          <w:kern w:val="0"/>
-          <w:sz w:val="24"/>
-          <w:szCs w:val="24"/>
-          <w14:ligatures w14:val="none"/>
-        </w:rPr>
-        <w:lastRenderedPageBreak/>
-        <w:t>Lampiran Surat :</w:t>
-      </w:r>
-    </w:p>
-    <w:p>
-      <w:pPr>
-        <w:pStyle w:val="DaftarParagraf"/>
-        <w:spacing w:after="0" w:line="240" w:lineRule="auto"/>
-        <w:ind w:left="0"/>
-        <w:rPr>
-          <w:rFonts w:ascii="Arial" w:eastAsia="Calibri" w:hAnsi="Arial" w:cs="Arial"/>
-          <w:kern w:val="0"/>
-          <w:sz w:val="24"/>
-          <w:szCs w:val="24"/>
-          <w14:ligatures w14:val="none"/>
-        </w:rPr>
-      </w:pPr>
-      <w:r>
-        <w:rPr>
-          <w:rFonts w:ascii="Arial" w:eastAsia="Times New Roman" w:hAnsi="Arial" w:cs="Arial"/>
-          <w:iCs/>
-          <w:kern w:val="0"/>
-          <w:sz w:val="24"/>
-          <w:szCs w:val="24"/>
-          <w14:ligatures w14:val="none"/>
-        </w:rPr>
-        <w:t>Nomor</w:t>
-      </w:r>
-      <w:r>
-        <w:rPr>
-          <w:rFonts w:ascii="Arial" w:eastAsia="Times New Roman" w:hAnsi="Arial" w:cs="Arial"/>
-          <w:iCs/>
-          <w:kern w:val="0"/>
-          <w:sz w:val="24"/>
-          <w:szCs w:val="24"/>
-          <w14:ligatures w14:val="none"/>
-        </w:rPr>
-        <w:tab/>
-        <w:t xml:space="preserve">: </w:t>
-      </w:r>
-      <w:r>
-        <w:rPr>
-          <w:rFonts w:ascii="Arial" w:eastAsia="Calibri" w:hAnsi="Arial" w:cs="Arial"/>
-          <w:kern w:val="0"/>
-          <w:sz w:val="24"/>
-          <w:szCs w:val="24"/>
-          <w14:ligatures w14:val="none"/>
-        </w:rPr>
-        <w:t>${</w:t>
-      </w:r>
-      <w:proofErr w:type="spellStart"/>
-      <w:r>
-        <w:rPr>
-          <w:rFonts w:ascii="Arial" w:eastAsia="Calibri" w:hAnsi="Arial" w:cs="Arial"/>
-          <w:kern w:val="0"/>
-          <w:sz w:val="24"/>
-          <w:szCs w:val="24"/>
-          <w14:ligatures w14:val="none"/>
-        </w:rPr>
-        <w:t>nomor_naskah</w:t>
-      </w:r>
-      <w:proofErr w:type="spellEnd"/>
-      <w:r>
-        <w:rPr>
-          <w:rFonts w:ascii="Arial" w:eastAsia="Calibri" w:hAnsi="Arial" w:cs="Arial"/>
-          <w:kern w:val="0"/>
-          <w:sz w:val="24"/>
-          <w:szCs w:val="24"/>
-          <w14:ligatures w14:val="none"/>
-        </w:rPr>
-        <w:t>}</w:t>
-      </w:r>
-    </w:p>
-    <w:p>
-      <w:pPr>
-        <w:spacing w:after="0" w:line="240" w:lineRule="auto"/>
-        <w:rPr>
-          <w:rFonts w:ascii="Arial" w:eastAsia="Calibri" w:hAnsi="Arial" w:cs="Arial"/>
-          <w:kern w:val="0"/>
-          <w:sz w:val="24"/>
-          <w:szCs w:val="24"/>
-          <w14:ligatures w14:val="none"/>
-        </w:rPr>
-      </w:pPr>
-      <w:r>
-        <w:rPr>
-          <w:rFonts w:ascii="Arial" w:eastAsia="Calibri" w:hAnsi="Arial" w:cs="Arial"/>
-          <w:kern w:val="0"/>
-          <w:sz w:val="24"/>
-          <w:szCs w:val="24"/>
-          <w14:ligatures w14:val="none"/>
-        </w:rPr>
-        <w:t>Tanggal</w:t>
-      </w:r>
-      <w:r>
-        <w:rPr>
-          <w:rFonts w:ascii="Arial" w:eastAsia="Calibri" w:hAnsi="Arial" w:cs="Arial"/>
-          <w:kern w:val="0"/>
-          <w:sz w:val="24"/>
-          <w:szCs w:val="24"/>
-          <w14:ligatures w14:val="none"/>
-        </w:rPr>
-        <w:tab/>
-        <w:t xml:space="preserve">: </w:t>
-      </w:r>
-      <w:r>
-        <w:rPr>
-          <w:rFonts w:ascii="Arial" w:eastAsia="Calibri" w:hAnsi="Arial" w:cs="Arial"/>
-          <w:kern w:val="0"/>
-          <w:sz w:val="24"/>
-          <w:szCs w:val="24"/>
-          <w14:ligatures w14:val="none"/>
-        </w:rPr>
-        <w:t>${</w:t>
-      </w:r>
-      <w:proofErr w:type="spellStart"/>
-      <w:r>
-        <w:rPr>
-          <w:rFonts w:ascii="Arial" w:eastAsia="Calibri" w:hAnsi="Arial" w:cs="Arial"/>
-          <w:kern w:val="0"/>
-          <w:sz w:val="24"/>
-          <w:szCs w:val="24"/>
-          <w14:ligatures w14:val="none"/>
-        </w:rPr>
-        <w:t>tanggal_naskah</w:t>
-      </w:r>
-      <w:proofErr w:type="spellEnd"/>
-      <w:r>
-        <w:rPr>
-          <w:rFonts w:ascii="Arial" w:eastAsia="Calibri" w:hAnsi="Arial" w:cs="Arial"/>
-          <w:kern w:val="0"/>
-          <w:sz w:val="24"/>
-          <w:szCs w:val="24"/>
-          <w14:ligatures w14:val="none"/>
-        </w:rPr>
-        <w:t>}</w:t>
-      </w:r>
-    </w:p>
-    <w:p>
-      <w:pPr>
-        <w:pStyle w:val="DaftarParagraf"/>
-        <w:spacing w:after="0" w:line="240" w:lineRule="auto"/>
-        <w:ind w:left="0"/>
-        <w:rPr>
-          <w:rFonts w:ascii="Arial" w:eastAsia="Calibri" w:hAnsi="Arial" w:cs="Arial"/>
-          <w:kern w:val="0"/>
-          <w:sz w:val="24"/>
-          <w:szCs w:val="24"/>
-          <w14:ligatures w14:val="none"/>
-        </w:rPr>
-      </w:pPr>
-    </w:p>
-    <w:p>
-      <w:pPr>
-        <w:pStyle w:val="DaftarParagraf"/>
-        <w:spacing w:after="0" w:line="240" w:lineRule="auto"/>
-        <w:ind w:left="360"/>
-        <w:rPr>
-          <w:rFonts w:ascii="Arial" w:eastAsia="Calibri" w:hAnsi="Arial" w:cs="Arial"/>
-          <w:kern w:val="0"/>
-          <w:sz w:val="24"/>
-          <w:szCs w:val="24"/>
-          <w14:ligatures w14:val="none"/>
-        </w:rPr>
-      </w:pPr>
-    </w:p>
-    <w:p>
-      <w:pPr>
-        <w:spacing w:after="0" w:line="240" w:lineRule="auto"/>
-        <w:jc w:val="center"/>
-        <w:rPr>
-          <w:rFonts w:ascii="Arial" w:hAnsi="Arial" w:cs="Arial"/>
-          <w:sz w:val="24"/>
-          <w:szCs w:val="24"/>
-        </w:rPr>
-      </w:pPr>
-      <w:r>
-        <w:rPr>
-          <w:rFonts w:ascii="Arial" w:hAnsi="Arial" w:cs="Arial"/>
-          <w:b/>
-          <w:bCs/>
-          <w:sz w:val="24"/>
-          <w:szCs w:val="24"/>
-        </w:rPr>
-        <w:t xml:space="preserve">SUSUNAN TIM DAN IDENTITAS USULAN INOVASI</w:t>
-      </w:r>
-    </w:p>
-    <w:p>
-      <w:pPr>
-        <w:spacing w:after="0" w:line="240" w:lineRule="auto"/>
-        <w:jc w:val="center"/>
-        <w:rPr>
-          <w:rFonts w:ascii="Arial" w:hAnsi="Arial" w:cs="Arial"/>
-          <w:sz w:val="24"/>
-          <w:szCs w:val="24"/>
-        </w:rPr>
-      </w:pPr>
-      <w:r>
-        <w:rPr>
-          <w:rFonts w:ascii="Arial" w:hAnsi="Arial" w:cs="Arial"/>
-          <w:sz w:val="24"/>
-          <w:szCs w:val="24"/>
-        </w:rPr>
-        <w:t xml:space="preserve">Lomba Inovasi Daerah Kota Tarakan Tahun 2026</w:t>
-      </w:r>
-      <w:proofErr w:type="spellStart"/>
-      <w:r>
-        <w:rPr>
-          <w:rFonts w:ascii="Arial" w:hAnsi="Arial" w:cs="Arial"/>
-          <w:sz w:val="24"/>
-          <w:szCs w:val="24"/>
-        </w:rPr>
-        <w:t xml:space="preserve"/>
-      </w:r>
-      <w:proofErr w:type="spellEnd"/>
-      <w:r>
-        <w:rPr>
-          <w:rFonts w:ascii="Arial" w:hAnsi="Arial" w:cs="Arial"/>
-          <w:sz w:val="24"/>
-          <w:szCs w:val="24"/>
-        </w:rPr>
-        <w:t xml:space="preserve"/>
-      </w:r>
-    </w:p>
-    <w:p>
-      <w:pPr>
-        <w:pStyle w:val="Judul1"/>
-        <w:spacing w:after="0" w:line="240" w:lineRule="auto"/>
-        <w:rPr>
-          <w:rFonts w:ascii="Arial" w:hAnsi="Arial" w:cs="Arial"/>
-          <w:b/>
-          <w:bCs/>
-          <w:color w:val="auto"/>
-          <w:sz w:val="24"/>
-          <w:szCs w:val="24"/>
-          <w:u w:val="single"/>
-        </w:rPr>
-      </w:pPr>
-      <w:r>
-        <w:rPr>
-          <w:rFonts w:ascii="Arial" w:hAnsi="Arial" w:cs="Arial"/>
-          <w:b/>
-          <w:bCs/>
-          <w:color w:val="auto"/>
-          <w:sz w:val="24"/>
-          <w:szCs w:val="24"/>
-          <w:u w:val="single"/>
-        </w:rPr>
-        <w:t xml:space="preserve">IDENTITAS USULAN</w:t>
       </w:r>
     </w:p>
     <w:p>
@@ -1841,8 +862,8 @@
           <w:tab w:val="left" w:pos="3402"/>
           <w:tab w:val="left" w:pos="3544"/>
         </w:tabs>
+        <w:spacing w:before="0" w:after="0" w:line="240" w:lineRule="auto"/>
         <w:ind w:left="3544" w:hanging="3544"/>
-        <w:spacing w:after="0" w:line="240" w:lineRule="auto"/>
         <w:rPr>
           <w:rFonts w:ascii="Arial" w:hAnsi="Arial" w:cs="Arial"/>
           <w:sz w:val="24"/>
@@ -1886,8 +907,8 @@
           <w:tab w:val="left" w:pos="3402"/>
           <w:tab w:val="left" w:pos="3544"/>
         </w:tabs>
+        <w:spacing w:before="0" w:after="0" w:line="240" w:lineRule="auto"/>
         <w:ind w:left="3544" w:hanging="3544"/>
-        <w:spacing w:after="0" w:line="240" w:lineRule="auto"/>
         <w:rPr>
           <w:rFonts w:ascii="Arial" w:hAnsi="Arial" w:cs="Arial"/>
           <w:sz w:val="24"/>
@@ -1922,7 +943,7 @@
           <w:szCs w:val="24"/>
         </w:rPr>
         <w:tab/>
-        <w:t xml:space="preserve">Tim Inovasi Prokopim Hibot (susunan tim di bawah)</w:t>
+        <w:t xml:space="preserve">Tim Inovasi Prokopim Hibot: Anugrah Yega Pranatha, M.Si. (Ketua), Saifullah, S.H., Juliyanti, S.AP., Pebriadi Banne, S.IP., dan Nuraini Wiliadewi, S.IP.</w:t>
       </w:r>
     </w:p>
     <w:p>
@@ -1931,8 +952,8 @@
           <w:tab w:val="left" w:pos="3402"/>
           <w:tab w:val="left" w:pos="3544"/>
         </w:tabs>
+        <w:spacing w:before="0" w:after="0" w:line="240" w:lineRule="auto"/>
         <w:ind w:left="3544" w:hanging="3544"/>
-        <w:spacing w:after="0" w:line="240" w:lineRule="auto"/>
         <w:rPr>
           <w:rFonts w:ascii="Arial" w:hAnsi="Arial" w:cs="Arial"/>
           <w:sz w:val="24"/>
@@ -1976,8 +997,8 @@
           <w:tab w:val="left" w:pos="3402"/>
           <w:tab w:val="left" w:pos="3544"/>
         </w:tabs>
+        <w:spacing w:before="0" w:after="0" w:line="240" w:lineRule="auto"/>
         <w:ind w:left="3544" w:hanging="3544"/>
-        <w:spacing w:after="0" w:line="240" w:lineRule="auto"/>
         <w:rPr>
           <w:rFonts w:ascii="Arial" w:hAnsi="Arial" w:cs="Arial"/>
           <w:sz w:val="24"/>
@@ -2017,1082 +1038,23 @@
     </w:p>
     <w:p>
       <w:pPr>
-        <w:tabs>
-          <w:tab w:val="left" w:pos="3402"/>
-          <w:tab w:val="left" w:pos="3544"/>
-        </w:tabs>
-        <w:ind w:left="3544" w:hanging="3544"/>
-        <w:spacing w:after="0" w:line="240" w:lineRule="auto"/>
-        <w:rPr>
-          <w:rFonts w:ascii="Arial" w:hAnsi="Arial" w:cs="Arial"/>
-          <w:sz w:val="24"/>
-          <w:szCs w:val="24"/>
-        </w:rPr>
-      </w:pPr>
-      <w:r>
-        <w:rPr>
-          <w:rFonts w:ascii="Arial" w:hAnsi="Arial" w:cs="Arial"/>
-          <w:b/>
-          <w:bCs/>
-          <w:sz w:val="24"/>
-          <w:szCs w:val="24"/>
-        </w:rPr>
-        <w:t xml:space="preserve">Instansi</w:t>
-      </w:r>
-      <w:r>
-        <w:rPr>
-          <w:rFonts w:ascii="Arial" w:hAnsi="Arial" w:cs="Arial"/>
-          <w:b/>
-          <w:bCs/>
-          <w:sz w:val="24"/>
-          <w:szCs w:val="24"/>
-        </w:rPr>
-        <w:tab/>
-        <w:t xml:space="preserve">:</w:t>
-      </w:r>
-      <w:r>
-        <w:rPr>
-          <w:rFonts w:ascii="Arial" w:hAnsi="Arial" w:cs="Arial"/>
-          <w:sz w:val="24"/>
-          <w:szCs w:val="24"/>
-        </w:rPr>
-        <w:tab/>
-        <w:t xml:space="preserve">Bagian Protokol dan Komunikasi Pimpinan Sekretariat Daerah Kota Tarakan</w:t>
-      </w:r>
-    </w:p>
-    <w:p>
-      <w:pPr>
-        <w:pStyle w:val="Judul1"/>
-        <w:spacing w:after="0" w:line="240" w:lineRule="auto"/>
-        <w:rPr>
-          <w:rFonts w:ascii="Arial" w:hAnsi="Arial" w:cs="Arial"/>
-          <w:b/>
-          <w:bCs/>
-          <w:color w:val="auto"/>
-          <w:sz w:val="24"/>
-          <w:szCs w:val="24"/>
-          <w:u w:val="single"/>
-        </w:rPr>
-      </w:pPr>
-      <w:r>
-        <w:rPr>
-          <w:rFonts w:ascii="Arial" w:hAnsi="Arial" w:cs="Arial"/>
-          <w:b/>
-          <w:bCs/>
-          <w:color w:val="auto"/>
-          <w:sz w:val="24"/>
-          <w:szCs w:val="24"/>
-          <w:u w:val="single"/>
-        </w:rPr>
-        <w:t xml:space="preserve">SUSUNAN TIM INOVASI</w:t>
-      </w:r>
-    </w:p>
-    <w:p/>
-    <w:tbl>
-      <w:tblPr>
-        <w:tblW w:w="9360" w:type="dxa"/>
-        <w:tblBorders>
-          <w:top w:val="single" w:sz="4" w:space="0" w:color="auto"/>
-          <w:left w:val="single" w:sz="4" w:space="0" w:color="auto"/>
-          <w:bottom w:val="single" w:sz="4" w:space="0" w:color="auto"/>
-          <w:right w:val="single" w:sz="4" w:space="0" w:color="auto"/>
-          <w:insideH w:val="single" w:sz="4" w:space="0" w:color="auto"/>
-          <w:insideV w:val="single" w:sz="4" w:space="0" w:color="auto"/>
-        </w:tblBorders>
-        <w:tblCellMar>
-          <w:left w:w="10" w:type="dxa"/>
-          <w:right w:w="10" w:type="dxa"/>
-        </w:tblCellMar>
-        <w:tblLook w:val="04A0" w:firstRow="1" w:lastRow="0" w:firstColumn="1" w:lastColumn="0" w:noHBand="0" w:noVBand="1"/>
-      </w:tblPr>
-      <w:tblGrid>
-        <w:gridCol w:w="620"/>
-        <w:gridCol w:w="3484"/>
-        <w:gridCol w:w="3748"/>
-        <w:gridCol w:w="1508"/>
-      </w:tblGrid>
-      <w:tr>
-        <w:tblPrEx>
-          <w:tblCellMar>
-            <w:top w:w="0" w:type="dxa"/>
-            <w:bottom w:w="0" w:type="dxa"/>
-          </w:tblCellMar>
-        </w:tblPrEx>
-        <w:tc>
-          <w:tcPr>
-            <w:tcW w:w="620" w:type="dxa"/>
-            <w:tcMar>
-              <w:top w:w="80" w:type="dxa"/>
-              <w:left w:w="100" w:type="dxa"/>
-              <w:bottom w:w="80" w:type="dxa"/>
-              <w:right w:w="100" w:type="dxa"/>
-            </w:tcMar>
-          </w:tcPr>
-          <w:p>
-            <w:pPr>
-              <w:spacing w:after="0" w:line="240" w:lineRule="auto"/>
-              <w:rPr>
-                <w:rFonts w:ascii="Arial" w:hAnsi="Arial" w:cs="Arial"/>
-                <w:sz w:val="24"/>
-                <w:szCs w:val="24"/>
-              </w:rPr>
-            </w:pPr>
-            <w:r>
-              <w:rPr>
-                <w:rFonts w:ascii="Arial" w:hAnsi="Arial" w:cs="Arial"/>
-                <w:b/>
-                <w:bCs/>
-                <w:sz w:val="24"/>
-                <w:szCs w:val="24"/>
-              </w:rPr>
-              <w:t xml:space="preserve">No</w:t>
-            </w:r>
-          </w:p>
-        </w:tc>
-        <w:tc>
-          <w:tcPr>
-            <w:tcW w:w="3484" w:type="dxa"/>
-            <w:tcMar>
-              <w:top w:w="80" w:type="dxa"/>
-              <w:left w:w="100" w:type="dxa"/>
-              <w:bottom w:w="80" w:type="dxa"/>
-              <w:right w:w="100" w:type="dxa"/>
-            </w:tcMar>
-          </w:tcPr>
-          <w:p>
-            <w:pPr>
-              <w:spacing w:after="0" w:line="240" w:lineRule="auto"/>
-              <w:rPr>
-                <w:rFonts w:ascii="Arial" w:hAnsi="Arial" w:cs="Arial"/>
-                <w:sz w:val="24"/>
-                <w:szCs w:val="24"/>
-              </w:rPr>
-            </w:pPr>
-            <w:r>
-              <w:rPr>
-                <w:rFonts w:ascii="Arial" w:hAnsi="Arial" w:cs="Arial"/>
-                <w:b/>
-                <w:bCs/>
-                <w:sz w:val="24"/>
-                <w:szCs w:val="24"/>
-              </w:rPr>
-              <w:t xml:space="preserve">Nama</w:t>
-            </w:r>
-          </w:p>
-        </w:tc>
-        <w:tc>
-          <w:tcPr>
-            <w:tcW w:w="3748" w:type="dxa"/>
-            <w:tcMar>
-              <w:top w:w="80" w:type="dxa"/>
-              <w:left w:w="100" w:type="dxa"/>
-              <w:bottom w:w="80" w:type="dxa"/>
-              <w:right w:w="100" w:type="dxa"/>
-            </w:tcMar>
-          </w:tcPr>
-          <w:p>
-            <w:pPr>
-              <w:spacing w:after="0" w:line="240" w:lineRule="auto"/>
-              <w:rPr>
-                <w:rFonts w:ascii="Arial" w:hAnsi="Arial" w:cs="Arial"/>
-                <w:sz w:val="24"/>
-                <w:szCs w:val="24"/>
-              </w:rPr>
-            </w:pPr>
-            <w:r>
-              <w:rPr>
-                <w:rFonts w:ascii="Arial" w:hAnsi="Arial" w:cs="Arial"/>
-                <w:b/>
-                <w:bCs/>
-                <w:sz w:val="24"/>
-                <w:szCs w:val="24"/>
-              </w:rPr>
-              <w:t xml:space="preserve">Jabatan</w:t>
-            </w:r>
-          </w:p>
-        </w:tc>
-        <w:tc>
-          <w:tcPr>
-            <w:tcW w:w="1508" w:type="dxa"/>
-            <w:tcMar>
-              <w:top w:w="80" w:type="dxa"/>
-              <w:left w:w="100" w:type="dxa"/>
-              <w:bottom w:w="80" w:type="dxa"/>
-              <w:right w:w="100" w:type="dxa"/>
-            </w:tcMar>
-          </w:tcPr>
-          <w:p>
-            <w:pPr>
-              <w:spacing w:after="0" w:line="240" w:lineRule="auto"/>
-              <w:rPr>
-                <w:rFonts w:ascii="Arial" w:hAnsi="Arial" w:cs="Arial"/>
-                <w:sz w:val="24"/>
-                <w:szCs w:val="24"/>
-              </w:rPr>
-            </w:pPr>
-            <w:proofErr w:type="spellStart"/>
-            <w:r>
-              <w:rPr>
-                <w:rFonts w:ascii="Arial" w:hAnsi="Arial" w:cs="Arial"/>
-                <w:b/>
-                <w:bCs/>
-                <w:sz w:val="24"/>
-                <w:szCs w:val="24"/>
-              </w:rPr>
-              <w:t xml:space="preserve">Kedudukan dalam Tim</w:t>
-            </w:r>
-            <w:proofErr w:type="spellEnd"/>
-          </w:p>
-        </w:tc>
-      </w:tr>
-      <w:tr>
-        <w:tblPrEx>
-          <w:tblCellMar>
-            <w:top w:w="0" w:type="dxa"/>
-            <w:bottom w:w="0" w:type="dxa"/>
-          </w:tblCellMar>
-        </w:tblPrEx>
-        <w:tc>
-          <w:tcPr>
-            <w:tcW w:w="620" w:type="dxa"/>
-            <w:tcMar>
-              <w:top w:w="80" w:type="dxa"/>
-              <w:left w:w="100" w:type="dxa"/>
-              <w:bottom w:w="80" w:type="dxa"/>
-              <w:right w:w="100" w:type="dxa"/>
-            </w:tcMar>
-          </w:tcPr>
-          <w:p>
-            <w:pPr>
-              <w:spacing w:after="0" w:line="240" w:lineRule="auto"/>
-              <w:rPr>
-                <w:rFonts w:ascii="Arial" w:hAnsi="Arial" w:cs="Arial"/>
-                <w:sz w:val="24"/>
-                <w:szCs w:val="24"/>
-              </w:rPr>
-            </w:pPr>
-            <w:r>
-              <w:rPr>
-                <w:rFonts w:ascii="Arial" w:hAnsi="Arial" w:cs="Arial"/>
-                <w:sz w:val="24"/>
-                <w:szCs w:val="24"/>
-              </w:rPr>
-              <w:t xml:space="preserve">1</w:t>
-            </w:r>
-          </w:p>
-        </w:tc>
-        <w:tc>
-          <w:tcPr>
-            <w:tcW w:w="3484" w:type="dxa"/>
-            <w:tcMar>
-              <w:top w:w="80" w:type="dxa"/>
-              <w:left w:w="100" w:type="dxa"/>
-              <w:bottom w:w="80" w:type="dxa"/>
-              <w:right w:w="100" w:type="dxa"/>
-            </w:tcMar>
-          </w:tcPr>
-          <w:p>
-            <w:pPr>
-              <w:spacing w:after="0" w:line="240" w:lineRule="auto"/>
-              <w:rPr>
-                <w:rFonts w:ascii="Arial" w:hAnsi="Arial" w:cs="Arial"/>
-                <w:sz w:val="24"/>
-                <w:szCs w:val="24"/>
-              </w:rPr>
-            </w:pPr>
-            <w:r>
-              <w:rPr>
-                <w:rFonts w:ascii="Arial" w:hAnsi="Arial" w:cs="Arial"/>
-                <w:sz w:val="24"/>
-                <w:szCs w:val="24"/>
-              </w:rPr>
-              <w:t xml:space="preserve">Anugrah Yega Pranatha, M.Si.</w:t>
-            </w:r>
-          </w:p>
-        </w:tc>
-        <w:tc>
-          <w:tcPr>
-            <w:tcW w:w="3748" w:type="dxa"/>
-            <w:tcMar>
-              <w:top w:w="80" w:type="dxa"/>
-              <w:left w:w="100" w:type="dxa"/>
-              <w:bottom w:w="80" w:type="dxa"/>
-              <w:right w:w="100" w:type="dxa"/>
-            </w:tcMar>
-          </w:tcPr>
-          <w:p>
-            <w:pPr>
-              <w:spacing w:after="0" w:line="240" w:lineRule="auto"/>
-              <w:rPr>
-                <w:rFonts w:ascii="Arial" w:hAnsi="Arial" w:cs="Arial"/>
-                <w:sz w:val="24"/>
-                <w:szCs w:val="24"/>
-              </w:rPr>
-            </w:pPr>
-            <w:r>
-              <w:rPr>
-                <w:rFonts w:ascii="Arial" w:hAnsi="Arial" w:cs="Arial"/>
-                <w:sz w:val="24"/>
-                <w:szCs w:val="24"/>
-              </w:rPr>
-              <w:t xml:space="preserve">Kepala Bagian Protokol dan Komunikasi Pimpinan</w:t>
-            </w:r>
-          </w:p>
-        </w:tc>
-        <w:tc>
-          <w:tcPr>
-            <w:tcW w:w="1508" w:type="dxa"/>
-            <w:tcMar>
-              <w:top w:w="80" w:type="dxa"/>
-              <w:left w:w="100" w:type="dxa"/>
-              <w:bottom w:w="80" w:type="dxa"/>
-              <w:right w:w="100" w:type="dxa"/>
-            </w:tcMar>
-          </w:tcPr>
-          <w:p>
-            <w:pPr>
-              <w:spacing w:after="0" w:line="240" w:lineRule="auto"/>
-              <w:rPr>
-                <w:rFonts w:ascii="Arial" w:hAnsi="Arial" w:cs="Arial"/>
-                <w:sz w:val="24"/>
-                <w:szCs w:val="24"/>
-              </w:rPr>
-            </w:pPr>
-            <w:proofErr w:type="spellStart"/>
-            <w:r>
-              <w:rPr>
-                <w:rFonts w:ascii="Arial" w:hAnsi="Arial" w:cs="Arial"/>
-                <w:sz w:val="24"/>
-                <w:szCs w:val="24"/>
-              </w:rPr>
-              <w:t xml:space="preserve">Ketua</w:t>
-            </w:r>
-            <w:proofErr w:type="spellEnd"/>
-            <w:r>
-              <w:rPr>
-                <w:rFonts w:ascii="Arial" w:hAnsi="Arial" w:cs="Arial"/>
-                <w:sz w:val="24"/>
-                <w:szCs w:val="24"/>
-              </w:rPr>
-              <w:t xml:space="preserve"/>
-            </w:r>
-          </w:p>
-        </w:tc>
-      </w:tr>
-      <w:tr>
-        <w:tblPrEx>
-          <w:tblCellMar>
-            <w:top w:w="0" w:type="dxa"/>
-            <w:bottom w:w="0" w:type="dxa"/>
-          </w:tblCellMar>
-        </w:tblPrEx>
-        <w:tc>
-          <w:tcPr>
-            <w:tcW w:w="620" w:type="dxa"/>
-            <w:tcMar>
-              <w:top w:w="80" w:type="dxa"/>
-              <w:left w:w="100" w:type="dxa"/>
-              <w:bottom w:w="80" w:type="dxa"/>
-              <w:right w:w="100" w:type="dxa"/>
-            </w:tcMar>
-          </w:tcPr>
-          <w:p>
-            <w:pPr>
-              <w:spacing w:after="0" w:line="240" w:lineRule="auto"/>
-              <w:rPr>
-                <w:rFonts w:ascii="Arial" w:hAnsi="Arial" w:cs="Arial"/>
-                <w:sz w:val="24"/>
-                <w:szCs w:val="24"/>
-              </w:rPr>
-            </w:pPr>
-            <w:proofErr w:type="spellStart"/>
-            <w:r>
-              <w:rPr>
-                <w:rFonts w:ascii="Arial" w:hAnsi="Arial" w:cs="Arial"/>
-                <w:sz w:val="24"/>
-                <w:szCs w:val="24"/>
-              </w:rPr>
-              <w:t xml:space="preserve">2</w:t>
-            </w:r>
-            <w:proofErr w:type="spellEnd"/>
-          </w:p>
-        </w:tc>
-        <w:tc>
-          <w:tcPr>
-            <w:tcW w:w="3484" w:type="dxa"/>
-            <w:tcMar>
-              <w:top w:w="80" w:type="dxa"/>
-              <w:left w:w="100" w:type="dxa"/>
-              <w:bottom w:w="80" w:type="dxa"/>
-              <w:right w:w="100" w:type="dxa"/>
-            </w:tcMar>
-          </w:tcPr>
-          <w:p>
-            <w:pPr>
-              <w:spacing w:after="0" w:line="240" w:lineRule="auto"/>
-              <w:rPr>
-                <w:rFonts w:ascii="Arial" w:hAnsi="Arial" w:cs="Arial"/>
-                <w:sz w:val="24"/>
-                <w:szCs w:val="24"/>
-              </w:rPr>
-            </w:pPr>
-            <w:r>
-              <w:rPr>
-                <w:rFonts w:ascii="Arial" w:hAnsi="Arial" w:cs="Arial"/>
-                <w:sz w:val="24"/>
-                <w:szCs w:val="24"/>
-              </w:rPr>
-              <w:t xml:space="preserve">Saifullah, S.H.</w:t>
-            </w:r>
-          </w:p>
-        </w:tc>
-        <w:tc>
-          <w:tcPr>
-            <w:tcW w:w="3748" w:type="dxa"/>
-            <w:tcMar>
-              <w:top w:w="80" w:type="dxa"/>
-              <w:left w:w="100" w:type="dxa"/>
-              <w:bottom w:w="80" w:type="dxa"/>
-              <w:right w:w="100" w:type="dxa"/>
-            </w:tcMar>
-          </w:tcPr>
-          <w:p>
-            <w:pPr>
-              <w:spacing w:after="0" w:line="240" w:lineRule="auto"/>
-              <w:rPr>
-                <w:rFonts w:ascii="Arial" w:hAnsi="Arial" w:cs="Arial"/>
-                <w:sz w:val="24"/>
-                <w:szCs w:val="24"/>
-              </w:rPr>
-            </w:pPr>
-            <w:r>
-              <w:rPr>
-                <w:rFonts w:ascii="Arial" w:hAnsi="Arial" w:cs="Arial"/>
-                <w:sz w:val="24"/>
-                <w:szCs w:val="24"/>
-              </w:rPr>
-              <w:t xml:space="preserve">Kepala Sub Bagian Protokol</w:t>
-            </w:r>
-          </w:p>
-        </w:tc>
-        <w:tc>
-          <w:tcPr>
-            <w:tcW w:w="1508" w:type="dxa"/>
-            <w:tcMar>
-              <w:top w:w="80" w:type="dxa"/>
-              <w:left w:w="100" w:type="dxa"/>
-              <w:bottom w:w="80" w:type="dxa"/>
-              <w:right w:w="100" w:type="dxa"/>
-            </w:tcMar>
-          </w:tcPr>
-          <w:p>
-            <w:pPr>
-              <w:spacing w:after="0" w:line="240" w:lineRule="auto"/>
-              <w:rPr>
-                <w:rFonts w:ascii="Arial" w:hAnsi="Arial" w:cs="Arial"/>
-                <w:sz w:val="24"/>
-                <w:szCs w:val="24"/>
-              </w:rPr>
-            </w:pPr>
-            <w:r>
-              <w:rPr>
-                <w:rFonts w:ascii="Arial" w:hAnsi="Arial" w:cs="Arial"/>
-                <w:sz w:val="24"/>
-                <w:szCs w:val="24"/>
-              </w:rPr>
-              <w:t xml:space="preserve">Anggota</w:t>
-            </w:r>
-            <w:proofErr w:type="spellStart"/>
-            <w:r>
-              <w:rPr>
-                <w:rFonts w:ascii="Arial" w:hAnsi="Arial" w:cs="Arial"/>
-                <w:sz w:val="24"/>
-                <w:szCs w:val="24"/>
-              </w:rPr>
-              <w:t xml:space="preserve"/>
-            </w:r>
-            <w:proofErr w:type="spellEnd"/>
-            <w:r>
-              <w:rPr>
-                <w:rFonts w:ascii="Arial" w:hAnsi="Arial" w:cs="Arial"/>
-                <w:sz w:val="24"/>
-                <w:szCs w:val="24"/>
-              </w:rPr>
-              <w:t xml:space="preserve"/>
-            </w:r>
-          </w:p>
-        </w:tc>
-      </w:tr>
-      <w:tr>
-        <w:tblPrEx>
-          <w:tblCellMar>
-            <w:top w:w="0" w:type="dxa"/>
-            <w:bottom w:w="0" w:type="dxa"/>
-          </w:tblCellMar>
-        </w:tblPrEx>
-        <w:tc>
-          <w:tcPr>
-            <w:tcW w:w="620" w:type="dxa"/>
-            <w:tcMar>
-              <w:top w:w="80" w:type="dxa"/>
-              <w:left w:w="100" w:type="dxa"/>
-              <w:bottom w:w="80" w:type="dxa"/>
-              <w:right w:w="100" w:type="dxa"/>
-            </w:tcMar>
-          </w:tcPr>
-          <w:p>
-            <w:pPr>
-              <w:spacing w:after="0" w:line="240" w:lineRule="auto"/>
-              <w:rPr>
-                <w:rFonts w:ascii="Arial" w:hAnsi="Arial" w:cs="Arial"/>
-                <w:sz w:val="24"/>
-                <w:szCs w:val="24"/>
-              </w:rPr>
-            </w:pPr>
-            <w:proofErr w:type="spellStart"/>
-            <w:r>
-              <w:rPr>
-                <w:rFonts w:ascii="Arial" w:hAnsi="Arial" w:cs="Arial"/>
-                <w:sz w:val="24"/>
-                <w:szCs w:val="24"/>
-              </w:rPr>
-              <w:t xml:space="preserve">3</w:t>
-            </w:r>
-            <w:proofErr w:type="spellEnd"/>
-            <w:r>
-              <w:rPr>
-                <w:rFonts w:ascii="Arial" w:hAnsi="Arial" w:cs="Arial"/>
-                <w:sz w:val="24"/>
-                <w:szCs w:val="24"/>
-              </w:rPr>
-              <w:t xml:space="preserve"/>
-            </w:r>
-          </w:p>
-        </w:tc>
-        <w:tc>
-          <w:tcPr>
-            <w:tcW w:w="3484" w:type="dxa"/>
-            <w:tcMar>
-              <w:top w:w="80" w:type="dxa"/>
-              <w:left w:w="100" w:type="dxa"/>
-              <w:bottom w:w="80" w:type="dxa"/>
-              <w:right w:w="100" w:type="dxa"/>
-            </w:tcMar>
-          </w:tcPr>
-          <w:p>
-            <w:pPr>
-              <w:spacing w:after="0" w:line="240" w:lineRule="auto"/>
-              <w:rPr>
-                <w:rFonts w:ascii="Arial" w:hAnsi="Arial" w:cs="Arial"/>
-                <w:sz w:val="24"/>
-                <w:szCs w:val="24"/>
-              </w:rPr>
-            </w:pPr>
-            <w:r>
-              <w:rPr>
-                <w:rFonts w:ascii="Arial" w:hAnsi="Arial" w:cs="Arial"/>
-                <w:sz w:val="24"/>
-                <w:szCs w:val="24"/>
-              </w:rPr>
-              <w:t xml:space="preserve">Juliyanti, S.AP.</w:t>
-            </w:r>
-          </w:p>
-        </w:tc>
-        <w:tc>
-          <w:tcPr>
-            <w:tcW w:w="3748" w:type="dxa"/>
-            <w:tcMar>
-              <w:top w:w="80" w:type="dxa"/>
-              <w:left w:w="100" w:type="dxa"/>
-              <w:bottom w:w="80" w:type="dxa"/>
-              <w:right w:w="100" w:type="dxa"/>
-            </w:tcMar>
-          </w:tcPr>
-          <w:p>
-            <w:pPr>
-              <w:spacing w:after="0" w:line="240" w:lineRule="auto"/>
-              <w:rPr>
-                <w:rFonts w:ascii="Arial" w:hAnsi="Arial" w:cs="Arial"/>
-                <w:sz w:val="24"/>
-                <w:szCs w:val="24"/>
-              </w:rPr>
-            </w:pPr>
-            <w:proofErr w:type="spellStart"/>
-            <w:r>
-              <w:rPr>
-                <w:rFonts w:ascii="Arial" w:hAnsi="Arial" w:cs="Arial"/>
-                <w:sz w:val="24"/>
-                <w:szCs w:val="24"/>
-              </w:rPr>
-              <w:t xml:space="preserve">Kepala Sub Bagian Komunikasi dan Dokumentasi Pimpinan</w:t>
-            </w:r>
-            <w:proofErr w:type="spellEnd"/>
-            <w:r>
-              <w:rPr>
-                <w:rFonts w:ascii="Arial" w:hAnsi="Arial" w:cs="Arial"/>
-                <w:sz w:val="24"/>
-                <w:szCs w:val="24"/>
-              </w:rPr>
-              <w:t xml:space="preserve"/>
-            </w:r>
-          </w:p>
-        </w:tc>
-        <w:tc>
-          <w:tcPr>
-            <w:tcW w:w="1508" w:type="dxa"/>
-            <w:tcMar>
-              <w:top w:w="80" w:type="dxa"/>
-              <w:left w:w="100" w:type="dxa"/>
-              <w:bottom w:w="80" w:type="dxa"/>
-              <w:right w:w="100" w:type="dxa"/>
-            </w:tcMar>
-          </w:tcPr>
-          <w:p>
-            <w:pPr>
-              <w:spacing w:after="0" w:line="240" w:lineRule="auto"/>
-              <w:rPr>
-                <w:rFonts w:ascii="Arial" w:hAnsi="Arial" w:cs="Arial"/>
-                <w:sz w:val="24"/>
-                <w:szCs w:val="24"/>
-              </w:rPr>
-            </w:pPr>
-            <w:r>
-              <w:rPr>
-                <w:rFonts w:ascii="Arial" w:hAnsi="Arial" w:cs="Arial"/>
-                <w:sz w:val="24"/>
-                <w:szCs w:val="24"/>
-              </w:rPr>
-              <w:t xml:space="preserve">Anggota</w:t>
-            </w:r>
-            <w:proofErr w:type="spellStart"/>
-            <w:r>
-              <w:rPr>
-                <w:rFonts w:ascii="Arial" w:hAnsi="Arial" w:cs="Arial"/>
-                <w:sz w:val="24"/>
-                <w:szCs w:val="24"/>
-              </w:rPr>
-              <w:t xml:space="preserve"/>
-            </w:r>
-            <w:proofErr w:type="spellEnd"/>
-            <w:r>
-              <w:rPr>
-                <w:rFonts w:ascii="Arial" w:hAnsi="Arial" w:cs="Arial"/>
-                <w:sz w:val="24"/>
-                <w:szCs w:val="24"/>
-              </w:rPr>
-              <w:t xml:space="preserve"/>
-            </w:r>
-          </w:p>
-        </w:tc>
-      </w:tr>
-      <w:tr>
-        <w:tblPrEx>
-          <w:tblCellMar>
-            <w:top w:w="0" w:type="dxa"/>
-            <w:bottom w:w="0" w:type="dxa"/>
-          </w:tblCellMar>
-        </w:tblPrEx>
-        <w:tc>
-          <w:tcPr>
-            <w:tcW w:w="620" w:type="dxa"/>
-            <w:tcMar>
-              <w:top w:w="80" w:type="dxa"/>
-              <w:left w:w="100" w:type="dxa"/>
-              <w:bottom w:w="80" w:type="dxa"/>
-              <w:right w:w="100" w:type="dxa"/>
-            </w:tcMar>
-          </w:tcPr>
-          <w:p>
-            <w:pPr>
-              <w:spacing w:after="0" w:line="240" w:lineRule="auto"/>
-              <w:rPr>
-                <w:rFonts w:ascii="Arial" w:hAnsi="Arial" w:cs="Arial"/>
-                <w:sz w:val="24"/>
-                <w:szCs w:val="24"/>
-              </w:rPr>
-            </w:pPr>
-            <w:r>
-              <w:rPr>
-                <w:rFonts w:ascii="Arial" w:hAnsi="Arial" w:cs="Arial"/>
-                <w:sz w:val="24"/>
-                <w:szCs w:val="24"/>
-              </w:rPr>
-              <w:t xml:space="preserve">4</w:t>
-            </w:r>
-          </w:p>
-        </w:tc>
-        <w:tc>
-          <w:tcPr>
-            <w:tcW w:w="3484" w:type="dxa"/>
-            <w:tcMar>
-              <w:top w:w="80" w:type="dxa"/>
-              <w:left w:w="100" w:type="dxa"/>
-              <w:bottom w:w="80" w:type="dxa"/>
-              <w:right w:w="100" w:type="dxa"/>
-            </w:tcMar>
-          </w:tcPr>
-          <w:p>
-            <w:pPr>
-              <w:spacing w:after="0" w:line="240" w:lineRule="auto"/>
-              <w:rPr>
-                <w:rFonts w:ascii="Arial" w:hAnsi="Arial" w:cs="Arial"/>
-                <w:sz w:val="24"/>
-                <w:szCs w:val="24"/>
-              </w:rPr>
-            </w:pPr>
-            <w:r>
-              <w:rPr>
-                <w:rFonts w:ascii="Arial" w:hAnsi="Arial" w:cs="Arial"/>
-                <w:sz w:val="24"/>
-                <w:szCs w:val="24"/>
-              </w:rPr>
-              <w:t xml:space="preserve">Pebriadi Banne, S.IP.</w:t>
-            </w:r>
-          </w:p>
-        </w:tc>
-        <w:tc>
-          <w:tcPr>
-            <w:tcW w:w="3748" w:type="dxa"/>
-            <w:tcMar>
-              <w:top w:w="80" w:type="dxa"/>
-              <w:left w:w="100" w:type="dxa"/>
-              <w:bottom w:w="80" w:type="dxa"/>
-              <w:right w:w="100" w:type="dxa"/>
-            </w:tcMar>
-          </w:tcPr>
-          <w:p>
-            <w:pPr>
-              <w:spacing w:after="0" w:line="240" w:lineRule="auto"/>
-              <w:rPr>
-                <w:rFonts w:ascii="Arial" w:hAnsi="Arial" w:cs="Arial"/>
-                <w:sz w:val="24"/>
-                <w:szCs w:val="24"/>
-              </w:rPr>
-            </w:pPr>
-            <w:r>
-              <w:rPr>
-                <w:rFonts w:ascii="Arial" w:hAnsi="Arial" w:cs="Arial"/>
-                <w:sz w:val="24"/>
-                <w:szCs w:val="24"/>
-              </w:rPr>
-              <w:t xml:space="preserve">Pengelola Layanan Operasional</w:t>
-            </w:r>
-            <w:proofErr w:type="spellStart"/>
-            <w:r>
-              <w:rPr>
-                <w:rFonts w:ascii="Arial" w:hAnsi="Arial" w:cs="Arial"/>
-                <w:sz w:val="24"/>
-                <w:szCs w:val="24"/>
-              </w:rPr>
-              <w:t xml:space="preserve"/>
-            </w:r>
-            <w:proofErr w:type="spellEnd"/>
-            <w:r>
-              <w:rPr>
-                <w:rFonts w:ascii="Arial" w:hAnsi="Arial" w:cs="Arial"/>
-                <w:sz w:val="24"/>
-                <w:szCs w:val="24"/>
-              </w:rPr>
-              <w:t xml:space="preserve"/>
-            </w:r>
-            <w:proofErr w:type="spellStart"/>
-            <w:r>
-              <w:rPr>
-                <w:rFonts w:ascii="Arial" w:hAnsi="Arial" w:cs="Arial"/>
-                <w:sz w:val="24"/>
-                <w:szCs w:val="24"/>
-              </w:rPr>
-              <w:t xml:space="preserve"/>
-            </w:r>
-            <w:proofErr w:type="spellEnd"/>
-          </w:p>
-        </w:tc>
-        <w:tc>
-          <w:tcPr>
-            <w:tcW w:w="1508" w:type="dxa"/>
-            <w:tcMar>
-              <w:top w:w="80" w:type="dxa"/>
-              <w:left w:w="100" w:type="dxa"/>
-              <w:bottom w:w="80" w:type="dxa"/>
-              <w:right w:w="100" w:type="dxa"/>
-            </w:tcMar>
-          </w:tcPr>
-          <w:p>
-            <w:pPr>
-              <w:spacing w:after="0" w:line="240" w:lineRule="auto"/>
-              <w:rPr>
-                <w:rFonts w:ascii="Arial" w:hAnsi="Arial" w:cs="Arial"/>
-                <w:sz w:val="24"/>
-                <w:szCs w:val="24"/>
-              </w:rPr>
-            </w:pPr>
-            <w:r>
-              <w:rPr>
-                <w:rFonts w:ascii="Arial" w:hAnsi="Arial" w:cs="Arial"/>
-                <w:sz w:val="24"/>
-                <w:szCs w:val="24"/>
-              </w:rPr>
-              <w:t xml:space="preserve">Anggota</w:t>
-            </w:r>
-          </w:p>
-        </w:tc>
-      </w:tr>
-      <w:tr>
-        <w:tblPrEx>
-          <w:tblCellMar>
-            <w:top w:w="0" w:type="dxa"/>
-            <w:bottom w:w="0" w:type="dxa"/>
-          </w:tblCellMar>
-        </w:tblPrEx>
-        <w:tc>
-          <w:tcPr>
-            <w:tcW w:w="620" w:type="dxa"/>
-            <w:tcMar>
-              <w:top w:w="80" w:type="dxa"/>
-              <w:left w:w="100" w:type="dxa"/>
-              <w:bottom w:w="80" w:type="dxa"/>
-              <w:right w:w="100" w:type="dxa"/>
-            </w:tcMar>
-          </w:tcPr>
-          <w:p>
-            <w:pPr>
-              <w:spacing w:after="0" w:line="240" w:lineRule="auto"/>
-              <w:rPr>
-                <w:rFonts w:ascii="Arial" w:hAnsi="Arial" w:cs="Arial"/>
-                <w:sz w:val="24"/>
-                <w:szCs w:val="24"/>
-              </w:rPr>
-            </w:pPr>
-            <w:r>
-              <w:rPr>
-                <w:rFonts w:ascii="Arial" w:hAnsi="Arial" w:cs="Arial"/>
-                <w:sz w:val="24"/>
-                <w:szCs w:val="24"/>
-              </w:rPr>
-              <w:t xml:space="preserve">5</w:t>
-            </w:r>
-          </w:p>
-        </w:tc>
-        <w:tc>
-          <w:tcPr>
-            <w:tcW w:w="3484" w:type="dxa"/>
-            <w:tcMar>
-              <w:top w:w="80" w:type="dxa"/>
-              <w:left w:w="100" w:type="dxa"/>
-              <w:bottom w:w="80" w:type="dxa"/>
-              <w:right w:w="100" w:type="dxa"/>
-            </w:tcMar>
-          </w:tcPr>
-          <w:p>
-            <w:pPr>
-              <w:spacing w:after="0" w:line="240" w:lineRule="auto"/>
-              <w:rPr>
-                <w:rFonts w:ascii="Arial" w:hAnsi="Arial" w:cs="Arial"/>
-                <w:sz w:val="24"/>
-                <w:szCs w:val="24"/>
-              </w:rPr>
-            </w:pPr>
-            <w:r>
-              <w:rPr>
-                <w:rFonts w:ascii="Arial" w:hAnsi="Arial" w:cs="Arial"/>
-                <w:sz w:val="24"/>
-                <w:szCs w:val="24"/>
-              </w:rPr>
-              <w:t xml:space="preserve">Nuraini Wiliadewi, S.IP.</w:t>
-            </w:r>
-          </w:p>
-        </w:tc>
-        <w:tc>
-          <w:tcPr>
-            <w:tcW w:w="3748" w:type="dxa"/>
-            <w:tcMar>
-              <w:top w:w="80" w:type="dxa"/>
-              <w:left w:w="100" w:type="dxa"/>
-              <w:bottom w:w="80" w:type="dxa"/>
-              <w:right w:w="100" w:type="dxa"/>
-            </w:tcMar>
-          </w:tcPr>
-          <w:p>
-            <w:pPr>
-              <w:spacing w:after="0" w:line="240" w:lineRule="auto"/>
-              <w:rPr>
-                <w:rFonts w:ascii="Arial" w:hAnsi="Arial" w:cs="Arial"/>
-                <w:sz w:val="24"/>
-                <w:szCs w:val="24"/>
-              </w:rPr>
-            </w:pPr>
-            <w:r>
-              <w:rPr>
-                <w:rFonts w:ascii="Arial" w:hAnsi="Arial" w:cs="Arial"/>
-                <w:sz w:val="24"/>
-                <w:szCs w:val="24"/>
-              </w:rPr>
-              <w:t xml:space="preserve">Penelaah Teknis Kebijakan</w:t>
-            </w:r>
-            <w:proofErr w:type="spellStart"/>
-            <w:r>
-              <w:rPr>
-                <w:rFonts w:ascii="Arial" w:hAnsi="Arial" w:cs="Arial"/>
-                <w:sz w:val="24"/>
-                <w:szCs w:val="24"/>
-              </w:rPr>
-              <w:t xml:space="preserve"/>
-            </w:r>
-            <w:proofErr w:type="spellEnd"/>
-          </w:p>
-        </w:tc>
-        <w:tc>
-          <w:tcPr>
-            <w:tcW w:w="1508" w:type="dxa"/>
-            <w:tcMar>
-              <w:top w:w="80" w:type="dxa"/>
-              <w:left w:w="100" w:type="dxa"/>
-              <w:bottom w:w="80" w:type="dxa"/>
-              <w:right w:w="100" w:type="dxa"/>
-            </w:tcMar>
-          </w:tcPr>
-          <w:p>
-            <w:pPr>
-              <w:spacing w:after="0" w:line="240" w:lineRule="auto"/>
-              <w:rPr>
-                <w:rFonts w:ascii="Arial" w:hAnsi="Arial" w:cs="Arial"/>
-                <w:sz w:val="24"/>
-                <w:szCs w:val="24"/>
-              </w:rPr>
-            </w:pPr>
-            <w:r>
-              <w:rPr>
-                <w:rFonts w:ascii="Arial" w:hAnsi="Arial" w:cs="Arial"/>
-                <w:sz w:val="24"/>
-                <w:szCs w:val="24"/>
-              </w:rPr>
-              <w:t xml:space="preserve">Anggota</w:t>
-            </w:r>
-          </w:p>
-        </w:tc>
-      </w:tr>
-    </w:tbl>
-    <w:p>
-      <w:pPr>
-        <w:spacing w:after="0" w:line="240" w:lineRule="auto"/>
-        <w:rPr>
-          <w:rFonts w:ascii="Arial" w:hAnsi="Arial" w:cs="Arial"/>
-          <w:sz w:val="24"/>
-          <w:szCs w:val="24"/>
-        </w:rPr>
-      </w:pPr>
-    </w:p>
-    <w:p>
-      <w:pPr>
-        <w:pStyle w:val="Judul1"/>
-        <w:spacing w:after="0" w:line="240" w:lineRule="auto"/>
-        <w:rPr>
-          <w:rFonts w:ascii="Arial" w:hAnsi="Arial" w:cs="Arial"/>
-          <w:b/>
-          <w:bCs/>
-          <w:color w:val="auto"/>
-          <w:sz w:val="24"/>
-          <w:szCs w:val="24"/>
-          <w:u w:val="single"/>
-        </w:rPr>
-      </w:pPr>
-      <w:r>
-        <w:rPr>
-          <w:rFonts w:ascii="Arial" w:hAnsi="Arial" w:cs="Arial"/>
-          <w:b/>
-          <w:bCs/>
-          <w:color w:val="auto"/>
-          <w:sz w:val="24"/>
-          <w:szCs w:val="24"/>
-          <w:u w:val="single"/>
-        </w:rPr>
-        <w:t xml:space="preserve">KONTAK KETUA TIM</w:t>
-      </w:r>
-    </w:p>
-    <w:p>
-      <w:pPr>
-        <w:spacing w:after="0" w:line="240" w:lineRule="auto"/>
-        <w:rPr>
-          <w:rFonts w:ascii="Arial" w:hAnsi="Arial" w:cs="Arial"/>
-          <w:sz w:val="24"/>
-          <w:szCs w:val="24"/>
-        </w:rPr>
-      </w:pPr>
-      <w:r>
-        <w:rPr>
-          <w:rFonts w:ascii="Arial" w:hAnsi="Arial" w:cs="Arial"/>
-          <w:sz w:val="24"/>
-          <w:szCs w:val="24"/>
-        </w:rPr>
-        <w:t xml:space="preserve">Nama: Anugrah Yega Pranatha, M.Si.</w:t>
-      </w:r>
-      <w:r>
-        <w:rPr>
-          <w:rFonts w:ascii="Arial" w:hAnsi="Arial" w:cs="Arial"/>
-          <w:sz w:val="24"/>
-          <w:szCs w:val="24"/>
-        </w:rPr>
-        <w:br/>
-        <w:t xml:space="preserve">Jabatan: Kepala Bagian Protokol dan Komunikasi Pimpinan</w:t>
-      </w:r>
-    </w:p>
-    <w:p>
-      <w:pPr>
-        <w:spacing w:after="0" w:line="240" w:lineRule="auto"/>
-        <w:rPr>
-          <w:rFonts w:ascii="Arial" w:hAnsi="Arial" w:cs="Arial"/>
-          <w:sz w:val="24"/>
-          <w:szCs w:val="24"/>
-        </w:rPr>
-      </w:pPr>
-      <w:r>
-        <w:rPr>
-          <w:rFonts w:ascii="Arial" w:hAnsi="Arial" w:cs="Arial"/>
-          <w:sz w:val="24"/>
-          <w:szCs w:val="24"/>
-        </w:rPr>
-        <w:t>Email: yega@tarakankota.go.id/anugrahyegapranatha@gmail.com</w:t>
-      </w:r>
-    </w:p>
-    <w:p>
-      <w:pPr>
-        <w:spacing w:after="0" w:line="240" w:lineRule="auto"/>
-        <w:rPr>
-          <w:rFonts w:ascii="Arial" w:hAnsi="Arial" w:cs="Arial"/>
-          <w:sz w:val="24"/>
-          <w:szCs w:val="24"/>
-        </w:rPr>
-      </w:pPr>
-      <w:proofErr w:type="spellStart"/>
-      <w:r>
-        <w:rPr>
-          <w:rFonts w:ascii="Arial" w:hAnsi="Arial" w:cs="Arial"/>
-          <w:sz w:val="24"/>
-          <w:szCs w:val="24"/>
-        </w:rPr>
-        <w:t xml:space="preserve">WhatsApp</w:t>
-      </w:r>
-      <w:proofErr w:type="spellEnd"/>
-      <w:r>
-        <w:rPr>
-          <w:rFonts w:ascii="Arial" w:hAnsi="Arial" w:cs="Arial"/>
-          <w:sz w:val="24"/>
-          <w:szCs w:val="24"/>
-        </w:rPr>
-        <w:t xml:space="preserve">: 0811-5900-394</w:t>
-      </w:r>
-    </w:p>
-    <w:p>
-      <w:pPr>
-        <w:spacing w:after="0" w:line="240" w:lineRule="auto"/>
-        <w:rPr>
-          <w:rFonts w:ascii="Arial" w:eastAsia="Calibri" w:hAnsi="Arial" w:cs="Arial"/>
-          <w:kern w:val="0"/>
-          <w:sz w:val="24"/>
-          <w:szCs w:val="24"/>
-          <w14:ligatures w14:val="none"/>
-        </w:rPr>
-      </w:pPr>
+        <w:spacing w:before="120" w:after="0" w:line="276" w:lineRule="auto"/>
+        <w:ind w:firstLine="709"/>
+        <w:jc w:val="both"/>
+        <w:rPr>
+          <w:rFonts w:ascii="Arial" w:eastAsia="Calibri" w:hAnsi="Arial" w:cs="Arial"/>
+          <w:sz w:val="24"/>
+          <w:szCs w:val="24"/>
+        </w:rPr>
+      </w:pPr>
+      <w:r>
+        <w:rPr>
+          <w:rFonts w:ascii="Arial" w:eastAsia="Calibri" w:hAnsi="Arial" w:cs="Arial"/>
+          <w:sz w:val="24"/>
+          <w:szCs w:val="24"/>
+        </w:rPr>
+        <w:t xml:space="preserve">Atas perhatian dan perkenan Bapak/Ibu, kami ucapkan terima kasih.</w:t>
+      </w:r>
     </w:p>
     <w:p>
       <w:pPr>
@@ -3115,29 +1077,7 @@
           <w:sz w:val="24"/>
           <w:szCs w:val="24"/>
         </w:rPr>
-        <w:t>${</w:t>
-      </w:r>
-      <w:proofErr w:type="spellStart"/>
-      <w:r>
-        <w:rPr>
-          <w:rFonts w:ascii="Arial" w:eastAsia="Calibri" w:hAnsi="Arial" w:cs="Arial"/>
-          <w:b/>
-          <w:bCs/>
-          <w:sz w:val="24"/>
-          <w:szCs w:val="24"/>
-        </w:rPr>
-        <w:t>jabatan_pengirim</w:t>
-      </w:r>
-      <w:proofErr w:type="spellEnd"/>
-      <w:r>
-        <w:rPr>
-          <w:rFonts w:ascii="Arial" w:eastAsia="Calibri" w:hAnsi="Arial" w:cs="Arial"/>
-          <w:b/>
-          <w:bCs/>
-          <w:sz w:val="24"/>
-          <w:szCs w:val="24"/>
-        </w:rPr>
-        <w:t>}</w:t>
+        <w:t>SEKRETARIS DAERAH</w:t>
       </w:r>
     </w:p>
     <w:p>
@@ -3381,6 +1321,68 @@
           <w:szCs w:val="24"/>
         </w:rPr>
         <w:t>}</w:t>
+      </w:r>
+    </w:p>
+    <w:p>
+      <w:pPr>
+        <w:spacing w:after="0" w:line="276" w:lineRule="auto"/>
+        <w:jc w:val="both"/>
+        <w:rPr>
+          <w:rFonts w:ascii="Arial" w:eastAsia="Calibri" w:hAnsi="Arial" w:cs="Arial"/>
+          <w:sz w:val="24"/>
+          <w:szCs w:val="24"/>
+        </w:rPr>
+      </w:pPr>
+    </w:p>
+    <w:p>
+      <w:pPr>
+        <w:spacing w:after="0" w:line="240" w:lineRule="auto"/>
+        <w:rPr>
+          <w:rFonts w:ascii="Arial" w:eastAsia="Times New Roman" w:hAnsi="Arial" w:cs="Arial"/>
+          <w:iCs/>
+          <w:kern w:val="0"/>
+          <w:sz w:val="20"/>
+          <w:szCs w:val="20"/>
+          <w:u w:val="single"/>
+          <w14:ligatures w14:val="none"/>
+        </w:rPr>
+      </w:pPr>
+      <w:r>
+        <w:rPr>
+          <w:rFonts w:ascii="Arial" w:eastAsia="Times New Roman" w:hAnsi="Arial" w:cs="Arial"/>
+          <w:iCs/>
+          <w:kern w:val="0"/>
+          <w:sz w:val="20"/>
+          <w:szCs w:val="20"/>
+          <w:u w:val="single"/>
+          <w14:ligatures w14:val="none"/>
+        </w:rPr>
+        <w:t>Tembusan :</w:t>
+      </w:r>
+    </w:p>
+    <w:p>
+      <w:pPr>
+        <w:spacing w:after="0" w:line="240" w:lineRule="auto"/>
+        <w:rPr>
+          <w:rFonts w:ascii="Arial" w:eastAsia="Times New Roman" w:hAnsi="Arial" w:cs="Arial"/>
+          <w:iCs/>
+          <w:kern w:val="0"/>
+          <w:sz w:val="20"/>
+          <w:szCs w:val="20"/>
+          <w:u w:val="single"/>
+          <w14:ligatures w14:val="none"/>
+        </w:rPr>
+      </w:pPr>
+      <w:r>
+        <w:rPr>
+          <w:rFonts w:ascii="Arial" w:eastAsia="Times New Roman" w:hAnsi="Arial" w:cs="Arial"/>
+          <w:iCs/>
+          <w:kern w:val="0"/>
+          <w:sz w:val="20"/>
+          <w:szCs w:val="20"/>
+          <w14:ligatures w14:val="none"/>
+        </w:rPr>
+        <w:t>Wali Kota Tarakan.</w:t>
       </w:r>
     </w:p>
     <w:sectPr>
@@ -3394,7 +1396,7 @@
 </file>
 
 <file path=word/numbering.xml><?xml version="1.0" encoding="utf-8"?>
-<w:numbering xmlns:wpc="http://schemas.microsoft.com/office/word/2010/wordprocessingCanvas" xmlns:cx="http://schemas.microsoft.com/office/drawing/2014/chartex" xmlns:cx1="http://schemas.microsoft.com/office/drawing/2015/9/8/chartex" xmlns:cx2="http://schemas.microsoft.com/office/drawing/2015/10/21/chartex" xmlns:cx3="http://schemas.microsoft.com/office/drawing/2016/5/9/chartex" xmlns:cx4="http://schemas.microsoft.com/office/drawing/2016/5/10/chartex" xmlns:cx5="http://schemas.microsoft.com/office/drawing/2016/5/11/chartex" xmlns:cx6="http://schemas.microsoft.com/office/drawing/2016/5/12/chartex" xmlns:cx7="http://schemas.microsoft.com/office/drawing/2016/5/13/chartex" xmlns:cx8="http://schemas.microsoft.com/office/drawing/2016/5/14/chartex" xmlns:mc="http://schemas.openxmlformats.org/markup-compatibility/2006" xmlns:aink="http://schemas.microsoft.com/office/drawing/2016/ink" xmlns:am3d="http://schemas.microsoft.com/office/drawing/2017/model3d" xmlns:o="urn:schemas-microsoft-com:office:office" xmlns:oel="http://schemas.microsoft.com/office/2019/extlst" xmlns:r="http://schemas.openxmlformats.org/officeDocument/2006/relationships" xmlns:m="http://schemas.openxmlformats.org/officeDocument/2006/math" xmlns:v="urn:schemas-microsoft-com:vml" xmlns:wp14="http://schemas.microsoft.com/office/word/2010/wordprocessingDrawing" xmlns:wp="http://schemas.openxmlformats.org/drawingml/2006/wordprocessingDrawing" xmlns:w10="urn:schemas-microsoft-com:office:word" xmlns:w="http://schemas.openxmlformats.org/wordprocessingml/2006/main" xmlns:w14="http://schemas.microsoft.com/office/word/2010/wordml" xmlns:w15="http://schemas.microsoft.com/office/word/2012/wordml" xmlns:w16cex="http://schemas.microsoft.com/office/word/2018/wordml/cex" xmlns:w16cid="http://schemas.microsoft.com/office/word/2016/wordml/cid" xmlns:w16="http://schemas.microsoft.com/office/word/2018/wordml" xmlns:w16du="http://schemas.microsoft.com/office/word/2023/wordml/word16du" xmlns:w16sdtdh="http://schemas.microsoft.com/office/word/2020/wordml/sdtdatahash" xmlns:w16sdtfl="http://schemas.microsoft.com/office/word/2024/wordml/sdtformatlock" xmlns:w16se="http://schemas.microsoft.com/office/word/2015/wordml/symex" xmlns:wpg="http://schemas.microsoft.com/office/word/2010/wordprocessingGroup" xmlns:wpi="http://schemas.microsoft.com/office/word/2010/wordprocessingInk" xmlns:wne="http://schemas.microsoft.com/office/word/2006/wordml" xmlns:wps="http://schemas.microsoft.com/office/word/2010/wordprocessingShape" mc:Ignorable="w14 w15 w16se w16cid w16 w16cex w16sdtdh w16sdtfl w16du wp14">
+<w:numbering xmlns:wpc="http://schemas.microsoft.com/office/word/2010/wordprocessingCanvas" xmlns:cx="http://schemas.microsoft.com/office/drawing/2014/chartex" xmlns:cx1="http://schemas.microsoft.com/office/drawing/2015/9/8/chartex" xmlns:cx2="http://schemas.microsoft.com/office/drawing/2015/10/21/chartex" xmlns:cx3="http://schemas.microsoft.com/office/drawing/2016/5/9/chartex" xmlns:cx4="http://schemas.microsoft.com/office/drawing/2016/5/10/chartex" xmlns:cx5="http://schemas.microsoft.com/office/drawing/2016/5/11/chartex" xmlns:cx6="http://schemas.microsoft.com/office/drawing/2016/5/12/chartex" xmlns:cx7="http://schemas.microsoft.com/office/drawing/2016/5/13/chartex" xmlns:cx8="http://schemas.microsoft.com/office/drawing/2016/5/14/chartex" xmlns:mc="http://schemas.openxmlformats.org/markup-compatibility/2006" xmlns:m="http://schemas.openxmlformats.org/officeDocument/2006/math" xmlns:aink="http://schemas.microsoft.com/office/drawing/2016/ink" xmlns:am3d="http://schemas.microsoft.com/office/drawing/2017/model3d" xmlns:oel="http://schemas.microsoft.com/office/2019/extlst" xmlns:r="http://schemas.openxmlformats.org/officeDocument/2006/relationships" xmlns:wp14="http://schemas.microsoft.com/office/word/2010/wordprocessingDrawing" xmlns:wp="http://schemas.openxmlformats.org/drawingml/2006/wordprocessingDrawing" xmlns:wpg="http://schemas.microsoft.com/office/word/2010/wordprocessingGroup" xmlns:wpi="http://schemas.microsoft.com/office/word/2010/wordprocessingInk" xmlns:wps="http://schemas.microsoft.com/office/word/2010/wordprocessingShape" xmlns:o="urn:schemas-microsoft-com:office:office" xmlns:v="urn:schemas-microsoft-com:vml" xmlns:w10="urn:schemas-microsoft-com:office:word" xmlns:w="http://schemas.openxmlformats.org/wordprocessingml/2006/main" xmlns:w14="http://schemas.microsoft.com/office/word/2010/wordml" xmlns:w15="http://schemas.microsoft.com/office/word/2012/wordml" xmlns:w16cex="http://schemas.microsoft.com/office/word/2018/wordml/cex" xmlns:w16cid="http://schemas.microsoft.com/office/word/2016/wordml/cid" xmlns:w16="http://schemas.microsoft.com/office/word/2018/wordml" xmlns:w16sdtdh="http://schemas.microsoft.com/office/word/2020/wordml/sdtdatahash" xmlns:w16sdtfl="http://schemas.microsoft.com/office/word/2024/wordml/sdtformatlock" xmlns:w16se="http://schemas.microsoft.com/office/word/2015/wordml/symex" xmlns:w16du="http://schemas.microsoft.com/office/word/2023/wordml/word16du" xmlns:wne="http://schemas.microsoft.com/office/word/2006/wordml" mc:Ignorable="w14 w15 w16se w16cid w16 w16cex w16sdtdh w16sdtfl w16du wp14">
   <w:abstractNum w:abstractNumId="0" w15:restartNumberingAfterBreak="0">
     <w:nsid w:val="05320EB6"/>
     <w:multiLevelType w:val="hybridMultilevel"/>
@@ -4634,7 +2636,7 @@
 </file>
 
 <file path=word/styles.xml><?xml version="1.0" encoding="utf-8"?>
-<w:styles xmlns:mc="http://schemas.openxmlformats.org/markup-compatibility/2006" xmlns:r="http://schemas.openxmlformats.org/officeDocument/2006/relationships" xmlns:w="http://schemas.openxmlformats.org/wordprocessingml/2006/main" xmlns:w14="http://schemas.microsoft.com/office/word/2010/wordml" xmlns:w15="http://schemas.microsoft.com/office/word/2012/wordml" xmlns:w16cex="http://schemas.microsoft.com/office/word/2018/wordml/cex" xmlns:w16cid="http://schemas.microsoft.com/office/word/2016/wordml/cid" xmlns:w16="http://schemas.microsoft.com/office/word/2018/wordml" xmlns:w16du="http://schemas.microsoft.com/office/word/2023/wordml/word16du" xmlns:w16sdtdh="http://schemas.microsoft.com/office/word/2020/wordml/sdtdatahash" xmlns:w16sdtfl="http://schemas.microsoft.com/office/word/2024/wordml/sdtformatlock" xmlns:w16se="http://schemas.microsoft.com/office/word/2015/wordml/symex" mc:Ignorable="w14 w15 w16se w16cid w16 w16cex w16sdtdh w16sdtfl w16du">
+<w:styles xmlns:mc="http://schemas.openxmlformats.org/markup-compatibility/2006" xmlns:r="http://schemas.openxmlformats.org/officeDocument/2006/relationships" xmlns:w="http://schemas.openxmlformats.org/wordprocessingml/2006/main" xmlns:w14="http://schemas.microsoft.com/office/word/2010/wordml" xmlns:w15="http://schemas.microsoft.com/office/word/2012/wordml" xmlns:w16cex="http://schemas.microsoft.com/office/word/2018/wordml/cex" xmlns:w16cid="http://schemas.microsoft.com/office/word/2016/wordml/cid" xmlns:w16="http://schemas.microsoft.com/office/word/2018/wordml" xmlns:w16sdtdh="http://schemas.microsoft.com/office/word/2020/wordml/sdtdatahash" xmlns:w16sdtfl="http://schemas.microsoft.com/office/word/2024/wordml/sdtformatlock" xmlns:w16se="http://schemas.microsoft.com/office/word/2015/wordml/symex" xmlns:w16du="http://schemas.microsoft.com/office/word/2023/wordml/word16du" mc:Ignorable="w14 w15 w16se w16cid w16 w16cex w16sdtdh w16sdtfl w16du">
   <w:docDefaults>
     <w:rPrDefault>
       <w:rPr>

</xml_diff>